<commit_message>
docs(tesis): notacion del error de la funcion de reaccion fiscal (u_t)
Co-Authored-By: Claude Opus 5.5 <noreply@anthropic.com>
</commit_message>
<xml_diff>
--- a/tesis_oficial_borradores/para_el_grupo/Tesis_borrador.docx
+++ b/tesis_oficial_borradores/para_el_grupo/Tesis_borrador.docx
@@ -955,7 +955,7 @@
         <w:pStyle w:val="BodyText"/>
       </w:pPr>
       <w:r>
-        <w:t xml:space="preserve">pbₜ = α + ρ dₜ₋₁ + γ zₜ + εₜ,</w:t>
+        <w:t xml:space="preserve">pbₜ = α + ρ dₜ₋₁ + γ zₜ + uₜ,</w:t>
       </w:r>
     </w:p>
     <w:p>
@@ -963,7 +963,7 @@
         <w:pStyle w:val="BodyText"/>
       </w:pPr>
       <w:r>
-        <w:t xml:space="preserve">con zₜ un conjunto de determinantes cíclicos. Si ρ &gt; 0, εₜ está acotado como proporción del PIB y el valor presente del PIB es finito, la política fiscal satisface la restricción presupuestaria intertemporal y la condición de transversalidad. La demostración formal figuraba en un apéndice no publicado de Bohn (1998) y se presenta en Bohn (2005), donde se la presenta como un resultado de trabajos previos del autor, entre ellos Bohn (1998). La idea de la prueba es que una respuesta positiva reduce el crecimiento de la deuda respecto de un esquema Ponzi en un factor (1-ρ) por período, por lo que el valor presente de la deuda tiende a cero (Bohn, 2005).</w:t>
+        <w:t xml:space="preserve">con zₜ un conjunto de determinantes cíclicos. Si ρ &gt; 0, uₜ está acotado como proporción del PIB y el valor presente del PIB es finito, la política fiscal satisface la restricción presupuestaria intertemporal y la condición de transversalidad. La demostración formal figuraba en un apéndice no publicado de Bohn (1998) y se presenta en Bohn (2005), donde se la presenta como un resultado de trabajos previos del autor, entre ellos Bohn (1998). La idea de la prueba es que una respuesta positiva reduce el crecimiento de la deuda respecto de un esquema Ponzi en un factor (1-ρ) por período, por lo que el valor presente de la deuda tiende a cero (Bohn, 2005).</w:t>
       </w:r>
     </w:p>
     <w:p>
@@ -1005,7 +1005,7 @@
         <w:pStyle w:val="BodyText"/>
       </w:pPr>
       <w:r>
-        <w:t xml:space="preserve">dₜ - dₜ₋₁ = ((r-g)/(1+g) - ρ) dₜ₋₁ - α - γ zₜ - εₜ .</w:t>
+        <w:t xml:space="preserve">dₜ - dₜ₋₁ = ((r-g)/(1+g) - ρ) dₜ₋₁ - α - γ zₜ - uₜ .</w:t>
       </w:r>
     </w:p>
     <w:p>

</xml_diff>

<commit_message>
docs(tesis): capitulo de Datos actualizado con series de fuentes primarias
Co-Authored-By: Claude Opus 5.5 <noreply@anthropic.com>
</commit_message>
<xml_diff>
--- a/tesis_oficial_borradores/para_el_grupo/Tesis_borrador.docx
+++ b/tesis_oficial_borradores/para_el_grupo/Tesis_borrador.docx
@@ -2754,7 +2754,7 @@
         <w:t xml:space="preserve"> </w:t>
       </w:r>
       <w:r>
-        <w:t xml:space="preserve">El orden del VAR se elige con el criterio de información de Akaike (AIC), sujeto a que el modelo sea estable, es decir, a que todas las raíces de su polinomio característico queden fuera del círculo unitario. La estabilidad no es un requisito accesorio: es la condición para que el VAR tenga una representación de medias móviles, en la que se apoyan las respuestas al impulso y la simulación de largo plazo (Lütkepohl, 2005, cap. 2 y 4). Si el orden que elige el AIC produce un modelo inestable, se toma el mayor orden estable inferior. Con la deuda consolidada neta, el AIC elige cuatro rezagos, un año completo de datos trimestrales, pero ese modelo tiene una raíz de módulo 1,02, por lo que se usan tres rezagos (raíz máxima de 0,96). Con la deuda bruta, los cuatro rezagos del AIC ya son estables. La autocorrelación residual se informa como diagnóstico.</w:t>
+        <w:t xml:space="preserve">El orden del VAR se elige con el criterio de información de Akaike (AIC), sujeto a que el modelo sea estable, es decir, a que todas las raíces de su polinomio característico queden fuera del círculo unitario. La estabilidad no es un requisito accesorio: es la condición para que el VAR tenga una representación de medias móviles, en la que se apoyan las respuestas al impulso y la simulación de largo plazo (Lütkepohl, 2005, cap. 2 y 4). Si el orden que elige el AIC produce un modelo inestable, se toma el mayor orden estable inferior. Con la deuda consolidada neta, el AIC elige cinco rezagos, pero los modelos de cuatro y cinco rezagos son inestables (raíz máxima de 1,02), por lo que se usan tres (raíz máxima de 0,96). Con la deuda bruta, el mayor orden estable es cuatro (raíz máxima de 0,99). La prueba de Portmanteau detecta autocorrelación residual leve en todos los órdenes (p entre 0,02 y 0,04 en los modelos estables), que se informa como limitación.</w:t>
       </w:r>
     </w:p>
     <w:p>
@@ -3242,7 +3242,7 @@
         <w:pStyle w:val="FirstParagraph"/>
       </w:pPr>
       <w:r>
-        <w:t xml:space="preserve">Este capítulo documenta cada serie del modelo: qué mide, de dónde sale, qué transformaciones se le aplicaron y por qué. La muestra es trimestral, 1996T1-2025T4 (120 observaciones). Todas las cifras que aparecen aquí se recalcularon desde los archivos del repositorio citados en cada sección. Cuando una serie tiene una limitación, se declara junto con la dirección probable de su sesgo.</w:t>
+        <w:t xml:space="preserve">Este capítulo documenta cada serie del modelo: qué mide, de dónde sale, qué transformaciones se le aplicaron y por qué. La muestra es trimestral, 1996T1-2025T4 (120 observaciones). La muestra efectiva de estimación es 1996T4-2025T4 (117 observaciones), porque el crecimiento pierde la primera observación y los dos rezagos de la tasa de la Fed consumen las siguientes. Todas las cifras que aparecen aquí se recalcularon desde los archivos del repositorio citados en cada sección. Cuando una serie tiene una limitación, se declara junto con la dirección probable de su sesgo.</w:t>
       </w:r>
     </w:p>
     <w:bookmarkStart w:id="55" w:name="resumen-de-las-series"/>
@@ -3368,7 +3368,7 @@
                 <w:rFonts w:ascii="Calibri" w:hAnsi="Calibri"/>
                 <w:sz w:val="20"/>
               </w:rPr>
-              <w:t xml:space="preserve">Deuda consolidada neta (% PIB)</w:t>
+              <w:t xml:space="preserve">Deuda consolidada neta, tenencia del BCRA a valor nominal, variante piso (% PIB)</w:t>
             </w:r>
           </w:p>
         </w:tc>
@@ -3399,7 +3399,36 @@
                 <w:rFonts w:ascii="Calibri" w:hAnsi="Calibri"/>
                 <w:sz w:val="20"/>
               </w:rPr>
-              <w:t xml:space="preserve">datos/procesados/deuda_consolidada_neta_1996_2025.csv</w:t>
+              <w:t xml:space="preserve">datos/procesados/deuda_consolidada_neta_nominal_1996_2025.csv</w:t>
+            </w:r>
+            <w:r>
+              <w:rPr>
+                <w:rFonts w:ascii="Calibri" w:hAnsi="Calibri"/>
+                <w:sz w:val="20"/>
+              </w:rPr>
+              <w:t xml:space="preserve"> </w:t>
+            </w:r>
+            <w:r>
+              <w:rPr>
+                <w:rFonts w:ascii="Calibri" w:hAnsi="Calibri"/>
+                <w:sz w:val="20"/>
+              </w:rPr>
+              <w:t xml:space="preserve">(</w:t>
+            </w:r>
+            <w:r>
+              <w:rPr>
+                <w:rStyle w:val="VerbatimChar"/>
+                <w:rFonts w:ascii="Calibri" w:hAnsi="Calibri"/>
+                <w:sz w:val="20"/>
+              </w:rPr>
+              <w:t xml:space="preserve">deuda_consolidada_neta_nominal_piso_pib</w:t>
+            </w:r>
+            <w:r>
+              <w:rPr>
+                <w:rFonts w:ascii="Calibri" w:hAnsi="Calibri"/>
+                <w:sz w:val="20"/>
+              </w:rPr>
+              <w:t xml:space="preserve">)</w:t>
             </w:r>
           </w:p>
         </w:tc>
@@ -3429,7 +3458,7 @@
                 <w:rFonts w:ascii="Calibri" w:hAnsi="Calibri"/>
                 <w:sz w:val="20"/>
               </w:rPr>
-              <w:t xml:space="preserve">1996T1-2025T4, sin FGS</w:t>
+              <w:t xml:space="preserve">1996T1-2025T4, sin FGS; nominal en 80 de 120 trimestres (ver 5.3.4)</w:t>
             </w:r>
           </w:p>
         </w:tc>
@@ -3446,22 +3475,22 @@
                 <w:rFonts w:ascii="Calibri" w:hAnsi="Calibri"/>
                 <w:sz w:val="20"/>
               </w:rPr>
-              <w:t xml:space="preserve">Deuda federal bruta (% PIB)</w:t>
-            </w:r>
-          </w:p>
-        </w:tc>
-        <w:tc>
-          <w:tcPr/>
-          <w:p>
-            <w:pPr>
-              <w:pStyle w:val="Compact"/>
-            </w:pPr>
-            <w:r>
-              <w:rPr>
-                <w:rFonts w:ascii="Calibri" w:hAnsi="Calibri"/>
-                <w:sz w:val="20"/>
-              </w:rPr>
-              <w:t xml:space="preserve">Componente y serie de robustez</w:t>
+              <w:t xml:space="preserve">Deuda neta a valor de libros y deuda federal bruta (% PIB)</w:t>
+            </w:r>
+          </w:p>
+        </w:tc>
+        <w:tc>
+          <w:tcPr/>
+          <w:p>
+            <w:pPr>
+              <w:pStyle w:val="Compact"/>
+            </w:pPr>
+            <w:r>
+              <w:rPr>
+                <w:rFonts w:ascii="Calibri" w:hAnsi="Calibri"/>
+                <w:sz w:val="20"/>
+              </w:rPr>
+              <w:t xml:space="preserve">Series de robustez y componente</w:t>
             </w:r>
           </w:p>
         </w:tc>
@@ -3477,29 +3506,29 @@
                 <w:rFonts w:ascii="Calibri" w:hAnsi="Calibri"/>
                 <w:sz w:val="20"/>
               </w:rPr>
+              <w:t xml:space="preserve">datos/procesados/deuda_consolidada_neta_1996_2025.csv</w:t>
+            </w:r>
+            <w:r>
+              <w:rPr>
+                <w:rFonts w:ascii="Calibri" w:hAnsi="Calibri"/>
+                <w:sz w:val="20"/>
+              </w:rPr>
+              <w:t xml:space="preserve">,</w:t>
+            </w:r>
+            <w:r>
+              <w:rPr>
+                <w:rFonts w:ascii="Calibri" w:hAnsi="Calibri"/>
+                <w:sz w:val="20"/>
+              </w:rPr>
+              <w:t xml:space="preserve"> </w:t>
+            </w:r>
+            <w:r>
+              <w:rPr>
+                <w:rStyle w:val="VerbatimChar"/>
+                <w:rFonts w:ascii="Calibri" w:hAnsi="Calibri"/>
+                <w:sz w:val="20"/>
+              </w:rPr>
               <w:t xml:space="preserve">datos/procesados/deuda_consolidada_1996_2025.csv</w:t>
-            </w:r>
-            <w:r>
-              <w:rPr>
-                <w:rFonts w:ascii="Calibri" w:hAnsi="Calibri"/>
-                <w:sz w:val="20"/>
-              </w:rPr>
-              <w:t xml:space="preserve">,</w:t>
-            </w:r>
-            <w:r>
-              <w:rPr>
-                <w:rFonts w:ascii="Calibri" w:hAnsi="Calibri"/>
-                <w:sz w:val="20"/>
-              </w:rPr>
-              <w:t xml:space="preserve"> </w:t>
-            </w:r>
-            <w:r>
-              <w:rPr>
-                <w:rStyle w:val="VerbatimChar"/>
-                <w:rFonts w:ascii="Calibri" w:hAnsi="Calibri"/>
-                <w:sz w:val="20"/>
-              </w:rPr>
-              <w:t xml:space="preserve">..._neta_...csv</w:t>
             </w:r>
           </w:p>
         </w:tc>
@@ -3780,7 +3809,7 @@
                 <w:rFonts w:ascii="Calibri" w:hAnsi="Calibri"/>
                 <w:sz w:val="20"/>
               </w:rPr>
-              <w:t xml:space="preserve">Resultado primario (% PIB)</w:t>
+              <w:t xml:space="preserve">Resultado primario (% PIB, flujo trimestral anualizado)</w:t>
             </w:r>
           </w:p>
         </w:tc>
@@ -3811,37 +3840,66 @@
                 <w:rFonts w:ascii="Calibri" w:hAnsi="Calibri"/>
                 <w:sz w:val="20"/>
               </w:rPr>
-              <w:t xml:space="preserve">datos/dataset_consolidado_1996_2025.csv</w:t>
-            </w:r>
-          </w:p>
-        </w:tc>
-        <w:tc>
-          <w:tcPr/>
-          <w:p>
-            <w:pPr>
-              <w:pStyle w:val="Compact"/>
-            </w:pPr>
-            <w:r>
-              <w:rPr>
-                <w:rFonts w:ascii="Calibri" w:hAnsi="Calibri"/>
-                <w:sz w:val="20"/>
-              </w:rPr>
-              <w:t xml:space="preserve">MECON</w:t>
-            </w:r>
-          </w:p>
-        </w:tc>
-        <w:tc>
-          <w:tcPr/>
-          <w:p>
-            <w:pPr>
-              <w:pStyle w:val="Compact"/>
-            </w:pPr>
-            <w:r>
-              <w:rPr>
-                <w:rFonts w:ascii="Calibri" w:hAnsi="Calibri"/>
-                <w:sz w:val="20"/>
-              </w:rPr>
-              <w:t xml:space="preserve">1996-2003 empalmado; 2004-2025 ver 5.7</w:t>
+              <w:t xml:space="preserve">datos/procesados/resultado_primario_1996_2025.csv</w:t>
+            </w:r>
+            <w:r>
+              <w:rPr>
+                <w:rFonts w:ascii="Calibri" w:hAnsi="Calibri"/>
+                <w:sz w:val="20"/>
+              </w:rPr>
+              <w:t xml:space="preserve"> </w:t>
+            </w:r>
+            <w:r>
+              <w:rPr>
+                <w:rFonts w:ascii="Calibri" w:hAnsi="Calibri"/>
+                <w:sz w:val="20"/>
+              </w:rPr>
+              <w:t xml:space="preserve">(</w:t>
+            </w:r>
+            <w:r>
+              <w:rPr>
+                <w:rStyle w:val="VerbatimChar"/>
+                <w:rFonts w:ascii="Calibri" w:hAnsi="Calibri"/>
+                <w:sz w:val="20"/>
+              </w:rPr>
+              <w:t xml:space="preserve">pb_pib_trim</w:t>
+            </w:r>
+            <w:r>
+              <w:rPr>
+                <w:rFonts w:ascii="Calibri" w:hAnsi="Calibri"/>
+                <w:sz w:val="20"/>
+              </w:rPr>
+              <w:t xml:space="preserve">)</w:t>
+            </w:r>
+          </w:p>
+        </w:tc>
+        <w:tc>
+          <w:tcPr/>
+          <w:p>
+            <w:pPr>
+              <w:pStyle w:val="Compact"/>
+            </w:pPr>
+            <w:r>
+              <w:rPr>
+                <w:rFonts w:ascii="Calibri" w:hAnsi="Calibri"/>
+                <w:sz w:val="20"/>
+              </w:rPr>
+              <w:t xml:space="preserve">MECON, Secretaría de Hacienda, esquema Ahorro-Inversión-Financiamiento (datos.gob.ar, dataset 379)</w:t>
+            </w:r>
+          </w:p>
+        </w:tc>
+        <w:tc>
+          <w:tcPr/>
+          <w:p>
+            <w:pPr>
+              <w:pStyle w:val="Compact"/>
+            </w:pPr>
+            <w:r>
+              <w:rPr>
+                <w:rFonts w:ascii="Calibri" w:hAnsi="Calibri"/>
+                <w:sz w:val="20"/>
+              </w:rPr>
+              <w:t xml:space="preserve">1996T1-2025T4, mensual, sin desagregación</w:t>
             </w:r>
           </w:p>
         </w:tc>
@@ -3889,6 +3947,35 @@
                 <w:rFonts w:ascii="Calibri" w:hAnsi="Calibri"/>
                 <w:sz w:val="20"/>
               </w:rPr>
+              <w:t xml:space="preserve">datos/procesados/pib_real_empalme_indec_1996_2003.csv</w:t>
+            </w:r>
+            <w:r>
+              <w:rPr>
+                <w:rFonts w:ascii="Calibri" w:hAnsi="Calibri"/>
+                <w:sz w:val="20"/>
+              </w:rPr>
+              <w:t xml:space="preserve"> </w:t>
+            </w:r>
+            <w:r>
+              <w:rPr>
+                <w:rFonts w:ascii="Calibri" w:hAnsi="Calibri"/>
+                <w:sz w:val="20"/>
+              </w:rPr>
+              <w:t xml:space="preserve">y</w:t>
+            </w:r>
+            <w:r>
+              <w:rPr>
+                <w:rFonts w:ascii="Calibri" w:hAnsi="Calibri"/>
+                <w:sz w:val="20"/>
+              </w:rPr>
+              <w:t xml:space="preserve"> </w:t>
+            </w:r>
+            <w:r>
+              <w:rPr>
+                <w:rStyle w:val="VerbatimChar"/>
+                <w:rFonts w:ascii="Calibri" w:hAnsi="Calibri"/>
+                <w:sz w:val="20"/>
+              </w:rPr>
               <w:t xml:space="preserve">datos/dataset_consolidado_1996_2025.csv</w:t>
             </w:r>
           </w:p>
@@ -3904,22 +3991,22 @@
                 <w:rFonts w:ascii="Calibri" w:hAnsi="Calibri"/>
                 <w:sz w:val="20"/>
               </w:rPr>
-              <w:t xml:space="preserve">INDEC</w:t>
-            </w:r>
-          </w:p>
-        </w:tc>
-        <w:tc>
-          <w:tcPr/>
-          <w:p>
-            <w:pPr>
-              <w:pStyle w:val="Compact"/>
-            </w:pPr>
-            <w:r>
-              <w:rPr>
-                <w:rFonts w:ascii="Calibri" w:hAnsi="Calibri"/>
-                <w:sz w:val="20"/>
-              </w:rPr>
-              <w:t xml:space="preserve">1996-2003 empalmado; 2004-2025 directo</w:t>
+              <w:t xml:space="preserve">INDEC, Oferta y Demanda Globales</w:t>
+            </w:r>
+          </w:p>
+        </w:tc>
+        <w:tc>
+          <w:tcPr/>
+          <w:p>
+            <w:pPr>
+              <w:pStyle w:val="Compact"/>
+            </w:pPr>
+            <w:r>
+              <w:rPr>
+                <w:rFonts w:ascii="Calibri" w:hAnsi="Calibri"/>
+                <w:sz w:val="20"/>
+              </w:rPr>
+              <w:t xml:space="preserve">1996-2003 base 1993 empalmada a base 2004; 2004-2025 directo</w:t>
             </w:r>
           </w:p>
         </w:tc>
@@ -4364,7 +4451,19 @@
         <w:pStyle w:val="BodyText"/>
       </w:pPr>
       <w:r>
-        <w:t xml:space="preserve">Un cambio metodológico respecto de versiones anteriores: la deuda ya no sale de un diccionario escrito a mano. Se calcula como cociente entre stocks en pesos tomados de los informes de deuda del MECON y el PIB nominal. Esa construcción es trazable a archivos y reproducible con los scripts del repositorio.</w:t>
+        <w:t xml:space="preserve">Un cambio metodológico respecto de versiones anteriores: ninguna serie fiscal ni de deuda sale ya de un diccionario escrito a mano. La deuda es el cociente entre stocks en pesos tomados de los informes del MECON y el PIB nominal. El resultado primario se lee de las planillas mensuales de Hacienda y el PIB real de 1996-2003 se empalma con las series publicadas por INDEC. Todas las construcciones son trazables a archivos y reproducibles con los scripts de</w:t>
+      </w:r>
+      <w:r>
+        <w:t xml:space="preserve"> </w:t>
+      </w:r>
+      <w:r>
+        <w:rPr>
+          <w:rStyle w:val="VerbatimChar"/>
+        </w:rPr>
+        <w:t xml:space="preserve">codigo/ingesta_datos/</w:t>
+      </w:r>
+      <w:r>
+        <w:t xml:space="preserve">.</w:t>
       </w:r>
     </w:p>
     <w:bookmarkEnd w:id="55"/>
@@ -4897,13 +4996,83 @@
       </w:r>
     </w:p>
     <w:bookmarkEnd w:id="59"/>
-    <w:bookmarkStart w:id="60" w:name="X622ddecccf45ef7e7c8a11981f2dd5e43b630d9"/>
+    <w:bookmarkStart w:id="60" w:name="X806e085bc5f2b5a11b5366608dccbae17ae6ac4"/>
     <w:p>
       <w:pPr>
         <w:pStyle w:val="Heading3"/>
       </w:pPr>
       <w:r>
-        <w:t xml:space="preserve">5.3.4 Deuda del Tesoro en poder del BCRA (T_BCRA)</w:t>
+        <w:t xml:space="preserve">5.3.4 Deuda del Tesoro en poder del BCRA (T_BCRA): valor contable y valor nominal</w:t>
+      </w:r>
+    </w:p>
+    <w:p>
+      <w:pPr>
+        <w:pStyle w:val="FirstParagraph"/>
+      </w:pPr>
+      <w:r>
+        <w:rPr>
+          <w:b/>
+          <w:bCs/>
+        </w:rPr>
+        <w:t xml:space="preserve">Valor contable.</w:t>
+      </w:r>
+      <w:r>
+        <w:t xml:space="preserve"> </w:t>
+      </w:r>
+      <w:r>
+        <w:t xml:space="preserve">Fuente: BCRA,</w:t>
+      </w:r>
+      <w:r>
+        <w:t xml:space="preserve"> </w:t>
+      </w:r>
+      <w:r>
+        <w:rPr>
+          <w:i/>
+          <w:iCs/>
+        </w:rPr>
+        <w:t xml:space="preserve">Balance del Banco Central</w:t>
+      </w:r>
+      <w:r>
+        <w:t xml:space="preserve"> </w:t>
+      </w:r>
+      <w:r>
+        <w:t xml:space="preserve">histórico (</w:t>
+      </w:r>
+      <w:r>
+        <w:rPr>
+          <w:rStyle w:val="VerbatimChar"/>
+        </w:rPr>
+        <w:t xml:space="preserve">https://www.bcra.gob.ar/Pdfs/PublicacionesEstadisticas/balbcrhis.xls</w:t>
+      </w:r>
+      <w:r>
+        <w:t xml:space="preserve">), hoja B.C.R.A., columna</w:t>
+      </w:r>
+      <w:r>
+        <w:t xml:space="preserve"> </w:t>
+      </w:r>
+      <w:r>
+        <w:t xml:space="preserve">“Sector oficial, Total”</w:t>
+      </w:r>
+      <w:r>
+        <w:t xml:space="preserve">. Incluye adelantos transitorios y títulos públicos en pesos, y Letras Intransferibles y títulos en moneda extranjera. Se toma el cierre de trimestre del dato mensual y se verifica que el total sea igual a la suma de sus dos partes. Es la valuación contable del BCRA, que se aparta del nominal desde diciembre de 2019 (ajuste de las Letras Intransferibles) y desde mayo de 2024 (costo amortizado).</w:t>
+      </w:r>
+    </w:p>
+    <w:p>
+      <w:pPr>
+        <w:pStyle w:val="BodyText"/>
+      </w:pPr>
+      <w:r>
+        <w:rPr>
+          <w:b/>
+          <w:bCs/>
+        </w:rPr>
+        <w:t xml:space="preserve">Por qué el nominal.</w:t>
+      </w:r>
+      <w:r>
+        <w:t xml:space="preserve"> </w:t>
+      </w:r>
+      <w:r>
+        <w:t xml:space="preserve">La deuda bruta del MECON está a valor nominal. Si de ella se restan tenencias valuadas de otro modo, el neteo mezcla criterios y el resultado no mide ninguna deuda definida. Por eso la serie principal sustituye, en la tenencia del BCRA, el componente en moneda extranjera del balance por el stock nominal de las Letras Intransferibles que publica el MECON.</w:t>
       </w:r>
     </w:p>
     <w:p>
@@ -4925,7 +5094,7 @@
         <w:t xml:space="preserve"> </w:t>
       </w:r>
       <w:r>
-        <w:t xml:space="preserve">BCRA,</w:t>
+        <w:t xml:space="preserve">MECON, Secretaría de Finanzas,</w:t>
       </w:r>
       <w:r>
         <w:t xml:space="preserve"> </w:t>
@@ -4935,31 +5104,34 @@
           <w:i/>
           <w:iCs/>
         </w:rPr>
-        <w:t xml:space="preserve">Balance del Banco Central</w:t>
-      </w:r>
-      <w:r>
-        <w:t xml:space="preserve"> </w:t>
-      </w:r>
-      <w:r>
-        <w:t xml:space="preserve">histórico (</w:t>
+        <w:t xml:space="preserve">Estado de la Deuda Pública</w:t>
+      </w:r>
+      <w:r>
+        <w:t xml:space="preserve">: hojas A.1.9, A.1.10 o A.1.11 según el año, bloque</w:t>
+      </w:r>
+      <w:r>
+        <w:t xml:space="preserve"> </w:t>
+      </w:r>
+      <w:r>
+        <w:t xml:space="preserve">“Letras adquiridas por el BCRA”</w:t>
+      </w:r>
+      <w:r>
+        <w:t xml:space="preserve"> </w:t>
+      </w:r>
+      <w:r>
+        <w:t xml:space="preserve">(miles de dólares), y hoja A.12.3 para 2007-2010. Se suma instrumento por instrumento y el script reproduce los totales del bloque (69.286 millones de dólares en 2024). Se convierte con el tipo de cambio de la serie de deuda. Resumen por ancla en</w:t>
+      </w:r>
+      <w:r>
+        <w:t xml:space="preserve"> </w:t>
       </w:r>
       <w:r>
         <w:rPr>
           <w:rStyle w:val="VerbatimChar"/>
         </w:rPr>
-        <w:t xml:space="preserve">https://www.bcra.gob.ar/Pdfs/PublicacionesEstadisticas/balbcrhis.xls</w:t>
-      </w:r>
-      <w:r>
-        <w:t xml:space="preserve">), hoja B.C.R.A., columna</w:t>
-      </w:r>
-      <w:r>
-        <w:t xml:space="preserve"> </w:t>
-      </w:r>
-      <w:r>
-        <w:t xml:space="preserve">“Sector oficial, Total”</w:t>
-      </w:r>
-      <w:r>
-        <w:t xml:space="preserve">. Incluye adelantos transitorios y títulos públicos en pesos, y Letras Intransferibles y títulos en moneda extranjera. Se toma el cierre de trimestre del dato mensual. Se verifica que el total sea igual a la suma de sus dos partes en todos los trimestres.</w:t>
+        <w:t xml:space="preserve">datos/procesados/letras_intransferibles_bcra_nominal_anclas.csv</w:t>
+      </w:r>
+      <w:r>
+        <w:t xml:space="preserve">.</w:t>
       </w:r>
     </w:p>
     <w:p>
@@ -4975,13 +5147,83 @@
           <w:b/>
           <w:bCs/>
         </w:rPr>
-        <w:t xml:space="preserve">Valuación.</w:t>
-      </w:r>
-      <w:r>
-        <w:t xml:space="preserve"> </w:t>
-      </w:r>
-      <w:r>
-        <w:t xml:space="preserve">Es valor contable del BCRA. Esto es relevante desde diciembre de 2019 (ajuste de las Letras Intransferibles) y desde mayo de 2024 (costo amortizado), según documenta el script de construcción. El FMI usa el stock de deuda del Tesoro. La sección 5.9 cuantifica el efecto en 2024.</w:t>
+        <w:t xml:space="preserve">Cobertura.</w:t>
+      </w:r>
+      <w:r>
+        <w:t xml:space="preserve"> </w:t>
+      </w:r>
+      <w:r>
+        <w:t xml:space="preserve">Hay planillas de cierre de año para 2007-2009 y 2013-2025, y de marzo de 2010. No hay planillas de 2010-12, 2011-12 ni 2012-12. Las Letras empiezan el 3 de enero de 2006, de modo que hasta 2005T4 no hay dato nominal (40 trimestres) y se conserva el valor contable. Hay dato nominal en 80 de 120 trimestres: 17 con ancla oficial, 32 reconstruidos con las fechas de emisión (las letras son de pago único, por lo que si ningún instrumento cambia entre dos anclas el stock se arma con la fecha de emisión), 7 reconstruidos hacia atrás (2006T1-2007T3) y 24 interpolados linealmente entre anclas con canjes o cambios de monto. Las columnas</w:t>
+      </w:r>
+      <w:r>
+        <w:t xml:space="preserve"> </w:t>
+      </w:r>
+      <w:r>
+        <w:rPr>
+          <w:rStyle w:val="VerbatimChar"/>
+        </w:rPr>
+        <w:t xml:space="preserve">nominal_metodo</w:t>
+      </w:r>
+      <w:r>
+        <w:t xml:space="preserve"> </w:t>
+      </w:r>
+      <w:r>
+        <w:t xml:space="preserve">y</w:t>
+      </w:r>
+      <w:r>
+        <w:t xml:space="preserve"> </w:t>
+      </w:r>
+      <w:r>
+        <w:rPr>
+          <w:rStyle w:val="VerbatimChar"/>
+        </w:rPr>
+        <w:t xml:space="preserve">flag_nominal_interpolado</w:t>
+      </w:r>
+      <w:r>
+        <w:t xml:space="preserve"> </w:t>
+      </w:r>
+      <w:r>
+        <w:t xml:space="preserve">lo registran. La interpolación es una aproximación declarada, no un dato.</w:t>
+      </w:r>
+    </w:p>
+    <w:p>
+      <w:pPr>
+        <w:pStyle w:val="Compact"/>
+        <w:numPr>
+          <w:ilvl w:val="0"/>
+          <w:numId w:val="1008"/>
+        </w:numPr>
+      </w:pPr>
+      <w:r>
+        <w:rPr>
+          <w:b/>
+          <w:bCs/>
+        </w:rPr>
+        <w:t xml:space="preserve">Variante piso.</w:t>
+      </w:r>
+      <w:r>
+        <w:t xml:space="preserve"> </w:t>
+      </w:r>
+      <w:r>
+        <w:t xml:space="preserve">El componente en moneda extranjera del balance no es igual a las Letras: contiene otros créditos en dólares (hasta 2017 y en 2019-2023 el valor de libros supera al nominal). La sustitución estricta empeoraría 2023 (128,2 contra 119,0). Por eso la serie principal es la variante piso: la tenencia nunca baja del valor de libros, y solo se suma el faltante donde el nominal en pesos supera al componente en moneda extranjera del balance. La variante estricta (</w:t>
+      </w:r>
+      <w:r>
+        <w:rPr>
+          <w:rStyle w:val="VerbatimChar"/>
+        </w:rPr>
+        <w:t xml:space="preserve">deuda_consolidada_neta_nominal_pib</w:t>
+      </w:r>
+      <w:r>
+        <w:t xml:space="preserve">) y la de libros (</w:t>
+      </w:r>
+      <w:r>
+        <w:rPr>
+          <w:rStyle w:val="VerbatimChar"/>
+        </w:rPr>
+        <w:t xml:space="preserve">deuda_consolidada_neta_pib</w:t>
+      </w:r>
+      <w:r>
+        <w:t xml:space="preserve">) quedan como series de robustez, junto con la deuda bruta.</w:t>
       </w:r>
     </w:p>
     <w:bookmarkEnd w:id="60"/>
@@ -5053,7 +5295,7 @@
         <w:t xml:space="preserve"> </w:t>
       </w:r>
       <w:r>
-        <w:t xml:space="preserve">se cumple al cuarto decimal en 2023 (119,03) y en 2024 (68,31). La identidad que el FMI usa en el Cuadro 2 (línea 6 = 2 + 4 − 5) también se cumple con sus cifras: 92,9 + 18,4 − 0,5 = 110,8 y 51,4 + 2,2 − 2,1 = 51,5.</w:t>
+        <w:t xml:space="preserve">se cumple al cuarto decimal en 2023 (119,03) y en 2024 (61,11 con la tenencia nominal piso; 68,31 con valor de libros). La identidad que el FMI usa en el Cuadro 2 (línea 6 = 2 + 4 − 5) también se cumple con sus cifras: 92,9 + 18,4 − 0,5 = 110,8 y 51,4 + 2,2 − 2,1 = 51,5.</w:t>
       </w:r>
     </w:p>
     <w:bookmarkEnd w:id="62"/>
@@ -5080,13 +5322,65 @@
           <w:b/>
           <w:bCs/>
         </w:rPr>
-        <w:t xml:space="preserve">Definición.</w:t>
-      </w:r>
-      <w:r>
-        <w:t xml:space="preserve"> </w:t>
-      </w:r>
-      <w:r>
-        <w:t xml:space="preserve">Resultado primario del sector público nacional como porcentaje del PIB; positivo es superávit. Cada trimestre repite el nivel anual del ratio (la suma de los cuatro trimestres de un año es cuatro veces el ratio), de modo que el promedio anual de la serie es el ratio anual.</w:t>
+        <w:t xml:space="preserve">Fuente.</w:t>
+      </w:r>
+      <w:r>
+        <w:t xml:space="preserve"> </w:t>
+      </w:r>
+      <w:r>
+        <w:t xml:space="preserve">MECON, Secretaría de Hacienda, Subsecretaría de Programación Macroeconómica,</w:t>
+      </w:r>
+      <w:r>
+        <w:t xml:space="preserve"> </w:t>
+      </w:r>
+      <w:r>
+        <w:t xml:space="preserve">“Esquema Ahorro-Inversión-Financiamiento. Sector Público Nacional. Base Caja”</w:t>
+      </w:r>
+      <w:r>
+        <w:t xml:space="preserve"> </w:t>
+      </w:r>
+      <w:r>
+        <w:t xml:space="preserve">(datos.gob.ar, dataset 379). Es una serie mensual desde 1993, en pesos corrientes, publicada en tres tramos metodológicos (1993-2006, 2007-2014 y desde 2015). Los archivos crudos están en</w:t>
+      </w:r>
+      <w:r>
+        <w:t xml:space="preserve"> </w:t>
+      </w:r>
+      <w:r>
+        <w:rPr>
+          <w:rStyle w:val="VerbatimChar"/>
+        </w:rPr>
+        <w:t xml:space="preserve">datos/crudos/resultado_primario/</w:t>
+      </w:r>
+      <w:r>
+        <w:t xml:space="preserve"> </w:t>
+      </w:r>
+      <w:r>
+        <w:t xml:space="preserve">y el script es</w:t>
+      </w:r>
+      <w:r>
+        <w:t xml:space="preserve"> </w:t>
+      </w:r>
+      <w:r>
+        <w:rPr>
+          <w:rStyle w:val="VerbatimChar"/>
+        </w:rPr>
+        <w:t xml:space="preserve">construir_resultado_primario_1996_2025.py</w:t>
+      </w:r>
+      <w:r>
+        <w:t xml:space="preserve">. Como hay dato mensual para todo el período,</w:t>
+      </w:r>
+      <w:r>
+        <w:t xml:space="preserve"> </w:t>
+      </w:r>
+      <w:r>
+        <w:rPr>
+          <w:b/>
+          <w:bCs/>
+        </w:rPr>
+        <w:t xml:space="preserve">no se desagrega con Denton ni se aplica coeficiente de enlace</w:t>
+      </w:r>
+      <w:r>
+        <w:t xml:space="preserve">: cada trimestre es la suma de sus tres meses, y se exige que estén los tres (no hay trimestres faltantes).</w:t>
       </w:r>
     </w:p>
     <w:p>
@@ -5102,35 +5396,22 @@
           <w:b/>
           <w:bCs/>
         </w:rPr>
-        <w:t xml:space="preserve">1996-2003.</w:t>
-      </w:r>
-      <w:r>
-        <w:t xml:space="preserve"> </w:t>
-      </w:r>
-      <w:r>
-        <w:rPr>
-          <w:i/>
-          <w:iCs/>
-        </w:rPr>
-        <w:t xml:space="preserve">Compendio Fiscal 1993-2006</w:t>
-      </w:r>
-      <w:r>
-        <w:t xml:space="preserve"> </w:t>
-      </w:r>
-      <w:r>
-        <w:t xml:space="preserve">(MECON, Secretaría de Hacienda, Oficina Nacional de Presupuesto), capítulo I.1.3, fila</w:t>
-      </w:r>
-      <w:r>
-        <w:t xml:space="preserve"> </w:t>
-      </w:r>
-      <w:r>
-        <w:t xml:space="preserve">“Resultado primario”</w:t>
-      </w:r>
-      <w:r>
-        <w:t xml:space="preserve"> </w:t>
-      </w:r>
-      <w:r>
-        <w:t xml:space="preserve">(anual). Se multiplica por un coeficiente de enlace calculado en 2004 y se desagrega a trimestres con el método de Denton sin indicador (Denton, 1971), que minimiza las diferencias cuadráticas entre trimestres con el promedio anual fijo. Se justifica el enlace porque el Compendio y la serie posterior no miden el mismo perímetro, y se prefiere trasladar esa diferencia a un parámetro explícito antes que ignorarla. Se justifica Denton porque no existe un indicador trimestral confiable para todo 1996-2003.</w:t>
+        <w:t xml:space="preserve">Rentas de la propiedad.</w:t>
+      </w:r>
+      <w:r>
+        <w:t xml:space="preserve"> </w:t>
+      </w:r>
+      <w:r>
+        <w:t xml:space="preserve">La serie principal incluye las rentas de la propiedad, que es la definición de titular del MECON. Esas rentas agregan las utilidades del BCRA, las rentas del FGS y los intereses cobrados por organismos públicos, y la API no desglosa la transferencia del BCRA. Se calcula además una variante sin rentas (</w:t>
+      </w:r>
+      <w:r>
+        <w:rPr>
+          <w:rStyle w:val="VerbatimChar"/>
+        </w:rPr>
+        <w:t xml:space="preserve">pb_pib_sin_rentas</w:t>
+      </w:r>
+      <w:r>
+        <w:t xml:space="preserve">), conservadora porque excluye más que el FMI. Las rentas totales fueron de 0,3 a 0,7 puntos del PIB en 1996-2008, de 1,3 a 2,6 en 2009-2014 y de 0,3 a 1,3 en 2015-2025.</w:t>
       </w:r>
     </w:p>
     <w:p>
@@ -5146,13 +5427,7 @@
           <w:b/>
           <w:bCs/>
         </w:rPr>
-        <w:t xml:space="preserve">Limitación declarada.</w:t>
-      </w:r>
-      <w:r>
-        <w:t xml:space="preserve"> </w:t>
-      </w:r>
-      <w:r>
-        <w:t xml:space="preserve">El coeficiente de enlace es inestable (la razón Compendio sobre serie vigente pasa de 1,12 en 2004 a 2,07 en 2006), lo que apunta a una diferencia de perímetro más profunda que la valuación. Es la aproximación menos confiable del empalme. Las 32 observaciones están marcadas con</w:t>
+        <w:t xml:space="preserve">Medida que entra al modelo.</w:t>
       </w:r>
       <w:r>
         <w:t xml:space="preserve"> </w:t>
@@ -5161,10 +5436,61 @@
         <w:rPr>
           <w:rStyle w:val="VerbatimChar"/>
         </w:rPr>
-        <w:t xml:space="preserve">es_interpolado = 1</w:t>
-      </w:r>
-      <w:r>
-        <w:t xml:space="preserve">.</w:t>
+        <w:t xml:space="preserve">pb_pib_trim</w:t>
+      </w:r>
+      <w:r>
+        <w:t xml:space="preserve"> </w:t>
+      </w:r>
+      <w:r>
+        <w:t xml:space="preserve">= 100 × 4 × (resultado primario del trimestre) /</w:t>
+      </w:r>
+      <w:r>
+        <w:t xml:space="preserve"> </w:t>
+      </w:r>
+      <w:r>
+        <w:rPr>
+          <w:rStyle w:val="VerbatimChar"/>
+        </w:rPr>
+        <w:t xml:space="preserve">pib_4t_mm</w:t>
+      </w:r>
+      <w:r>
+        <w:t xml:space="preserve">: el flujo trimestral anualizado sobre el PIB nominal de cuatro trimestres. No se usa la suma móvil de cuatro trimestres (</w:t>
+      </w:r>
+      <w:r>
+        <w:rPr>
+          <w:rStyle w:val="VerbatimChar"/>
+        </w:rPr>
+        <w:t xml:space="preserve">pb_pib</w:t>
+      </w:r>
+      <w:r>
+        <w:t xml:space="preserve">) porque, al superponer ventanas, induce una autocorrelación artificial de tipo MA(3): su autocorrelación de orden 1 es 0,965, contra 0,649 de</w:t>
+      </w:r>
+      <w:r>
+        <w:t xml:space="preserve"> </w:t>
+      </w:r>
+      <w:r>
+        <w:rPr>
+          <w:rStyle w:val="VerbatimChar"/>
+        </w:rPr>
+        <w:t xml:space="preserve">pb_pib_trim</w:t>
+      </w:r>
+      <w:r>
+        <w:t xml:space="preserve">. La contrapartida es que el flujo trimestral conserva estacionalidad (autocorrelación de orden 4 de 0,629), que el sistema absorbe con tres dummies trimestrales (Q1 a Q3). La suma móvil</w:t>
+      </w:r>
+      <w:r>
+        <w:t xml:space="preserve"> </w:t>
+      </w:r>
+      <w:r>
+        <w:rPr>
+          <w:rStyle w:val="VerbatimChar"/>
+        </w:rPr>
+        <w:t xml:space="preserve">pb_pib</w:t>
+      </w:r>
+      <w:r>
+        <w:t xml:space="preserve"> </w:t>
+      </w:r>
+      <w:r>
+        <w:t xml:space="preserve">se mantiene como medida comparable en base anual, y es la que se contrasta con el FMI en 5.8.</w:t>
       </w:r>
     </w:p>
     <w:p>
@@ -5180,62 +5506,72 @@
           <w:b/>
           <w:bCs/>
         </w:rPr>
-        <w:t xml:space="preserve">2004-2025.</w:t>
-      </w:r>
-      <w:r>
-        <w:t xml:space="preserve"> </w:t>
-      </w:r>
-      <w:r>
-        <w:t xml:space="preserve">Los valores provienen de una tabla escrita en el código de ingesta (</w:t>
+        <w:t xml:space="preserve">Quiebres de metodología.</w:t>
+      </w:r>
+      <w:r>
+        <w:t xml:space="preserve"> </w:t>
+      </w:r>
+      <w:r>
+        <w:t xml:space="preserve">Los empalmes de 2006/2007 y 2014/2015 no tienen período de solapamiento en la API. En las filas de empalme no se observa un salto anómalo (2006T4: 3,24 y 2007T1: 3,12; 2014T4: −0,84 y 2015T1: −1,63), pero no hay una prueba formal. El CSV trae la columna</w:t>
+      </w:r>
+      <w:r>
+        <w:t xml:space="preserve"> </w:t>
       </w:r>
       <w:r>
         <w:rPr>
           <w:rStyle w:val="VerbatimChar"/>
         </w:rPr>
-        <w:t xml:space="preserve">PB_PIB_TRIM</w:t>
-      </w:r>
-      <w:r>
-        <w:t xml:space="preserve"> </w:t>
-      </w:r>
-      <w:r>
-        <w:t xml:space="preserve">en</w:t>
-      </w:r>
-      <w:r>
-        <w:t xml:space="preserve"> </w:t>
-      </w:r>
-      <w:r>
-        <w:rPr>
-          <w:rStyle w:val="VerbatimChar"/>
-        </w:rPr>
-        <w:t xml:space="preserve">ingesta_mecon_indec.py</w:t>
-      </w:r>
-      <w:r>
-        <w:t xml:space="preserve">), con un decimal, rotulada como</w:t>
-      </w:r>
-      <w:r>
-        <w:t xml:space="preserve"> </w:t>
-      </w:r>
-      <w:r>
-        <w:t xml:space="preserve">“MECON, Sector Público Consolidado”</w:t>
-      </w:r>
-      <w:r>
-        <w:t xml:space="preserve">. El identificador de datos.gob.ar previsto (11.3_RDP_0_0_32) devuelve error HTTP 400. A diferencia de la deuda,</w:t>
-      </w:r>
-      <w:r>
-        <w:t xml:space="preserve"> </w:t>
-      </w:r>
+        <w:t xml:space="preserve">metodologia</w:t>
+      </w:r>
+      <w:r>
+        <w:t xml:space="preserve"> </w:t>
+      </w:r>
+      <w:r>
+        <w:t xml:space="preserve">(44, 32 y 44 trimestres por tramo). Entre 1993 y 2006 las privatizaciones no figuran en el primario.</w:t>
+      </w:r>
+    </w:p>
+    <w:p>
+      <w:pPr>
+        <w:pStyle w:val="Compact"/>
+        <w:numPr>
+          <w:ilvl w:val="0"/>
+          <w:numId w:val="1009"/>
+        </w:numPr>
+      </w:pPr>
       <w:r>
         <w:rPr>
           <w:b/>
           <w:bCs/>
         </w:rPr>
-        <w:t xml:space="preserve">esta serie no fue reconstruida desde archivos primarios</w:t>
-      </w:r>
-      <w:r>
-        <w:t xml:space="preserve"> </w:t>
-      </w:r>
-      <w:r>
-        <w:t xml:space="preserve">y es la limitación más relevante de trazabilidad que persiste. La sección 5.8 la contrasta con el FMI. Se recomienda sustituirla por las series fiscales trimestrales del MECON antes de la defensa.</w:t>
+        <w:t xml:space="preserve">Perímetro.</w:t>
+      </w:r>
+      <w:r>
+        <w:t xml:space="preserve"> </w:t>
+      </w:r>
+      <w:r>
+        <w:t xml:space="preserve">Es el sector público nacional consolidado (administración nacional, organismos descentralizados, seguridad social, fondos fiduciarios y empresas), más amplio que el gobierno federal del FMI. El control cruzado contra el IMIG (desde 2016) da diferencia nula, pero IMIG y esquema AIF son la misma compilación, de modo que no es un control independiente.</w:t>
+      </w:r>
+    </w:p>
+    <w:p>
+      <w:pPr>
+        <w:pStyle w:val="Compact"/>
+        <w:numPr>
+          <w:ilvl w:val="0"/>
+          <w:numId w:val="1009"/>
+        </w:numPr>
+      </w:pPr>
+      <w:r>
+        <w:rPr>
+          <w:b/>
+          <w:bCs/>
+        </w:rPr>
+        <w:t xml:space="preserve">Comparación con la serie anterior.</w:t>
+      </w:r>
+      <w:r>
+        <w:t xml:space="preserve"> </w:t>
+      </w:r>
+      <w:r>
+        <w:t xml:space="preserve">Contra la tabla escrita a mano (2004-2025) y el Denton del Compendio (1996-2003), la correlación es 0,89 en 2004-2025 y 0,33 en 1996-2003, con errores absolutos medios de 1,29 y 1,16 puntos. La serie anterior de 1996-2003 era una interpolación de datos anuales y no sirve como referencia de nivel.</w:t>
       </w:r>
     </w:p>
     <w:bookmarkEnd w:id="64"/>
@@ -5267,7 +5603,22 @@
         <w:t xml:space="preserve"> </w:t>
       </w:r>
       <w:r>
-        <w:t xml:space="preserve">INDEC, cuentas nacionales, PIB a precios constantes de 2004, serie 143.3_NO_PR_2004_A_21 de datos.gob.ar (índice de volumen). Según la auditoría del script de ingesta, se obtiene en vivo, sin pasar por el diccionario de contingencia.</w:t>
+        <w:t xml:space="preserve">INDEC, PIB a precios constantes de 2004 (serie 4.2_OGP_2004_T_17, Oferta y Demanda Globales, datos.gob.ar), en la misma unidad que</w:t>
+      </w:r>
+      <w:r>
+        <w:t xml:space="preserve"> </w:t>
+      </w:r>
+      <w:r>
+        <w:rPr>
+          <w:rStyle w:val="VerbatimChar"/>
+        </w:rPr>
+        <w:t xml:space="preserve">PIB_real</w:t>
+      </w:r>
+      <w:r>
+        <w:t xml:space="preserve"> </w:t>
+      </w:r>
+      <w:r>
+        <w:t xml:space="preserve">de la base.</w:t>
       </w:r>
     </w:p>
     <w:p>
@@ -5289,7 +5640,7 @@
         <w:t xml:space="preserve"> </w:t>
       </w:r>
       <w:r>
-        <w:t xml:space="preserve">No hay serie trimestral de base compatible. Se parte del nivel anual de 2004 (media del índice trimestral) y se encadena hacia atrás con las tasas anuales de crecimiento 1997-2004 (+8,1 %, +3,8 %, −3,4 %, −0,5 %, −4,5 %, −10,9 %, +8,8 %, +9,0 %), tomadas de INDEC y del Banco Mundial según el script</w:t>
+        <w:t xml:space="preserve">INDEC, base 1993 (serie 2.2_OGP_1993_T_17, millones de pesos de 1993), empalmada a la base 2004 con un coeficiente de enlace k = 1,751, la media de 2004 de la razón entre ambas bases. Script</w:t>
       </w:r>
       <w:r>
         <w:t xml:space="preserve"> </w:t>
@@ -5298,10 +5649,22 @@
         <w:rPr>
           <w:rStyle w:val="VerbatimChar"/>
         </w:rPr>
-        <w:t xml:space="preserve">empalme_pib_real_pre2004.py</w:t>
-      </w:r>
-      <w:r>
-        <w:t xml:space="preserve">. La desagregación trimestral usa el mismo Denton anclado en 2004T1-2006T4 para evitar un salto en la unión. A diferencia del resultado primario, aquí no se usa coeficiente de enlace, porque la tasa de crecimiento real no tiene ambigüedad de perímetro. Las tasas están escritas en el script y no se contrastaron aquí contra la publicación primaria de INDEC.</w:t>
+        <w:t xml:space="preserve">construir_pib_real_empalme_indec_1996_2003.py</w:t>
+      </w:r>
+      <w:r>
+        <w:t xml:space="preserve">; salida</w:t>
+      </w:r>
+      <w:r>
+        <w:t xml:space="preserve"> </w:t>
+      </w:r>
+      <w:r>
+        <w:rPr>
+          <w:rStyle w:val="VerbatimChar"/>
+        </w:rPr>
+        <w:t xml:space="preserve">datos/procesados/pib_real_empalme_indec_1996_2003.csv</w:t>
+      </w:r>
+      <w:r>
+        <w:t xml:space="preserve">. Reemplaza al empalme anterior, que encadenaba tasas anuales tipeadas y las desagregaba con Denton.</w:t>
       </w:r>
     </w:p>
     <w:p>
@@ -5317,25 +5680,13 @@
           <w:b/>
           <w:bCs/>
         </w:rPr>
-        <w:t xml:space="preserve">Transformación.</w:t>
-      </w:r>
-      <w:r>
-        <w:t xml:space="preserve"> </w:t>
-      </w:r>
-      <w:r>
-        <w:t xml:space="preserve">El crecimiento que entra en el sistema es</w:t>
-      </w:r>
-      <w:r>
-        <w:t xml:space="preserve"> </w:t>
-      </w:r>
-      <w:r>
-        <w:rPr>
-          <w:rStyle w:val="VerbatimChar"/>
-        </w:rPr>
-        <w:t xml:space="preserve">crec = 100 × Δln(PIB real)</w:t>
-      </w:r>
-      <w:r>
-        <w:t xml:space="preserve">, trimestral. Es lo que aparece en la identidad de la deuda (Capítulo 4, sección 4.2). El crecimiento pierde la primera observación, así que tiene 119 datos.</w:t>
+        <w:t xml:space="preserve">Límite del enlace.</w:t>
+      </w:r>
+      <w:r>
+        <w:t xml:space="preserve"> </w:t>
+      </w:r>
+      <w:r>
+        <w:t xml:space="preserve">La razón entre bases varía entre 1,46 y 1,85 en el solapamiento 2004-2013 por las distintas ponderaciones de precios, de modo que el nivel anterior a 2004 depende de haber elegido 2004 como año de enlace. Las tasas de crecimiento anteriores a 2004, que son lo que entra al modelo, no dependen de esa elección.</w:t>
       </w:r>
     </w:p>
     <w:p>
@@ -5351,13 +5702,47 @@
           <w:b/>
           <w:bCs/>
         </w:rPr>
-        <w:t xml:space="preserve">Efecto del Denton.</w:t>
-      </w:r>
-      <w:r>
-        <w:t xml:space="preserve"> </w:t>
-      </w:r>
-      <w:r>
-        <w:t xml:space="preserve">La desagregación suaviza el perfil intra-anual de 1996-2003. La variación trimestral de ese tramo refleja el filtro y no un dato observado. Es una limitación declarada.</w:t>
+        <w:t xml:space="preserve">Estacionalidad.</w:t>
+      </w:r>
+      <w:r>
+        <w:t xml:space="preserve"> </w:t>
+      </w:r>
+      <w:r>
+        <w:t xml:space="preserve">La serie conserva la estacionalidad de INDEC, que ya no está suavizada. Por ese motivo el nivel trimestral de 1996-2003 difiere de la versión anterior en hasta 9,8 % (2002T1) y 3,5 % en promedio. El sistema la absorbe con las dummies trimestrales, igual que en el resultado primario. Las tasas anuales de la versión anterior eran correctas salvo en 2000 (−0,5 % contra −0,79 %).</w:t>
+      </w:r>
+    </w:p>
+    <w:p>
+      <w:pPr>
+        <w:pStyle w:val="Compact"/>
+        <w:numPr>
+          <w:ilvl w:val="0"/>
+          <w:numId w:val="1010"/>
+        </w:numPr>
+      </w:pPr>
+      <w:r>
+        <w:rPr>
+          <w:b/>
+          <w:bCs/>
+        </w:rPr>
+        <w:t xml:space="preserve">Transformación.</w:t>
+      </w:r>
+      <w:r>
+        <w:t xml:space="preserve"> </w:t>
+      </w:r>
+      <w:r>
+        <w:t xml:space="preserve">El crecimiento que entra al sistema es</w:t>
+      </w:r>
+      <w:r>
+        <w:t xml:space="preserve"> </w:t>
+      </w:r>
+      <w:r>
+        <w:rPr>
+          <w:rStyle w:val="VerbatimChar"/>
+        </w:rPr>
+        <w:t xml:space="preserve">crec = 100 × Δln(PIB real)</w:t>
+      </w:r>
+      <w:r>
+        <w:t xml:space="preserve">, trimestral, que aparece en la identidad de la deuda (Capítulo 4, sección 4.2). Pierde la primera observación, así que tiene 119 datos. El salto entre 2003T4 y 2004T1 (−2,1 %) es el efecto estacional del cambio de trimestre y no un artefacto del empalme.</w:t>
       </w:r>
     </w:p>
     <w:bookmarkEnd w:id="65"/>
@@ -5996,7 +6381,7 @@
         <w:t xml:space="preserve"> </w:t>
       </w:r>
       <w:r>
-        <w:t xml:space="preserve">No. 25/95, Annex II, Table 2 (p. 68 del PDF; datos en</w:t>
+        <w:t xml:space="preserve">No. 25/95 (Annex II, Table 2 para la deuda; Table 3b para el resultado primario; datos en</w:t>
       </w:r>
       <w:r>
         <w:t xml:space="preserve"> </w:t>
@@ -6008,7 +6393,7 @@
         <w:t xml:space="preserve">datos/procesados/escenario_base_fmi_cr2595.csv</w:t>
       </w:r>
       <w:r>
-        <w:t xml:space="preserve">). El FMI publica ese cuadro solo para 2023-2026.</w:t>
+        <w:t xml:space="preserve">). El FMI publica el cuadro de deuda solo para 2023-2026.</w:t>
       </w:r>
     </w:p>
     <w:bookmarkStart w:id="72" w:name="Xa01cff60600f7a82bb5f91b22357c6f4e94a632"/>
@@ -6288,7 +6673,7 @@
                 <w:rFonts w:ascii="Calibri" w:hAnsi="Calibri"/>
                 <w:sz w:val="20"/>
               </w:rPr>
-              <w:t xml:space="preserve">48,6 (solo BCRA)</w:t>
+              <w:t xml:space="preserve">48,6 (solo BCRA, nominal piso)</w:t>
             </w:r>
           </w:p>
         </w:tc>
@@ -6333,7 +6718,7 @@
                 <w:rFonts w:ascii="Calibri" w:hAnsi="Calibri"/>
                 <w:sz w:val="20"/>
               </w:rPr>
-              <w:t xml:space="preserve">13,2 (solo BCRA)</w:t>
+              <w:t xml:space="preserve">20,4 (solo BCRA, nominal piso)</w:t>
             </w:r>
           </w:p>
         </w:tc>
@@ -6363,7 +6748,7 @@
                 <w:rFonts w:ascii="Calibri" w:hAnsi="Calibri"/>
                 <w:sz w:val="20"/>
               </w:rPr>
-              <w:t xml:space="preserve">−20,7</w:t>
+              <w:t xml:space="preserve">−13,5</w:t>
             </w:r>
           </w:p>
         </w:tc>
@@ -6808,7 +7193,7 @@
                 <w:rFonts w:ascii="Calibri" w:hAnsi="Calibri"/>
                 <w:sz w:val="20"/>
               </w:rPr>
-              <w:t xml:space="preserve">6. Deuda neta consolidada</w:t>
+              <w:t xml:space="preserve">6. Deuda neta consolidada (nominal piso)</w:t>
             </w:r>
           </w:p>
         </w:tc>
@@ -6876,7 +7261,7 @@
                 <w:bCs/>
                 <w:sz w:val="20"/>
               </w:rPr>
-              <w:t xml:space="preserve">68,3</w:t>
+              <w:t xml:space="preserve">61,1</w:t>
             </w:r>
           </w:p>
         </w:tc>
@@ -6910,6 +7295,115 @@
                 <w:bCs/>
                 <w:sz w:val="20"/>
               </w:rPr>
+              <w:t xml:space="preserve">+9,6</w:t>
+            </w:r>
+          </w:p>
+        </w:tc>
+      </w:tr>
+      <w:tr>
+        <w:tc>
+          <w:tcPr/>
+          <w:p>
+            <w:pPr>
+              <w:pStyle w:val="Compact"/>
+            </w:pPr>
+            <w:r>
+              <w:rPr>
+                <w:rFonts w:ascii="Calibri" w:hAnsi="Calibri"/>
+                <w:i/>
+                <w:iCs/>
+                <w:sz w:val="20"/>
+              </w:rPr>
+              <w:t xml:space="preserve">Memo: deuda neta a valor de libros</w:t>
+            </w:r>
+          </w:p>
+        </w:tc>
+        <w:tc>
+          <w:tcPr/>
+          <w:p>
+            <w:pPr>
+              <w:pStyle w:val="Compact"/>
+            </w:pPr>
+            <w:r>
+              <w:rPr>
+                <w:rFonts w:ascii="Calibri" w:hAnsi="Calibri"/>
+                <w:sz w:val="20"/>
+              </w:rPr>
+              <w:t xml:space="preserve">119,0</w:t>
+            </w:r>
+          </w:p>
+        </w:tc>
+        <w:tc>
+          <w:tcPr/>
+          <w:p>
+            <w:pPr>
+              <w:pStyle w:val="Compact"/>
+            </w:pPr>
+            <w:r>
+              <w:rPr>
+                <w:rFonts w:ascii="Calibri" w:hAnsi="Calibri"/>
+                <w:sz w:val="20"/>
+              </w:rPr>
+              <w:t xml:space="preserve">110,8</w:t>
+            </w:r>
+          </w:p>
+        </w:tc>
+        <w:tc>
+          <w:tcPr/>
+          <w:p>
+            <w:pPr>
+              <w:pStyle w:val="Compact"/>
+            </w:pPr>
+            <w:r>
+              <w:rPr>
+                <w:rFonts w:ascii="Calibri" w:hAnsi="Calibri"/>
+                <w:sz w:val="20"/>
+              </w:rPr>
+              <w:t xml:space="preserve">+8,2</w:t>
+            </w:r>
+          </w:p>
+        </w:tc>
+        <w:tc>
+          <w:tcPr/>
+          <w:p>
+            <w:pPr>
+              <w:pStyle w:val="Compact"/>
+            </w:pPr>
+            <w:r>
+              <w:rPr>
+                <w:rFonts w:ascii="Calibri" w:hAnsi="Calibri"/>
+                <w:sz w:val="20"/>
+              </w:rPr>
+              <w:t xml:space="preserve">68,3</w:t>
+            </w:r>
+          </w:p>
+        </w:tc>
+        <w:tc>
+          <w:tcPr/>
+          <w:p>
+            <w:pPr>
+              <w:pStyle w:val="Compact"/>
+            </w:pPr>
+            <w:r>
+              <w:rPr>
+                <w:rFonts w:ascii="Calibri" w:hAnsi="Calibri"/>
+                <w:sz w:val="20"/>
+              </w:rPr>
+              <w:t xml:space="preserve">51,5</w:t>
+            </w:r>
+          </w:p>
+        </w:tc>
+        <w:tc>
+          <w:tcPr/>
+          <w:p>
+            <w:pPr>
+              <w:pStyle w:val="Compact"/>
+            </w:pPr>
+            <w:r>
+              <w:rPr>
+                <w:rFonts w:ascii="Calibri" w:hAnsi="Calibri"/>
+                <w:sz w:val="20"/>
+              </w:rPr>
               <w:t xml:space="preserve">+16,8</w:t>
             </w:r>
           </w:p>
@@ -6930,7 +7424,7 @@
         <w:rPr>
           <w:rStyle w:val="VerbatimChar"/>
         </w:rPr>
-        <w:t xml:space="preserve">deuda_consolidada_neta_1996_2025.csv</w:t>
+        <w:t xml:space="preserve">deuda_consolidada_neta_nominal_1996_2025.csv</w:t>
       </w:r>
       <w:r>
         <w:t xml:space="preserve"> </w:t>
@@ -6972,7 +7466,7 @@
         <w:rPr>
           <w:rStyle w:val="VerbatimChar"/>
         </w:rPr>
-        <w:t xml:space="preserve">deuda_consolidada_neta_1996_2025_control_fmi.csv</w:t>
+        <w:t xml:space="preserve">deuda_consolidada_neta_nominal_1996_2025_control_fmi.csv</w:t>
       </w:r>
       <w:r>
         <w:t xml:space="preserve">. En dólares, el FMI publica 367,9 y 478,7 mil millones para la deuda bruta federal y 262,2 y 289,0 para la deuda neta consolidada (2023 y 2024).</w:t>
@@ -7009,7 +7503,7 @@
         <w:t xml:space="preserve"> </w:t>
       </w:r>
       <w:r>
-        <w:t xml:space="preserve">y reclamos por el cupón PIB (nota 1 del cuadro), que no figuran en los informes del MECON, y a la versión de PIB de su informe. La diferencia de los pasivos del BCRA en 2023 es compatible con la omisión del swap con el PBoC y de otros instrumentos, aunque no se pudo verificar por falta de una serie. La brecha de la deuda neta no se explica por esas partidas: se concentra en la línea 3.</w:t>
+        <w:t xml:space="preserve">y reclamos por el cupón PIB (nota 1 del cuadro), que no figuran en los informes del MECON, y a la versión de PIB de su informe. La diferencia de los pasivos del BCRA en 2023 es compatible con la omisión del swap con el PBoC y de otros instrumentos, aunque no se pudo verificar por falta de una serie. La valuación nominal no cambia 2023, porque en ese año el valor de libros ya supera al nominal y la variante piso conserva el de libros. En 2024 reduce la deuda neta de 68,3 a 61,1 y la brecha con el FMI, de 16,8 a 9,6 puntos.</w:t>
       </w:r>
     </w:p>
     <w:bookmarkEnd w:id="72"/>
@@ -7189,7 +7683,7 @@
                 <w:rFonts w:ascii="Calibri" w:hAnsi="Calibri"/>
                 <w:sz w:val="20"/>
               </w:rPr>
-              <w:t xml:space="preserve">+20,7</w:t>
+              <w:t xml:space="preserve">+13,5</w:t>
             </w:r>
           </w:p>
         </w:tc>
@@ -7336,7 +7830,7 @@
                 <w:bCs/>
                 <w:sz w:val="20"/>
               </w:rPr>
-              <w:t xml:space="preserve">+16,8</w:t>
+              <w:t xml:space="preserve">+9,6</w:t>
             </w:r>
           </w:p>
         </w:tc>
@@ -7347,17 +7841,381 @@
         <w:pStyle w:val="BodyText"/>
       </w:pPr>
       <w:r>
-        <w:t xml:space="preserve">El 100 % del exceso de nuestra deuda neta sobre la del FMI proviene del neteo incompleto de las tenencias intra-públicas.</w:t>
+        <w:t xml:space="preserve">Las filas de 2024 no suman exactamente por redondeo. El exceso de nuestra deuda neta sobre la del FMI proviene del neteo incompleto de las tenencias intra-públicas, que compensa con creces la bruta menor y los pasivos menores.</w:t>
       </w:r>
     </w:p>
     <w:bookmarkEnd w:id="73"/>
-    <w:bookmarkStart w:id="74" w:name="otras-comparaciones"/>
+    <w:bookmarkStart w:id="74" w:name="resultado-primario-y-otras-comparaciones"/>
     <w:p>
       <w:pPr>
         <w:pStyle w:val="Heading3"/>
       </w:pPr>
       <w:r>
-        <w:t xml:space="preserve">5.8.3 Otras comparaciones</w:t>
+        <w:t xml:space="preserve">5.8.3 Resultado primario y otras comparaciones</w:t>
+      </w:r>
+    </w:p>
+    <w:p>
+      <w:pPr>
+        <w:pStyle w:val="FirstParagraph"/>
+      </w:pPr>
+      <w:r>
+        <w:t xml:space="preserve">El FMI (2025, Table 3b) informa el resultado primario del gobierno federal sin las transferencias de utilidades del BCRA (0,9 % del PIB en 2023 y 0,0 % en 2024, nota 9). La comparación usa la medida anual comparable</w:t>
+      </w:r>
+      <w:r>
+        <w:t xml:space="preserve"> </w:t>
+      </w:r>
+      <w:r>
+        <w:rPr>
+          <w:rStyle w:val="VerbatimChar"/>
+        </w:rPr>
+        <w:t xml:space="preserve">pb_pib</w:t>
+      </w:r>
+      <w:r>
+        <w:t xml:space="preserve"> </w:t>
+      </w:r>
+      <w:r>
+        <w:t xml:space="preserve">(suma de cuatro trimestres sobre PIB de cuatro trimestres, cierre de diciembre), no la</w:t>
+      </w:r>
+      <w:r>
+        <w:t xml:space="preserve"> </w:t>
+      </w:r>
+      <w:r>
+        <w:rPr>
+          <w:rStyle w:val="VerbatimChar"/>
+        </w:rPr>
+        <w:t xml:space="preserve">pb_pib_trim</w:t>
+      </w:r>
+      <w:r>
+        <w:t xml:space="preserve"> </w:t>
+      </w:r>
+      <w:r>
+        <w:t xml:space="preserve">que entra al modelo.</w:t>
+      </w:r>
+    </w:p>
+    <w:tbl>
+      <w:tblPr>
+        <w:tblStyle w:val="Table"/>
+        <w:tblW w:type="pct" w:w="5000"/>
+        <w:tblLayout w:type="fixed"/>
+        <w:tblLook w:firstRow="1" w:lastRow="0" w:firstColumn="0" w:lastColumn="0" w:noHBand="0" w:noVBand="0" w:val="0020"/>
+        <w:tblBorders>
+          <w:top w:val="single" w:sz="4" w:color="808080"/>
+          <w:left w:val="single" w:sz="4" w:color="808080"/>
+          <w:bottom w:val="single" w:sz="4" w:color="808080"/>
+          <w:right w:val="single" w:sz="4" w:color="808080"/>
+          <w:insideH w:val="single" w:sz="4" w:color="808080"/>
+          <w:insideV w:val="single" w:sz="4" w:color="808080"/>
+        </w:tblBorders>
+      </w:tblPr>
+      <w:tblGrid>
+        <w:gridCol w:w="2640"/>
+        <w:gridCol w:w="2640"/>
+        <w:gridCol w:w="2640"/>
+      </w:tblGrid>
+      <w:tr>
+        <w:trPr>
+          <w:tblHeader w:val="on"/>
+        </w:trPr>
+        <w:tc>
+          <w:tcPr/>
+          <w:p>
+            <w:pPr>
+              <w:pStyle w:val="Compact"/>
+            </w:pPr>
+            <w:r>
+              <w:rPr>
+                <w:rFonts w:ascii="Calibri" w:hAnsi="Calibri"/>
+                <w:sz w:val="20"/>
+              </w:rPr>
+              <w:t xml:space="preserve">Resultado primario (% PIB)</w:t>
+            </w:r>
+          </w:p>
+        </w:tc>
+        <w:tc>
+          <w:tcPr/>
+          <w:p>
+            <w:pPr>
+              <w:pStyle w:val="Compact"/>
+            </w:pPr>
+            <w:r>
+              <w:rPr>
+                <w:rFonts w:ascii="Calibri" w:hAnsi="Calibri"/>
+                <w:sz w:val="20"/>
+              </w:rPr>
+              <w:t xml:space="preserve">2023</w:t>
+            </w:r>
+          </w:p>
+        </w:tc>
+        <w:tc>
+          <w:tcPr/>
+          <w:p>
+            <w:pPr>
+              <w:pStyle w:val="Compact"/>
+            </w:pPr>
+            <w:r>
+              <w:rPr>
+                <w:rFonts w:ascii="Calibri" w:hAnsi="Calibri"/>
+                <w:sz w:val="20"/>
+              </w:rPr>
+              <w:t xml:space="preserve">2024</w:t>
+            </w:r>
+          </w:p>
+        </w:tc>
+      </w:tr>
+      <w:tr>
+        <w:tc>
+          <w:tcPr/>
+          <w:p>
+            <w:pPr>
+              <w:pStyle w:val="Compact"/>
+            </w:pPr>
+            <w:r>
+              <w:rPr>
+                <w:rFonts w:ascii="Calibri" w:hAnsi="Calibri"/>
+                <w:sz w:val="20"/>
+              </w:rPr>
+              <w:t xml:space="preserve">Propio, con rentas (serie principal)</w:t>
+            </w:r>
+          </w:p>
+        </w:tc>
+        <w:tc>
+          <w:tcPr/>
+          <w:p>
+            <w:pPr>
+              <w:pStyle w:val="Compact"/>
+            </w:pPr>
+            <w:r>
+              <w:rPr>
+                <w:rFonts w:ascii="Calibri" w:hAnsi="Calibri"/>
+                <w:sz w:val="20"/>
+              </w:rPr>
+              <w:t xml:space="preserve">−2,66</w:t>
+            </w:r>
+          </w:p>
+        </w:tc>
+        <w:tc>
+          <w:tcPr/>
+          <w:p>
+            <w:pPr>
+              <w:pStyle w:val="Compact"/>
+            </w:pPr>
+            <w:r>
+              <w:rPr>
+                <w:rFonts w:ascii="Calibri" w:hAnsi="Calibri"/>
+                <w:sz w:val="20"/>
+              </w:rPr>
+              <w:t xml:space="preserve">1,78</w:t>
+            </w:r>
+          </w:p>
+        </w:tc>
+      </w:tr>
+      <w:tr>
+        <w:tc>
+          <w:tcPr/>
+          <w:p>
+            <w:pPr>
+              <w:pStyle w:val="Compact"/>
+            </w:pPr>
+            <w:r>
+              <w:rPr>
+                <w:rFonts w:ascii="Calibri" w:hAnsi="Calibri"/>
+                <w:sz w:val="20"/>
+              </w:rPr>
+              <w:t xml:space="preserve">Propio, sin rentas (cota conservadora)</w:t>
+            </w:r>
+          </w:p>
+        </w:tc>
+        <w:tc>
+          <w:tcPr/>
+          <w:p>
+            <w:pPr>
+              <w:pStyle w:val="Compact"/>
+            </w:pPr>
+            <w:r>
+              <w:rPr>
+                <w:rFonts w:ascii="Calibri" w:hAnsi="Calibri"/>
+                <w:sz w:val="20"/>
+              </w:rPr>
+              <w:t xml:space="preserve">−3,67</w:t>
+            </w:r>
+          </w:p>
+        </w:tc>
+        <w:tc>
+          <w:tcPr/>
+          <w:p>
+            <w:pPr>
+              <w:pStyle w:val="Compact"/>
+            </w:pPr>
+            <w:r>
+              <w:rPr>
+                <w:rFonts w:ascii="Calibri" w:hAnsi="Calibri"/>
+                <w:sz w:val="20"/>
+              </w:rPr>
+              <w:t xml:space="preserve">1,01</w:t>
+            </w:r>
+          </w:p>
+        </w:tc>
+      </w:tr>
+      <w:tr>
+        <w:tc>
+          <w:tcPr/>
+          <w:p>
+            <w:pPr>
+              <w:pStyle w:val="Compact"/>
+            </w:pPr>
+            <w:r>
+              <w:rPr>
+                <w:rFonts w:ascii="Calibri" w:hAnsi="Calibri"/>
+                <w:sz w:val="20"/>
+              </w:rPr>
+              <w:t xml:space="preserve">Propio con rentas menos transferencia BCRA del FMI</w:t>
+            </w:r>
+          </w:p>
+        </w:tc>
+        <w:tc>
+          <w:tcPr/>
+          <w:p>
+            <w:pPr>
+              <w:pStyle w:val="Compact"/>
+            </w:pPr>
+            <w:r>
+              <w:rPr>
+                <w:rFonts w:ascii="Calibri" w:hAnsi="Calibri"/>
+                <w:sz w:val="20"/>
+              </w:rPr>
+              <w:t xml:space="preserve">−3,56</w:t>
+            </w:r>
+          </w:p>
+        </w:tc>
+        <w:tc>
+          <w:tcPr/>
+          <w:p>
+            <w:pPr>
+              <w:pStyle w:val="Compact"/>
+            </w:pPr>
+            <w:r>
+              <w:rPr>
+                <w:rFonts w:ascii="Calibri" w:hAnsi="Calibri"/>
+                <w:sz w:val="20"/>
+              </w:rPr>
+              <w:t xml:space="preserve">1,78</w:t>
+            </w:r>
+          </w:p>
+        </w:tc>
+      </w:tr>
+      <w:tr>
+        <w:tc>
+          <w:tcPr/>
+          <w:p>
+            <w:pPr>
+              <w:pStyle w:val="Compact"/>
+            </w:pPr>
+            <w:r>
+              <w:rPr>
+                <w:rFonts w:ascii="Calibri" w:hAnsi="Calibri"/>
+                <w:sz w:val="20"/>
+              </w:rPr>
+              <w:t xml:space="preserve">Serie anterior (tabla escrita a mano)</w:t>
+            </w:r>
+          </w:p>
+        </w:tc>
+        <w:tc>
+          <w:tcPr/>
+          <w:p>
+            <w:pPr>
+              <w:pStyle w:val="Compact"/>
+            </w:pPr>
+            <w:r>
+              <w:rPr>
+                <w:rFonts w:ascii="Calibri" w:hAnsi="Calibri"/>
+                <w:sz w:val="20"/>
+              </w:rPr>
+              <w:t xml:space="preserve">−2,90</w:t>
+            </w:r>
+          </w:p>
+        </w:tc>
+        <w:tc>
+          <w:tcPr/>
+          <w:p>
+            <w:pPr>
+              <w:pStyle w:val="Compact"/>
+            </w:pPr>
+            <w:r>
+              <w:rPr>
+                <w:rFonts w:ascii="Calibri" w:hAnsi="Calibri"/>
+                <w:sz w:val="20"/>
+              </w:rPr>
+              <w:t xml:space="preserve">1,40</w:t>
+            </w:r>
+          </w:p>
+        </w:tc>
+      </w:tr>
+      <w:tr>
+        <w:tc>
+          <w:tcPr/>
+          <w:p>
+            <w:pPr>
+              <w:pStyle w:val="Compact"/>
+            </w:pPr>
+            <w:r>
+              <w:rPr>
+                <w:rFonts w:ascii="Calibri" w:hAnsi="Calibri"/>
+                <w:sz w:val="20"/>
+              </w:rPr>
+              <w:t xml:space="preserve">FMI (2025), gobierno federal sin transferencias del BCRA</w:t>
+            </w:r>
+          </w:p>
+        </w:tc>
+        <w:tc>
+          <w:tcPr/>
+          <w:p>
+            <w:pPr>
+              <w:pStyle w:val="Compact"/>
+            </w:pPr>
+            <w:r>
+              <w:rPr>
+                <w:rFonts w:ascii="Calibri" w:hAnsi="Calibri"/>
+                <w:sz w:val="20"/>
+              </w:rPr>
+              <w:t xml:space="preserve">−2,8</w:t>
+            </w:r>
+          </w:p>
+        </w:tc>
+        <w:tc>
+          <w:tcPr/>
+          <w:p>
+            <w:pPr>
+              <w:pStyle w:val="Compact"/>
+            </w:pPr>
+            <w:r>
+              <w:rPr>
+                <w:rFonts w:ascii="Calibri" w:hAnsi="Calibri"/>
+                <w:sz w:val="20"/>
+              </w:rPr>
+              <w:t xml:space="preserve">1,8</w:t>
+            </w:r>
+          </w:p>
+        </w:tc>
+      </w:tr>
+    </w:tbl>
+    <w:p>
+      <w:pPr>
+        <w:pStyle w:val="BodyText"/>
+      </w:pPr>
+      <w:r>
+        <w:t xml:space="preserve">Fuente:</w:t>
+      </w:r>
+      <w:r>
+        <w:t xml:space="preserve"> </w:t>
+      </w:r>
+      <w:r>
+        <w:rPr>
+          <w:rStyle w:val="VerbatimChar"/>
+        </w:rPr>
+        <w:t xml:space="preserve">datos/procesados/resultado_primario_1996_2025_control.csv</w:t>
+      </w:r>
+      <w:r>
+        <w:t xml:space="preserve">. La serie propia con rentas queda a 0,14 puntos del FMI en 2023 y a 0,02 en 2024, y los signos coinciden. Esa cercanía debe leerse con cuidado: el agregado propio es el sector público nacional con todas las rentas, y el del FMI es el gobierno federal sin las transferencias del BCRA, de modo que parte de la coincidencia puede ser casual. En 2023, descontando la transferencia del BCRA que informa el FMI, la serie propia daría −3,56, a 0,76 puntos de la cifra del FMI. La serie propia ya no es una tabla escrita a mano, pero el control contra el FMI sigue siendo de orden de magnitud por el cambio de perímetro y por los quiebres de metodología de 2006/2007 y 2014/2015 (sección 5.4).</w:t>
       </w:r>
     </w:p>
     <w:tbl>
@@ -7582,52 +8440,52 @@
                 <w:rFonts w:ascii="Calibri" w:hAnsi="Calibri"/>
                 <w:sz w:val="20"/>
               </w:rPr>
-              <w:t xml:space="preserve">Resultado primario 2023 (promedio anual)</w:t>
-            </w:r>
-          </w:p>
-        </w:tc>
-        <w:tc>
-          <w:tcPr/>
-          <w:p>
-            <w:pPr>
-              <w:pStyle w:val="Compact"/>
-            </w:pPr>
-            <w:r>
-              <w:rPr>
-                <w:rFonts w:ascii="Calibri" w:hAnsi="Calibri"/>
-                <w:sz w:val="20"/>
-              </w:rPr>
-              <w:t xml:space="preserve">−2,05 % PIB</w:t>
-            </w:r>
-          </w:p>
-        </w:tc>
-        <w:tc>
-          <w:tcPr/>
-          <w:p>
-            <w:pPr>
-              <w:pStyle w:val="Compact"/>
-            </w:pPr>
-            <w:r>
-              <w:rPr>
-                <w:rFonts w:ascii="Calibri" w:hAnsi="Calibri"/>
-                <w:sz w:val="20"/>
-              </w:rPr>
-              <w:t xml:space="preserve">−2,8 % PIB</w:t>
-            </w:r>
-          </w:p>
-        </w:tc>
-        <w:tc>
-          <w:tcPr/>
-          <w:p>
-            <w:pPr>
-              <w:pStyle w:val="Compact"/>
-            </w:pPr>
-            <w:r>
-              <w:rPr>
-                <w:rFonts w:ascii="Calibri" w:hAnsi="Calibri"/>
-                <w:sz w:val="20"/>
-              </w:rPr>
-              <w:t xml:space="preserve">FMI (2025), gobierno federal</w:t>
+              <w:t xml:space="preserve">Cociente USD/ARS al 31/12/2023</w:t>
+            </w:r>
+          </w:p>
+        </w:tc>
+        <w:tc>
+          <w:tcPr/>
+          <w:p>
+            <w:pPr>
+              <w:pStyle w:val="Compact"/>
+            </w:pPr>
+            <w:r>
+              <w:rPr>
+                <w:rFonts w:ascii="Calibri" w:hAnsi="Calibri"/>
+                <w:sz w:val="20"/>
+              </w:rPr>
+              <w:t xml:space="preserve">808,45</w:t>
+            </w:r>
+          </w:p>
+        </w:tc>
+        <w:tc>
+          <w:tcPr/>
+          <w:p>
+            <w:pPr>
+              <w:pStyle w:val="Compact"/>
+            </w:pPr>
+            <w:r>
+              <w:rPr>
+                <w:rFonts w:ascii="Calibri" w:hAnsi="Calibri"/>
+                <w:sz w:val="20"/>
+              </w:rPr>
+              <w:t xml:space="preserve">808,45</w:t>
+            </w:r>
+          </w:p>
+        </w:tc>
+        <w:tc>
+          <w:tcPr/>
+          <w:p>
+            <w:pPr>
+              <w:pStyle w:val="Compact"/>
+            </w:pPr>
+            <w:r>
+              <w:rPr>
+                <w:rFonts w:ascii="Calibri" w:hAnsi="Calibri"/>
+                <w:sz w:val="20"/>
+              </w:rPr>
+              <w:t xml:space="preserve">MECON, hoja A.1.1 (informe 2023)</w:t>
             </w:r>
           </w:p>
         </w:tc>
@@ -7644,130 +8502,6 @@
                 <w:rFonts w:ascii="Calibri" w:hAnsi="Calibri"/>
                 <w:sz w:val="20"/>
               </w:rPr>
-              <w:t xml:space="preserve">Resultado primario 2024</w:t>
-            </w:r>
-          </w:p>
-        </w:tc>
-        <w:tc>
-          <w:tcPr/>
-          <w:p>
-            <w:pPr>
-              <w:pStyle w:val="Compact"/>
-            </w:pPr>
-            <w:r>
-              <w:rPr>
-                <w:rFonts w:ascii="Calibri" w:hAnsi="Calibri"/>
-                <w:sz w:val="20"/>
-              </w:rPr>
-              <w:t xml:space="preserve">+1,58 % PIB</w:t>
-            </w:r>
-          </w:p>
-        </w:tc>
-        <w:tc>
-          <w:tcPr/>
-          <w:p>
-            <w:pPr>
-              <w:pStyle w:val="Compact"/>
-            </w:pPr>
-            <w:r>
-              <w:rPr>
-                <w:rFonts w:ascii="Calibri" w:hAnsi="Calibri"/>
-                <w:sz w:val="20"/>
-              </w:rPr>
-              <w:t xml:space="preserve">+1,8 % PIB</w:t>
-            </w:r>
-          </w:p>
-        </w:tc>
-        <w:tc>
-          <w:tcPr/>
-          <w:p>
-            <w:pPr>
-              <w:pStyle w:val="Compact"/>
-            </w:pPr>
-            <w:r>
-              <w:rPr>
-                <w:rFonts w:ascii="Calibri" w:hAnsi="Calibri"/>
-                <w:sz w:val="20"/>
-              </w:rPr>
-              <w:t xml:space="preserve">FMI (2025), gobierno federal</w:t>
-            </w:r>
-          </w:p>
-        </w:tc>
-      </w:tr>
-      <w:tr>
-        <w:tc>
-          <w:tcPr/>
-          <w:p>
-            <w:pPr>
-              <w:pStyle w:val="Compact"/>
-            </w:pPr>
-            <w:r>
-              <w:rPr>
-                <w:rFonts w:ascii="Calibri" w:hAnsi="Calibri"/>
-                <w:sz w:val="20"/>
-              </w:rPr>
-              <w:t xml:space="preserve">Cociente USD/ARS al 31/12/2023</w:t>
-            </w:r>
-          </w:p>
-        </w:tc>
-        <w:tc>
-          <w:tcPr/>
-          <w:p>
-            <w:pPr>
-              <w:pStyle w:val="Compact"/>
-            </w:pPr>
-            <w:r>
-              <w:rPr>
-                <w:rFonts w:ascii="Calibri" w:hAnsi="Calibri"/>
-                <w:sz w:val="20"/>
-              </w:rPr>
-              <w:t xml:space="preserve">808,45</w:t>
-            </w:r>
-          </w:p>
-        </w:tc>
-        <w:tc>
-          <w:tcPr/>
-          <w:p>
-            <w:pPr>
-              <w:pStyle w:val="Compact"/>
-            </w:pPr>
-            <w:r>
-              <w:rPr>
-                <w:rFonts w:ascii="Calibri" w:hAnsi="Calibri"/>
-                <w:sz w:val="20"/>
-              </w:rPr>
-              <w:t xml:space="preserve">808,45</w:t>
-            </w:r>
-          </w:p>
-        </w:tc>
-        <w:tc>
-          <w:tcPr/>
-          <w:p>
-            <w:pPr>
-              <w:pStyle w:val="Compact"/>
-            </w:pPr>
-            <w:r>
-              <w:rPr>
-                <w:rFonts w:ascii="Calibri" w:hAnsi="Calibri"/>
-                <w:sz w:val="20"/>
-              </w:rPr>
-              <w:t xml:space="preserve">MECON, hoja A.1.1 (informe 2023)</w:t>
-            </w:r>
-          </w:p>
-        </w:tc>
-      </w:tr>
-      <w:tr>
-        <w:tc>
-          <w:tcPr/>
-          <w:p>
-            <w:pPr>
-              <w:pStyle w:val="Compact"/>
-            </w:pPr>
-            <w:r>
-              <w:rPr>
-                <w:rFonts w:ascii="Calibri" w:hAnsi="Calibri"/>
-                <w:sz w:val="20"/>
-              </w:rPr>
               <w:t xml:space="preserve">Pasivos del BCRA 2023, con PIB anualizado del cuarto trimestre</w:t>
             </w:r>
           </w:p>
@@ -7825,7 +8559,7 @@
         <w:pStyle w:val="BodyText"/>
       </w:pPr>
       <w:r>
-        <w:t xml:space="preserve">Las diferencias de crecimiento (0,3 puntos) son compatibles con revisiones de INDEC posteriores al informe del FMI. El resultado primario del FMI corresponde al gobierno federal, y el propio al sector público nacional con la serie descripta en 5.4, de modo que la comparación solo sirve como orden de magnitud. En ambos años los signos coinciden y la diferencia es de 0,2 a 0,75 puntos. No se pudo contrastar contra los informes mensuales del MECON porque la serie de 2004-2025 no tiene archivo de origen.</w:t>
+        <w:t xml:space="preserve">Las diferencias de crecimiento (0,3 puntos) son compatibles con revisiones de INDEC posteriores al informe del FMI. Ambos años pertenecen al tramo con base 2004 directa, de modo que el empalme de 1996-2003 no interviene.</w:t>
       </w:r>
     </w:p>
     <w:bookmarkEnd w:id="74"/>
@@ -7843,7 +8577,7 @@
         <w:pStyle w:val="FirstParagraph"/>
       </w:pPr>
       <w:r>
-        <w:t xml:space="preserve">El Informe de Deuda del MECON publica, en la hoja A.1.9, el valor nominal de las Letras adquiridas por el BCRA (en miles de dólares).</w:t>
+        <w:t xml:space="preserve">El Informe de Deuda del MECON publica, en la hoja A.1.9, el valor nominal de las Letras adquiridas por el BCRA (en miles de dólares). Es el insumo de la serie nominal de 5.3.4.</w:t>
       </w:r>
     </w:p>
     <w:tbl>
@@ -7975,7 +8709,7 @@
                 <w:rFonts w:ascii="Calibri" w:hAnsi="Calibri"/>
                 <w:sz w:val="20"/>
               </w:rPr>
-              <w:t xml:space="preserve">Tenencia del BCRA en moneda extranjera, valor contable, propia (miles de millones de USD)</w:t>
+              <w:t xml:space="preserve">Tenencia del BCRA en moneda extranjera, valor contable (miles de millones de USD)</w:t>
             </w:r>
           </w:p>
         </w:tc>
@@ -8022,37 +8756,84 @@
                 <w:rFonts w:ascii="Calibri" w:hAnsi="Calibri"/>
                 <w:sz w:val="20"/>
               </w:rPr>
-              <w:t xml:space="preserve">Diferencia: nominal menos contable (puntos del PIB)</w:t>
-            </w:r>
-          </w:p>
-        </w:tc>
-        <w:tc>
-          <w:tcPr/>
-          <w:p>
-            <w:pPr>
-              <w:pStyle w:val="Compact"/>
-            </w:pPr>
-            <w:r>
-              <w:rPr>
-                <w:rFonts w:ascii="Calibri" w:hAnsi="Calibri"/>
-                <w:sz w:val="20"/>
-              </w:rPr>
-              <w:t xml:space="preserve">−9,2 (contable mayor)</w:t>
-            </w:r>
-          </w:p>
-        </w:tc>
-        <w:tc>
-          <w:tcPr/>
-          <w:p>
-            <w:pPr>
-              <w:pStyle w:val="Compact"/>
-            </w:pPr>
-            <w:r>
-              <w:rPr>
-                <w:rFonts w:ascii="Calibri" w:hAnsi="Calibri"/>
-                <w:sz w:val="20"/>
-              </w:rPr>
-              <w:t xml:space="preserve">+7,2</w:t>
+              <w:t xml:space="preserve">Tenencia del BCRA, % del PIB: valor de libros</w:t>
+            </w:r>
+          </w:p>
+        </w:tc>
+        <w:tc>
+          <w:tcPr/>
+          <w:p>
+            <w:pPr>
+              <w:pStyle w:val="Compact"/>
+            </w:pPr>
+            <w:r>
+              <w:rPr>
+                <w:rFonts w:ascii="Calibri" w:hAnsi="Calibri"/>
+                <w:sz w:val="20"/>
+              </w:rPr>
+              <w:t xml:space="preserve">48,6</w:t>
+            </w:r>
+          </w:p>
+        </w:tc>
+        <w:tc>
+          <w:tcPr/>
+          <w:p>
+            <w:pPr>
+              <w:pStyle w:val="Compact"/>
+            </w:pPr>
+            <w:r>
+              <w:rPr>
+                <w:rFonts w:ascii="Calibri" w:hAnsi="Calibri"/>
+                <w:sz w:val="20"/>
+              </w:rPr>
+              <w:t xml:space="preserve">13,2</w:t>
+            </w:r>
+          </w:p>
+        </w:tc>
+      </w:tr>
+      <w:tr>
+        <w:tc>
+          <w:tcPr/>
+          <w:p>
+            <w:pPr>
+              <w:pStyle w:val="Compact"/>
+            </w:pPr>
+            <w:r>
+              <w:rPr>
+                <w:rFonts w:ascii="Calibri" w:hAnsi="Calibri"/>
+                <w:sz w:val="20"/>
+              </w:rPr>
+              <w:t xml:space="preserve">Tenencia del BCRA, % del PIB: nominal piso</w:t>
+            </w:r>
+          </w:p>
+        </w:tc>
+        <w:tc>
+          <w:tcPr/>
+          <w:p>
+            <w:pPr>
+              <w:pStyle w:val="Compact"/>
+            </w:pPr>
+            <w:r>
+              <w:rPr>
+                <w:rFonts w:ascii="Calibri" w:hAnsi="Calibri"/>
+                <w:sz w:val="20"/>
+              </w:rPr>
+              <w:t xml:space="preserve">48,6</w:t>
+            </w:r>
+          </w:p>
+        </w:tc>
+        <w:tc>
+          <w:tcPr/>
+          <w:p>
+            <w:pPr>
+              <w:pStyle w:val="Compact"/>
+            </w:pPr>
+            <w:r>
+              <w:rPr>
+                <w:rFonts w:ascii="Calibri" w:hAnsi="Calibri"/>
+                <w:sz w:val="20"/>
+              </w:rPr>
+              <w:t xml:space="preserve">20,4</w:t>
             </w:r>
           </w:p>
         </w:tc>
@@ -8063,7 +8844,7 @@
         <w:pStyle w:val="BodyText"/>
       </w:pPr>
       <w:r>
-        <w:t xml:space="preserve">En 2023 la columna contable de moneda extranjera incluye otros títulos en dólares, por lo que supera al nominal de las Letras. En 2024, en cambio, el nominal de las Letras (69,3 mil millones de USD) supera en 40,7 mil millones de USD (7,2 puntos del PIB) a toda la tenencia del BCRA en moneda extranjera que registra el Balance. Eso confirma que el valor contable subestima la tenencia en 2024 por al menos esa magnitud (ver 5.9.3).</w:t>
+        <w:t xml:space="preserve">En 2023 la columna contable de moneda extranjera incluye otros créditos en dólares, por lo que supera al nominal de las Letras, y el piso conserva el valor de libros. Es la razón de que la variante estricta empeore 2023 (128,2). En 2024 el nominal de las Letras supera en 40,7 mil millones de USD a toda la tenencia en moneda extranjera que registra el Balance, y la tenencia sube 7,2 puntos del PIB. Eso confirma que el valor contable subestima la tenencia en 2024.</w:t>
       </w:r>
     </w:p>
     <w:bookmarkEnd w:id="75"/>
@@ -8135,7 +8916,7 @@
         <w:t xml:space="preserve"> </w:t>
       </w:r>
       <w:r>
-        <w:t xml:space="preserve">Se resta de la deuda del Tesoro la parte cuyo acreedor es otra entidad pública (el FGS-ANSES, organismos de la seguridad social, bancos públicos). Es un concepto de deuda consolidada del sector público en sentido amplio. El FMI (2025, Annex II, Table 2) lo aplica en la línea 3,</w:t>
+        <w:t xml:space="preserve">Se resta de la deuda del Tesoro la parte cuyo acreedor es otra entidad pública (el FGS-ANSES, organismos de la seguridad social, bancos públicos). El FMI (2025, Annex II, Table 2) lo aplica en la línea 3,</w:t>
       </w:r>
       <w:r>
         <w:t xml:space="preserve"> </w:t>
@@ -8152,7 +8933,7 @@
         <w:pStyle w:val="FirstParagraph"/>
       </w:pPr>
       <w:r>
-        <w:t xml:space="preserve">Con el FMI (2021) en la mano, nuestra serie netea el BCRA pero</w:t>
+        <w:t xml:space="preserve">Nuestra serie netea el BCRA, ahora a valor nominal, pero</w:t>
       </w:r>
       <w:r>
         <w:t xml:space="preserve"> </w:t>
@@ -8213,7 +8994,7 @@
         <w:t xml:space="preserve"> </w:t>
       </w:r>
       <w:r>
-        <w:t xml:space="preserve">son páginas HTML de bloqueo de 880 bytes, no el documento. Ninguna cifra del FGS está en el CSV (</w:t>
+        <w:t xml:space="preserve">son páginas HTML de bloqueo de 880 bytes, no el documento. Ninguna cifra del FGS está en los CSV (</w:t>
       </w:r>
       <w:r>
         <w:rPr>
@@ -8269,7 +9050,7 @@
         <w:t xml:space="preserve"> </w:t>
       </w:r>
       <w:r>
-        <w:t xml:space="preserve">El FMI resta 62,5 puntos del PIB en 2023 y 33,9 en 2024 por tenencias del BCRA y del FGS. Nosotros restamos 48,6 y 13,2 (solo BCRA). La diferencia es 13,9 y 20,7 puntos, y se traslada uno a uno a la deuda neta: nuestra serie está por encima de la del FMI en 8,2 y 16,8 puntos (tabla 5.8.2), una vez compensadas las diferencias menores de bruta y pasivos.</w:t>
+        <w:t xml:space="preserve">El FMI resta 62,5 puntos del PIB en 2023 y 33,9 en 2024 por tenencias del BCRA y del FGS. Nosotros restamos 48,6 y 20,4 (solo BCRA, nominal). La diferencia es 13,9 y 13,5 puntos, y se traslada a la deuda neta: nuestra serie está por encima de la del FMI en 8,2 y 9,6 puntos (tabla 5.8.2), una vez compensadas las diferencias menores de bruta y pasivos.</w:t>
       </w:r>
     </w:p>
     <w:p>
@@ -8291,7 +9072,7 @@
         <w:t xml:space="preserve"> </w:t>
       </w:r>
       <w:r>
-        <w:t xml:space="preserve">Según 5.8.4, en 2024 al menos 7,2 puntos de la brecha de 20,7 se deben a que el BCRA registra las Letras Intransferibles a costo amortizado (desde el 7 de mayo de 2024, Res. 128/24, según el script) en vez de a valor nominal, que es el que usa el FMI. El resto (13,5 puntos en 2024 y la totalidad de los 13,9 de 2023) es un residuo que incluye al FGS, a otros tenedores públicos y a diferencias de cobertura.</w:t>
+        <w:t xml:space="preserve">Con la tenencia del BCRA a valor nominal, la valuación deja de ser una fuente de brecha en 2024: la brecha de la neta pasa de 16,8 a 9,6 puntos. Lo que resta (13,9 puntos en 2023 y 13,5 en 2024 en la línea 3) es un residuo que incluye al FGS, a otros tenedores públicos y a diferencias de cobertura.</w:t>
       </w:r>
       <w:r>
         <w:t xml:space="preserve"> </w:t>
@@ -8303,6 +9084,12 @@
         </w:rPr>
         <w:t xml:space="preserve">No se puede asignar entre ellos con los datos disponibles.</w:t>
       </w:r>
+      <w:r>
+        <w:t xml:space="preserve"> </w:t>
+      </w:r>
+      <w:r>
+        <w:t xml:space="preserve">La estabilidad de ese residuo entre 2023 y 2024 (13,9 y 13,5) es compatible con un componente de nivel relativamente constante, aunque con dos observaciones no es una prueba.</w:t>
+      </w:r>
     </w:p>
     <w:p>
       <w:pPr>
@@ -8348,7 +9135,7 @@
         <w:t xml:space="preserve">comparable_fmi = 1</w:t>
       </w:r>
       <w:r>
-        <w:t xml:space="preserve">). Para ese tramo, sin embargo, no hay cifra del FMI con la que contrastar.</w:t>
+        <w:t xml:space="preserve">). Para ese tramo no hay cifra del FMI con la que contrastar.</w:t>
       </w:r>
     </w:p>
     <w:p>
@@ -8465,22 +9252,22 @@
                 <w:rFonts w:ascii="Calibri" w:hAnsi="Calibri"/>
                 <w:sz w:val="20"/>
               </w:rPr>
-              <w:t xml:space="preserve">Letras Intransferibles a valor contable en vez de nominal (desde 2019 y sobre todo desde 2024)</w:t>
-            </w:r>
-          </w:p>
-        </w:tc>
-        <w:tc>
-          <w:tcPr/>
-          <w:p>
-            <w:pPr>
-              <w:pStyle w:val="Compact"/>
-            </w:pPr>
-            <w:r>
-              <w:rPr>
-                <w:rFonts w:ascii="Calibri" w:hAnsi="Calibri"/>
-                <w:sz w:val="20"/>
-              </w:rPr>
-              <w:t xml:space="preserve">Sobreestima</w:t>
+              <w:t xml:space="preserve">Letras Intransferibles interpoladas o reconstruidas entre anclas (24 y 32 trimestres)</w:t>
+            </w:r>
+          </w:p>
+        </w:tc>
+        <w:tc>
+          <w:tcPr/>
+          <w:p>
+            <w:pPr>
+              <w:pStyle w:val="Compact"/>
+            </w:pPr>
+            <w:r>
+              <w:rPr>
+                <w:rFonts w:ascii="Calibri" w:hAnsi="Calibri"/>
+                <w:sz w:val="20"/>
+              </w:rPr>
+              <w:t xml:space="preserve">Ruido sin signo definido</w:t>
             </w:r>
           </w:p>
         </w:tc>
@@ -8497,22 +9284,22 @@
                 <w:rFonts w:ascii="Calibri" w:hAnsi="Calibri"/>
                 <w:sz w:val="20"/>
               </w:rPr>
-              <w:t xml:space="preserve">Swap con el PBoC activado omitido (desde 2020)</w:t>
-            </w:r>
-          </w:p>
-        </w:tc>
-        <w:tc>
-          <w:tcPr/>
-          <w:p>
-            <w:pPr>
-              <w:pStyle w:val="Compact"/>
-            </w:pPr>
-            <w:r>
-              <w:rPr>
-                <w:rFonts w:ascii="Calibri" w:hAnsi="Calibri"/>
-                <w:sz w:val="20"/>
-              </w:rPr>
-              <w:t xml:space="preserve">Subestima</w:t>
+              <w:t xml:space="preserve">Trimestres sin dato nominal (hasta 2005T4), con valor de libros</w:t>
+            </w:r>
+          </w:p>
+        </w:tc>
+        <w:tc>
+          <w:tcPr/>
+          <w:p>
+            <w:pPr>
+              <w:pStyle w:val="Compact"/>
+            </w:pPr>
+            <w:r>
+              <w:rPr>
+                <w:rFonts w:ascii="Calibri" w:hAnsi="Calibri"/>
+                <w:sz w:val="20"/>
+              </w:rPr>
+              <w:t xml:space="preserve">Sin efecto relevante, las Letras no existían</w:t>
             </w:r>
           </w:p>
         </w:tc>
@@ -8529,7 +9316,7 @@
                 <w:rFonts w:ascii="Calibri" w:hAnsi="Calibri"/>
                 <w:sz w:val="20"/>
               </w:rPr>
-              <w:t xml:space="preserve">Pases en neto, con trimestres negativos (2024T3-2025T1)</w:t>
+              <w:t xml:space="preserve">Swap con el PBoC activado omitido (desde 2020)</w:t>
             </w:r>
           </w:p>
         </w:tc>
@@ -8561,6 +9348,38 @@
                 <w:rFonts w:ascii="Calibri" w:hAnsi="Calibri"/>
                 <w:sz w:val="20"/>
               </w:rPr>
+              <w:t xml:space="preserve">Pases en neto, con trimestres negativos (2024T3-2025T1)</w:t>
+            </w:r>
+          </w:p>
+        </w:tc>
+        <w:tc>
+          <w:tcPr/>
+          <w:p>
+            <w:pPr>
+              <w:pStyle w:val="Compact"/>
+            </w:pPr>
+            <w:r>
+              <w:rPr>
+                <w:rFonts w:ascii="Calibri" w:hAnsi="Calibri"/>
+                <w:sz w:val="20"/>
+              </w:rPr>
+              <w:t xml:space="preserve">Subestima</w:t>
+            </w:r>
+          </w:p>
+        </w:tc>
+      </w:tr>
+      <w:tr>
+        <w:tc>
+          <w:tcPr/>
+          <w:p>
+            <w:pPr>
+              <w:pStyle w:val="Compact"/>
+            </w:pPr>
+            <w:r>
+              <w:rPr>
+                <w:rFonts w:ascii="Calibri" w:hAnsi="Calibri"/>
+                <w:sz w:val="20"/>
+              </w:rPr>
               <w:t xml:space="preserve">Bruta del MECON excluye intereses capitalizados,</w:t>
             </w:r>
             <w:r>
@@ -8617,7 +9436,7 @@
         <w:pStyle w:val="BodyText"/>
       </w:pPr>
       <w:r>
-        <w:t xml:space="preserve">El balance de las fuentes es una sobreestimación en 2023 y 2024 y probablemente en todo 2007-2025, de entre 8 y 17 puntos del PIB en esos dos años de control.</w:t>
+        <w:t xml:space="preserve">El balance de las fuentes es una sobreestimación en 2023 y 2024 y probablemente en todo 2007-2025, de entre 8 y 10 puntos del PIB en esos dos años de control.</w:t>
       </w:r>
     </w:p>
     <w:bookmarkEnd w:id="79"/>
@@ -8645,7 +9464,7 @@
           <w:b/>
           <w:bCs/>
         </w:rPr>
-        <w:t xml:space="preserve">deuda neta consolidada con el BCRA, sin neteo del FGS</w:t>
+        <w:t xml:space="preserve">deuda neta consolidada con el BCRA, a valor nominal, sin neteo del FGS</w:t>
       </w:r>
       <w:r>
         <w:t xml:space="preserve">, y no como</w:t>
@@ -8657,16 +9476,31 @@
         <w:t xml:space="preserve">“la deuda neta del FMI”</w:t>
       </w:r>
       <w:r>
-        <w:t xml:space="preserve">. En el modelo entra rezagada y cumple una función de retroalimentación, de modo que la corrección de nivel no cambia la dinámica si la brecha es aproximadamente estable. Esa condición no se cumple entre 2023 y 2024, años en que la brecha pasa de 14 a 21 puntos. El sistema se estima con la deuda bruta como serie de contraste (</w:t>
+        <w:t xml:space="preserve">. En el modelo entra rezagada y cumple una función de retroalimentación, de modo que la corrección de nivel no cambia la dinámica si la brecha es aproximadamente estable. Con la valuación nominal la brecha pasa de 8,2 a 9,6 puntos entre 2023 y 2024, una variación de 1,4 puntos, frente a los 8,6 puntos (de 8,2 a 16,8) que tenía con valor de libros. La condición de brecha estable se cumple mucho mejor que antes. El sistema se estima además con la deuda neta a valor de libros y con la deuda bruta como series de contraste (</w:t>
       </w:r>
       <w:r>
         <w:rPr>
           <w:rStyle w:val="VerbatimChar"/>
         </w:rPr>
+        <w:t xml:space="preserve">deuda_consolidada_neta_1996_2025.csv</w:t>
+      </w:r>
+      <w:r>
+        <w:t xml:space="preserve"> </w:t>
+      </w:r>
+      <w:r>
+        <w:t xml:space="preserve">y</w:t>
+      </w:r>
+      <w:r>
+        <w:t xml:space="preserve"> </w:t>
+      </w:r>
+      <w:r>
+        <w:rPr>
+          <w:rStyle w:val="VerbatimChar"/>
+        </w:rPr>
         <w:t xml:space="preserve">deuda_consolidada_1996_2025.csv</w:t>
       </w:r>
       <w:r>
-        <w:t xml:space="preserve">), que es homogénea y verificable en todo el período, de modo que la conclusión pueda evaluarse con ambas medidas. El cierre de la brecha exige tres insumos: las series de tenencias del FGS en ANSES (descarga manual), el stock nominal de Letras Intransferibles y adelantos por tenedor (MECON) y el saldo del swap activado (estados contables del BCRA).</w:t>
+        <w:t xml:space="preserve">), de modo que la conclusión pueda evaluarse con tres medidas. El cierre de la brecha restante exige dos insumos: las series de tenencias del FGS en ANSES (descarga manual) y el saldo del swap activado (estados contables del BCRA).</w:t>
       </w:r>
     </w:p>
     <w:bookmarkEnd w:id="80"/>
@@ -8685,7 +9519,19 @@
         <w:pStyle w:val="FirstParagraph"/>
       </w:pPr>
       <w:r>
-        <w:t xml:space="preserve">Muestra 1996T1-2025T4. El crecimiento y la variación de la Fed pierden una observación por la primera diferencia. Las variables en niveles del sistema de estimación son las filas 1, 6 a 9 y 11.</w:t>
+        <w:t xml:space="preserve">Muestra 1996T1-2025T4 (120 trimestres). El crecimiento y la variación de la Fed pierden una observación por la primera diferencia; la muestra efectiva del sistema son 117 trimestres (1996T4-2025T4). Las variables del sistema de estimación son las filas 1, 6 y 8 a 12 (el resultado primario en su versión</w:t>
+      </w:r>
+      <w:r>
+        <w:t xml:space="preserve"> </w:t>
+      </w:r>
+      <w:r>
+        <w:rPr>
+          <w:rStyle w:val="VerbatimChar"/>
+        </w:rPr>
+        <w:t xml:space="preserve">pb_pib_trim</w:t>
+      </w:r>
+      <w:r>
+        <w:t xml:space="preserve">).</w:t>
       </w:r>
     </w:p>
     <w:tbl>
@@ -8818,37 +9664,37 @@
                 <w:rFonts w:ascii="Calibri" w:hAnsi="Calibri"/>
                 <w:sz w:val="20"/>
               </w:rPr>
-              <w:t xml:space="preserve">Deuda consolidada neta (% PIB)</w:t>
-            </w:r>
-          </w:p>
-        </w:tc>
-        <w:tc>
-          <w:tcPr/>
-          <w:p>
-            <w:pPr>
-              <w:pStyle w:val="Compact"/>
-            </w:pPr>
-            <w:r>
-              <w:rPr>
-                <w:rFonts w:ascii="Calibri" w:hAnsi="Calibri"/>
-                <w:sz w:val="20"/>
-              </w:rPr>
-              <w:t xml:space="preserve">56,55</w:t>
-            </w:r>
-          </w:p>
-        </w:tc>
-        <w:tc>
-          <w:tcPr/>
-          <w:p>
-            <w:pPr>
-              <w:pStyle w:val="Compact"/>
-            </w:pPr>
-            <w:r>
-              <w:rPr>
-                <w:rFonts w:ascii="Calibri" w:hAnsi="Calibri"/>
-                <w:sz w:val="20"/>
-              </w:rPr>
-              <w:t xml:space="preserve">27,15</w:t>
+              <w:t xml:space="preserve">Deuda consolidada neta, nominal piso (% PIB)</w:t>
+            </w:r>
+          </w:p>
+        </w:tc>
+        <w:tc>
+          <w:tcPr/>
+          <w:p>
+            <w:pPr>
+              <w:pStyle w:val="Compact"/>
+            </w:pPr>
+            <w:r>
+              <w:rPr>
+                <w:rFonts w:ascii="Calibri" w:hAnsi="Calibri"/>
+                <w:sz w:val="20"/>
+              </w:rPr>
+              <w:t xml:space="preserve">55,97</w:t>
+            </w:r>
+          </w:p>
+        </w:tc>
+        <w:tc>
+          <w:tcPr/>
+          <w:p>
+            <w:pPr>
+              <w:pStyle w:val="Compact"/>
+            </w:pPr>
+            <w:r>
+              <w:rPr>
+                <w:rFonts w:ascii="Calibri" w:hAnsi="Calibri"/>
+                <w:sz w:val="20"/>
+              </w:rPr>
+              <w:t xml:space="preserve">26,89</w:t>
             </w:r>
           </w:p>
         </w:tc>
@@ -8910,67 +9756,67 @@
                 <w:rFonts w:ascii="Calibri" w:hAnsi="Calibri"/>
                 <w:sz w:val="20"/>
               </w:rPr>
-              <w:t xml:space="preserve">Deuda federal bruta (% PIB)</w:t>
-            </w:r>
-          </w:p>
-        </w:tc>
-        <w:tc>
-          <w:tcPr/>
-          <w:p>
-            <w:pPr>
-              <w:pStyle w:val="Compact"/>
-            </w:pPr>
-            <w:r>
-              <w:rPr>
-                <w:rFonts w:ascii="Calibri" w:hAnsi="Calibri"/>
-                <w:sz w:val="20"/>
-              </w:rPr>
-              <w:t xml:space="preserve">64,37</w:t>
-            </w:r>
-          </w:p>
-        </w:tc>
-        <w:tc>
-          <w:tcPr/>
-          <w:p>
-            <w:pPr>
-              <w:pStyle w:val="Compact"/>
-            </w:pPr>
-            <w:r>
-              <w:rPr>
-                <w:rFonts w:ascii="Calibri" w:hAnsi="Calibri"/>
-                <w:sz w:val="20"/>
-              </w:rPr>
-              <w:t xml:space="preserve">31,45</w:t>
-            </w:r>
-          </w:p>
-        </w:tc>
-        <w:tc>
-          <w:tcPr/>
-          <w:p>
-            <w:pPr>
-              <w:pStyle w:val="Compact"/>
-            </w:pPr>
-            <w:r>
-              <w:rPr>
-                <w:rFonts w:ascii="Calibri" w:hAnsi="Calibri"/>
-                <w:sz w:val="20"/>
-              </w:rPr>
-              <w:t xml:space="preserve">31,86</w:t>
-            </w:r>
-          </w:p>
-        </w:tc>
-        <w:tc>
-          <w:tcPr/>
-          <w:p>
-            <w:pPr>
-              <w:pStyle w:val="Compact"/>
-            </w:pPr>
-            <w:r>
-              <w:rPr>
-                <w:rFonts w:ascii="Calibri" w:hAnsi="Calibri"/>
-                <w:sz w:val="20"/>
-              </w:rPr>
-              <w:t xml:space="preserve">154,59</w:t>
+              <w:t xml:space="preserve">Deuda consolidada neta, valor de libros (% PIB)</w:t>
+            </w:r>
+          </w:p>
+        </w:tc>
+        <w:tc>
+          <w:tcPr/>
+          <w:p>
+            <w:pPr>
+              <w:pStyle w:val="Compact"/>
+            </w:pPr>
+            <w:r>
+              <w:rPr>
+                <w:rFonts w:ascii="Calibri" w:hAnsi="Calibri"/>
+                <w:sz w:val="20"/>
+              </w:rPr>
+              <w:t xml:space="preserve">56,55</w:t>
+            </w:r>
+          </w:p>
+        </w:tc>
+        <w:tc>
+          <w:tcPr/>
+          <w:p>
+            <w:pPr>
+              <w:pStyle w:val="Compact"/>
+            </w:pPr>
+            <w:r>
+              <w:rPr>
+                <w:rFonts w:ascii="Calibri" w:hAnsi="Calibri"/>
+                <w:sz w:val="20"/>
+              </w:rPr>
+              <w:t xml:space="preserve">27,15</w:t>
+            </w:r>
+          </w:p>
+        </w:tc>
+        <w:tc>
+          <w:tcPr/>
+          <w:p>
+            <w:pPr>
+              <w:pStyle w:val="Compact"/>
+            </w:pPr>
+            <w:r>
+              <w:rPr>
+                <w:rFonts w:ascii="Calibri" w:hAnsi="Calibri"/>
+                <w:sz w:val="20"/>
+              </w:rPr>
+              <w:t xml:space="preserve">26,13</w:t>
+            </w:r>
+          </w:p>
+        </w:tc>
+        <w:tc>
+          <w:tcPr/>
+          <w:p>
+            <w:pPr>
+              <w:pStyle w:val="Compact"/>
+            </w:pPr>
+            <w:r>
+              <w:rPr>
+                <w:rFonts w:ascii="Calibri" w:hAnsi="Calibri"/>
+                <w:sz w:val="20"/>
+              </w:rPr>
+              <w:t xml:space="preserve">136,60</w:t>
             </w:r>
           </w:p>
         </w:tc>
@@ -9002,67 +9848,67 @@
                 <w:rFonts w:ascii="Calibri" w:hAnsi="Calibri"/>
                 <w:sz w:val="20"/>
               </w:rPr>
-              <w:t xml:space="preserve">Tenencia del BCRA de deuda del Tesoro (% PIB)</w:t>
-            </w:r>
-          </w:p>
-        </w:tc>
-        <w:tc>
-          <w:tcPr/>
-          <w:p>
-            <w:pPr>
-              <w:pStyle w:val="Compact"/>
-            </w:pPr>
-            <w:r>
-              <w:rPr>
-                <w:rFonts w:ascii="Calibri" w:hAnsi="Calibri"/>
-                <w:sz w:val="20"/>
-              </w:rPr>
-              <w:t xml:space="preserve">12,40</w:t>
-            </w:r>
-          </w:p>
-        </w:tc>
-        <w:tc>
-          <w:tcPr/>
-          <w:p>
-            <w:pPr>
-              <w:pStyle w:val="Compact"/>
-            </w:pPr>
-            <w:r>
-              <w:rPr>
-                <w:rFonts w:ascii="Calibri" w:hAnsi="Calibri"/>
-                <w:sz w:val="20"/>
-              </w:rPr>
-              <w:t xml:space="preserve">7,77</w:t>
-            </w:r>
-          </w:p>
-        </w:tc>
-        <w:tc>
-          <w:tcPr/>
-          <w:p>
-            <w:pPr>
-              <w:pStyle w:val="Compact"/>
-            </w:pPr>
-            <w:r>
-              <w:rPr>
-                <w:rFonts w:ascii="Calibri" w:hAnsi="Calibri"/>
-                <w:sz w:val="20"/>
-              </w:rPr>
-              <w:t xml:space="preserve">1,82</w:t>
-            </w:r>
-          </w:p>
-        </w:tc>
-        <w:tc>
-          <w:tcPr/>
-          <w:p>
-            <w:pPr>
-              <w:pStyle w:val="Compact"/>
-            </w:pPr>
-            <w:r>
-              <w:rPr>
-                <w:rFonts w:ascii="Calibri" w:hAnsi="Calibri"/>
-                <w:sz w:val="20"/>
-              </w:rPr>
-              <w:t xml:space="preserve">48,57</w:t>
+              <w:t xml:space="preserve">Deuda federal bruta (% PIB)</w:t>
+            </w:r>
+          </w:p>
+        </w:tc>
+        <w:tc>
+          <w:tcPr/>
+          <w:p>
+            <w:pPr>
+              <w:pStyle w:val="Compact"/>
+            </w:pPr>
+            <w:r>
+              <w:rPr>
+                <w:rFonts w:ascii="Calibri" w:hAnsi="Calibri"/>
+                <w:sz w:val="20"/>
+              </w:rPr>
+              <w:t xml:space="preserve">64,37</w:t>
+            </w:r>
+          </w:p>
+        </w:tc>
+        <w:tc>
+          <w:tcPr/>
+          <w:p>
+            <w:pPr>
+              <w:pStyle w:val="Compact"/>
+            </w:pPr>
+            <w:r>
+              <w:rPr>
+                <w:rFonts w:ascii="Calibri" w:hAnsi="Calibri"/>
+                <w:sz w:val="20"/>
+              </w:rPr>
+              <w:t xml:space="preserve">31,45</w:t>
+            </w:r>
+          </w:p>
+        </w:tc>
+        <w:tc>
+          <w:tcPr/>
+          <w:p>
+            <w:pPr>
+              <w:pStyle w:val="Compact"/>
+            </w:pPr>
+            <w:r>
+              <w:rPr>
+                <w:rFonts w:ascii="Calibri" w:hAnsi="Calibri"/>
+                <w:sz w:val="20"/>
+              </w:rPr>
+              <w:t xml:space="preserve">31,86</w:t>
+            </w:r>
+          </w:p>
+        </w:tc>
+        <w:tc>
+          <w:tcPr/>
+          <w:p>
+            <w:pPr>
+              <w:pStyle w:val="Compact"/>
+            </w:pPr>
+            <w:r>
+              <w:rPr>
+                <w:rFonts w:ascii="Calibri" w:hAnsi="Calibri"/>
+                <w:sz w:val="20"/>
+              </w:rPr>
+              <w:t xml:space="preserve">154,59</w:t>
             </w:r>
           </w:p>
         </w:tc>
@@ -9094,67 +9940,67 @@
                 <w:rFonts w:ascii="Calibri" w:hAnsi="Calibri"/>
                 <w:sz w:val="20"/>
               </w:rPr>
-              <w:t xml:space="preserve">Pasivos remunerados del BCRA (% PIB)</w:t>
-            </w:r>
-          </w:p>
-        </w:tc>
-        <w:tc>
-          <w:tcPr/>
-          <w:p>
-            <w:pPr>
-              <w:pStyle w:val="Compact"/>
-            </w:pPr>
-            <w:r>
-              <w:rPr>
-                <w:rFonts w:ascii="Calibri" w:hAnsi="Calibri"/>
-                <w:sz w:val="20"/>
-              </w:rPr>
-              <w:t xml:space="preserve">5,22</w:t>
-            </w:r>
-          </w:p>
-        </w:tc>
-        <w:tc>
-          <w:tcPr/>
-          <w:p>
-            <w:pPr>
-              <w:pStyle w:val="Compact"/>
-            </w:pPr>
-            <w:r>
-              <w:rPr>
-                <w:rFonts w:ascii="Calibri" w:hAnsi="Calibri"/>
-                <w:sz w:val="20"/>
-              </w:rPr>
-              <w:t xml:space="preserve">3,53</w:t>
-            </w:r>
-          </w:p>
-        </w:tc>
-        <w:tc>
-          <w:tcPr/>
-          <w:p>
-            <w:pPr>
-              <w:pStyle w:val="Compact"/>
-            </w:pPr>
-            <w:r>
-              <w:rPr>
-                <w:rFonts w:ascii="Calibri" w:hAnsi="Calibri"/>
-                <w:sz w:val="20"/>
-              </w:rPr>
-              <w:t xml:space="preserve">−2,29</w:t>
-            </w:r>
-          </w:p>
-        </w:tc>
-        <w:tc>
-          <w:tcPr/>
-          <w:p>
-            <w:pPr>
-              <w:pStyle w:val="Compact"/>
-            </w:pPr>
-            <w:r>
-              <w:rPr>
-                <w:rFonts w:ascii="Calibri" w:hAnsi="Calibri"/>
-                <w:sz w:val="20"/>
-              </w:rPr>
-              <w:t xml:space="preserve">14,58</w:t>
+              <w:t xml:space="preserve">Tenencia del BCRA de deuda del Tesoro, nominal piso (% PIB)</w:t>
+            </w:r>
+          </w:p>
+        </w:tc>
+        <w:tc>
+          <w:tcPr/>
+          <w:p>
+            <w:pPr>
+              <w:pStyle w:val="Compact"/>
+            </w:pPr>
+            <w:r>
+              <w:rPr>
+                <w:rFonts w:ascii="Calibri" w:hAnsi="Calibri"/>
+                <w:sz w:val="20"/>
+              </w:rPr>
+              <w:t xml:space="preserve">12,98</w:t>
+            </w:r>
+          </w:p>
+        </w:tc>
+        <w:tc>
+          <w:tcPr/>
+          <w:p>
+            <w:pPr>
+              <w:pStyle w:val="Compact"/>
+            </w:pPr>
+            <w:r>
+              <w:rPr>
+                <w:rFonts w:ascii="Calibri" w:hAnsi="Calibri"/>
+                <w:sz w:val="20"/>
+              </w:rPr>
+              <w:t xml:space="preserve">8,07</w:t>
+            </w:r>
+          </w:p>
+        </w:tc>
+        <w:tc>
+          <w:tcPr/>
+          <w:p>
+            <w:pPr>
+              <w:pStyle w:val="Compact"/>
+            </w:pPr>
+            <w:r>
+              <w:rPr>
+                <w:rFonts w:ascii="Calibri" w:hAnsi="Calibri"/>
+                <w:sz w:val="20"/>
+              </w:rPr>
+              <w:t xml:space="preserve">1,82</w:t>
+            </w:r>
+          </w:p>
+        </w:tc>
+        <w:tc>
+          <w:tcPr/>
+          <w:p>
+            <w:pPr>
+              <w:pStyle w:val="Compact"/>
+            </w:pPr>
+            <w:r>
+              <w:rPr>
+                <w:rFonts w:ascii="Calibri" w:hAnsi="Calibri"/>
+                <w:sz w:val="20"/>
+              </w:rPr>
+              <w:t xml:space="preserve">48,57</w:t>
             </w:r>
           </w:p>
         </w:tc>
@@ -9186,67 +10032,67 @@
                 <w:rFonts w:ascii="Calibri" w:hAnsi="Calibri"/>
                 <w:sz w:val="20"/>
               </w:rPr>
-              <w:t xml:space="preserve">Depósitos del Tesoro en el BCRA (% PIB)</w:t>
-            </w:r>
-          </w:p>
-        </w:tc>
-        <w:tc>
-          <w:tcPr/>
-          <w:p>
-            <w:pPr>
-              <w:pStyle w:val="Compact"/>
-            </w:pPr>
-            <w:r>
-              <w:rPr>
-                <w:rFonts w:ascii="Calibri" w:hAnsi="Calibri"/>
-                <w:sz w:val="20"/>
-              </w:rPr>
-              <w:t xml:space="preserve">0,64</w:t>
-            </w:r>
-          </w:p>
-        </w:tc>
-        <w:tc>
-          <w:tcPr/>
-          <w:p>
-            <w:pPr>
-              <w:pStyle w:val="Compact"/>
-            </w:pPr>
-            <w:r>
-              <w:rPr>
-                <w:rFonts w:ascii="Calibri" w:hAnsi="Calibri"/>
-                <w:sz w:val="20"/>
-              </w:rPr>
-              <w:t xml:space="preserve">0,77</w:t>
-            </w:r>
-          </w:p>
-        </w:tc>
-        <w:tc>
-          <w:tcPr/>
-          <w:p>
-            <w:pPr>
-              <w:pStyle w:val="Compact"/>
-            </w:pPr>
-            <w:r>
-              <w:rPr>
-                <w:rFonts w:ascii="Calibri" w:hAnsi="Calibri"/>
-                <w:sz w:val="20"/>
-              </w:rPr>
-              <w:t xml:space="preserve">0,01</w:t>
-            </w:r>
-          </w:p>
-        </w:tc>
-        <w:tc>
-          <w:tcPr/>
-          <w:p>
-            <w:pPr>
-              <w:pStyle w:val="Compact"/>
-            </w:pPr>
-            <w:r>
-              <w:rPr>
-                <w:rFonts w:ascii="Calibri" w:hAnsi="Calibri"/>
-                <w:sz w:val="20"/>
-              </w:rPr>
-              <w:t xml:space="preserve">3,74</w:t>
+              <w:t xml:space="preserve">Pasivos remunerados del BCRA (% PIB)</w:t>
+            </w:r>
+          </w:p>
+        </w:tc>
+        <w:tc>
+          <w:tcPr/>
+          <w:p>
+            <w:pPr>
+              <w:pStyle w:val="Compact"/>
+            </w:pPr>
+            <w:r>
+              <w:rPr>
+                <w:rFonts w:ascii="Calibri" w:hAnsi="Calibri"/>
+                <w:sz w:val="20"/>
+              </w:rPr>
+              <w:t xml:space="preserve">5,22</w:t>
+            </w:r>
+          </w:p>
+        </w:tc>
+        <w:tc>
+          <w:tcPr/>
+          <w:p>
+            <w:pPr>
+              <w:pStyle w:val="Compact"/>
+            </w:pPr>
+            <w:r>
+              <w:rPr>
+                <w:rFonts w:ascii="Calibri" w:hAnsi="Calibri"/>
+                <w:sz w:val="20"/>
+              </w:rPr>
+              <w:t xml:space="preserve">3,53</w:t>
+            </w:r>
+          </w:p>
+        </w:tc>
+        <w:tc>
+          <w:tcPr/>
+          <w:p>
+            <w:pPr>
+              <w:pStyle w:val="Compact"/>
+            </w:pPr>
+            <w:r>
+              <w:rPr>
+                <w:rFonts w:ascii="Calibri" w:hAnsi="Calibri"/>
+                <w:sz w:val="20"/>
+              </w:rPr>
+              <w:t xml:space="preserve">−2,29</w:t>
+            </w:r>
+          </w:p>
+        </w:tc>
+        <w:tc>
+          <w:tcPr/>
+          <w:p>
+            <w:pPr>
+              <w:pStyle w:val="Compact"/>
+            </w:pPr>
+            <w:r>
+              <w:rPr>
+                <w:rFonts w:ascii="Calibri" w:hAnsi="Calibri"/>
+                <w:sz w:val="20"/>
+              </w:rPr>
+              <w:t xml:space="preserve">14,58</w:t>
             </w:r>
           </w:p>
         </w:tc>
@@ -9278,67 +10124,96 @@
                 <w:rFonts w:ascii="Calibri" w:hAnsi="Calibri"/>
                 <w:sz w:val="20"/>
               </w:rPr>
-              <w:t xml:space="preserve">Resultado primario (% PIB)</w:t>
-            </w:r>
-          </w:p>
-        </w:tc>
-        <w:tc>
-          <w:tcPr/>
-          <w:p>
-            <w:pPr>
-              <w:pStyle w:val="Compact"/>
-            </w:pPr>
-            <w:r>
-              <w:rPr>
-                <w:rFonts w:ascii="Calibri" w:hAnsi="Calibri"/>
-                <w:sz w:val="20"/>
-              </w:rPr>
-              <w:t xml:space="preserve">−0,27</w:t>
-            </w:r>
-          </w:p>
-        </w:tc>
-        <w:tc>
-          <w:tcPr/>
-          <w:p>
-            <w:pPr>
-              <w:pStyle w:val="Compact"/>
-            </w:pPr>
-            <w:r>
-              <w:rPr>
-                <w:rFonts w:ascii="Calibri" w:hAnsi="Calibri"/>
-                <w:sz w:val="20"/>
-              </w:rPr>
-              <w:t xml:space="preserve">1,73</w:t>
-            </w:r>
-          </w:p>
-        </w:tc>
-        <w:tc>
-          <w:tcPr/>
-          <w:p>
-            <w:pPr>
-              <w:pStyle w:val="Compact"/>
-            </w:pPr>
-            <w:r>
-              <w:rPr>
-                <w:rFonts w:ascii="Calibri" w:hAnsi="Calibri"/>
-                <w:sz w:val="20"/>
-              </w:rPr>
-              <w:t xml:space="preserve">−3,80</w:t>
-            </w:r>
-          </w:p>
-        </w:tc>
-        <w:tc>
-          <w:tcPr/>
-          <w:p>
-            <w:pPr>
-              <w:pStyle w:val="Compact"/>
-            </w:pPr>
-            <w:r>
-              <w:rPr>
-                <w:rFonts w:ascii="Calibri" w:hAnsi="Calibri"/>
-                <w:sz w:val="20"/>
-              </w:rPr>
-              <w:t xml:space="preserve">4,08</w:t>
+              <w:t xml:space="preserve">Resultado primario, flujo trimestral anualizado,</w:t>
+            </w:r>
+            <w:r>
+              <w:rPr>
+                <w:rFonts w:ascii="Calibri" w:hAnsi="Calibri"/>
+                <w:sz w:val="20"/>
+              </w:rPr>
+              <w:t xml:space="preserve"> </w:t>
+            </w:r>
+            <w:r>
+              <w:rPr>
+                <w:rStyle w:val="VerbatimChar"/>
+                <w:rFonts w:ascii="Calibri" w:hAnsi="Calibri"/>
+                <w:sz w:val="20"/>
+              </w:rPr>
+              <w:t xml:space="preserve">pb_pib_trim</w:t>
+            </w:r>
+            <w:r>
+              <w:rPr>
+                <w:rFonts w:ascii="Calibri" w:hAnsi="Calibri"/>
+                <w:sz w:val="20"/>
+              </w:rPr>
+              <w:t xml:space="preserve"> </w:t>
+            </w:r>
+            <w:r>
+              <w:rPr>
+                <w:rFonts w:ascii="Calibri" w:hAnsi="Calibri"/>
+                <w:sz w:val="20"/>
+              </w:rPr>
+              <w:t xml:space="preserve">(% PIB)</w:t>
+            </w:r>
+          </w:p>
+        </w:tc>
+        <w:tc>
+          <w:tcPr/>
+          <w:p>
+            <w:pPr>
+              <w:pStyle w:val="Compact"/>
+            </w:pPr>
+            <w:r>
+              <w:rPr>
+                <w:rFonts w:ascii="Calibri" w:hAnsi="Calibri"/>
+                <w:sz w:val="20"/>
+              </w:rPr>
+              <w:t xml:space="preserve">−0,02</w:t>
+            </w:r>
+          </w:p>
+        </w:tc>
+        <w:tc>
+          <w:tcPr/>
+          <w:p>
+            <w:pPr>
+              <w:pStyle w:val="Compact"/>
+            </w:pPr>
+            <w:r>
+              <w:rPr>
+                <w:rFonts w:ascii="Calibri" w:hAnsi="Calibri"/>
+                <w:sz w:val="20"/>
+              </w:rPr>
+              <w:t xml:space="preserve">3,11</w:t>
+            </w:r>
+          </w:p>
+        </w:tc>
+        <w:tc>
+          <w:tcPr/>
+          <w:p>
+            <w:pPr>
+              <w:pStyle w:val="Compact"/>
+            </w:pPr>
+            <w:r>
+              <w:rPr>
+                <w:rFonts w:ascii="Calibri" w:hAnsi="Calibri"/>
+                <w:sz w:val="20"/>
+              </w:rPr>
+              <w:t xml:space="preserve">−12,16</w:t>
+            </w:r>
+          </w:p>
+        </w:tc>
+        <w:tc>
+          <w:tcPr/>
+          <w:p>
+            <w:pPr>
+              <w:pStyle w:val="Compact"/>
+            </w:pPr>
+            <w:r>
+              <w:rPr>
+                <w:rFonts w:ascii="Calibri" w:hAnsi="Calibri"/>
+                <w:sz w:val="20"/>
+              </w:rPr>
+              <w:t xml:space="preserve">7,02</w:t>
             </w:r>
           </w:p>
         </w:tc>
@@ -9370,82 +10245,111 @@
                 <w:rFonts w:ascii="Calibri" w:hAnsi="Calibri"/>
                 <w:sz w:val="20"/>
               </w:rPr>
-              <w:t xml:space="preserve">Crecimiento real del PIB (pp trimestral, 100·Δln)</w:t>
-            </w:r>
-          </w:p>
-        </w:tc>
-        <w:tc>
-          <w:tcPr/>
-          <w:p>
-            <w:pPr>
-              <w:pStyle w:val="Compact"/>
-            </w:pPr>
-            <w:r>
-              <w:rPr>
-                <w:rFonts w:ascii="Calibri" w:hAnsi="Calibri"/>
-                <w:sz w:val="20"/>
-              </w:rPr>
-              <w:t xml:space="preserve">0,43</w:t>
-            </w:r>
-          </w:p>
-        </w:tc>
-        <w:tc>
-          <w:tcPr/>
-          <w:p>
-            <w:pPr>
-              <w:pStyle w:val="Compact"/>
-            </w:pPr>
-            <w:r>
-              <w:rPr>
-                <w:rFonts w:ascii="Calibri" w:hAnsi="Calibri"/>
-                <w:sz w:val="20"/>
-              </w:rPr>
-              <w:t xml:space="preserve">6,47</w:t>
-            </w:r>
-          </w:p>
-        </w:tc>
-        <w:tc>
-          <w:tcPr/>
-          <w:p>
-            <w:pPr>
-              <w:pStyle w:val="Compact"/>
-            </w:pPr>
-            <w:r>
-              <w:rPr>
-                <w:rFonts w:ascii="Calibri" w:hAnsi="Calibri"/>
-                <w:sz w:val="20"/>
-              </w:rPr>
-              <w:t xml:space="preserve">−12,23</w:t>
-            </w:r>
-          </w:p>
-        </w:tc>
-        <w:tc>
-          <w:tcPr/>
-          <w:p>
-            <w:pPr>
-              <w:pStyle w:val="Compact"/>
-            </w:pPr>
-            <w:r>
-              <w:rPr>
-                <w:rFonts w:ascii="Calibri" w:hAnsi="Calibri"/>
-                <w:sz w:val="20"/>
-              </w:rPr>
-              <w:t xml:space="preserve">18,21</w:t>
-            </w:r>
-          </w:p>
-        </w:tc>
-        <w:tc>
-          <w:tcPr/>
-          <w:p>
-            <w:pPr>
-              <w:pStyle w:val="Compact"/>
-            </w:pPr>
-            <w:r>
-              <w:rPr>
-                <w:rFonts w:ascii="Calibri" w:hAnsi="Calibri"/>
-                <w:sz w:val="20"/>
-              </w:rPr>
-              <w:t xml:space="preserve">119</w:t>
+              <w:t xml:space="preserve">Resultado primario, suma de cuatro trimestres,</w:t>
+            </w:r>
+            <w:r>
+              <w:rPr>
+                <w:rFonts w:ascii="Calibri" w:hAnsi="Calibri"/>
+                <w:sz w:val="20"/>
+              </w:rPr>
+              <w:t xml:space="preserve"> </w:t>
+            </w:r>
+            <w:r>
+              <w:rPr>
+                <w:rStyle w:val="VerbatimChar"/>
+                <w:rFonts w:ascii="Calibri" w:hAnsi="Calibri"/>
+                <w:sz w:val="20"/>
+              </w:rPr>
+              <w:t xml:space="preserve">pb_pib</w:t>
+            </w:r>
+            <w:r>
+              <w:rPr>
+                <w:rFonts w:ascii="Calibri" w:hAnsi="Calibri"/>
+                <w:sz w:val="20"/>
+              </w:rPr>
+              <w:t xml:space="preserve"> </w:t>
+            </w:r>
+            <w:r>
+              <w:rPr>
+                <w:rFonts w:ascii="Calibri" w:hAnsi="Calibri"/>
+                <w:sz w:val="20"/>
+              </w:rPr>
+              <w:t xml:space="preserve">(% PIB)</w:t>
+            </w:r>
+          </w:p>
+        </w:tc>
+        <w:tc>
+          <w:tcPr/>
+          <w:p>
+            <w:pPr>
+              <w:pStyle w:val="Compact"/>
+            </w:pPr>
+            <w:r>
+              <w:rPr>
+                <w:rFonts w:ascii="Calibri" w:hAnsi="Calibri"/>
+                <w:sz w:val="20"/>
+              </w:rPr>
+              <w:t xml:space="preserve">0,05</w:t>
+            </w:r>
+          </w:p>
+        </w:tc>
+        <w:tc>
+          <w:tcPr/>
+          <w:p>
+            <w:pPr>
+              <w:pStyle w:val="Compact"/>
+            </w:pPr>
+            <w:r>
+              <w:rPr>
+                <w:rFonts w:ascii="Calibri" w:hAnsi="Calibri"/>
+                <w:sz w:val="20"/>
+              </w:rPr>
+              <w:t xml:space="preserve">2,34</w:t>
+            </w:r>
+          </w:p>
+        </w:tc>
+        <w:tc>
+          <w:tcPr/>
+          <w:p>
+            <w:pPr>
+              <w:pStyle w:val="Compact"/>
+            </w:pPr>
+            <w:r>
+              <w:rPr>
+                <w:rFonts w:ascii="Calibri" w:hAnsi="Calibri"/>
+                <w:sz w:val="20"/>
+              </w:rPr>
+              <w:t xml:space="preserve">−6,43</w:t>
+            </w:r>
+          </w:p>
+        </w:tc>
+        <w:tc>
+          <w:tcPr/>
+          <w:p>
+            <w:pPr>
+              <w:pStyle w:val="Compact"/>
+            </w:pPr>
+            <w:r>
+              <w:rPr>
+                <w:rFonts w:ascii="Calibri" w:hAnsi="Calibri"/>
+                <w:sz w:val="20"/>
+              </w:rPr>
+              <w:t xml:space="preserve">3,93</w:t>
+            </w:r>
+          </w:p>
+        </w:tc>
+        <w:tc>
+          <w:tcPr/>
+          <w:p>
+            <w:pPr>
+              <w:pStyle w:val="Compact"/>
+            </w:pPr>
+            <w:r>
+              <w:rPr>
+                <w:rFonts w:ascii="Calibri" w:hAnsi="Calibri"/>
+                <w:sz w:val="20"/>
+              </w:rPr>
+              <w:t xml:space="preserve">120</w:t>
             </w:r>
           </w:p>
         </w:tc>
@@ -9462,82 +10366,82 @@
                 <w:rFonts w:ascii="Calibri" w:hAnsi="Calibri"/>
                 <w:sz w:val="20"/>
               </w:rPr>
-              <w:t xml:space="preserve">EMBI+ (pb)</w:t>
-            </w:r>
-          </w:p>
-        </w:tc>
-        <w:tc>
-          <w:tcPr/>
-          <w:p>
-            <w:pPr>
-              <w:pStyle w:val="Compact"/>
-            </w:pPr>
-            <w:r>
-              <w:rPr>
-                <w:rFonts w:ascii="Calibri" w:hAnsi="Calibri"/>
-                <w:sz w:val="20"/>
-              </w:rPr>
-              <w:t xml:space="preserve">1483,95</w:t>
-            </w:r>
-          </w:p>
-        </w:tc>
-        <w:tc>
-          <w:tcPr/>
-          <w:p>
-            <w:pPr>
-              <w:pStyle w:val="Compact"/>
-            </w:pPr>
-            <w:r>
-              <w:rPr>
-                <w:rFonts w:ascii="Calibri" w:hAnsi="Calibri"/>
-                <w:sz w:val="20"/>
-              </w:rPr>
-              <w:t xml:space="preserve">1573,84</w:t>
-            </w:r>
-          </w:p>
-        </w:tc>
-        <w:tc>
-          <w:tcPr/>
-          <w:p>
-            <w:pPr>
-              <w:pStyle w:val="Compact"/>
-            </w:pPr>
-            <w:r>
-              <w:rPr>
-                <w:rFonts w:ascii="Calibri" w:hAnsi="Calibri"/>
-                <w:sz w:val="20"/>
-              </w:rPr>
-              <w:t xml:space="preserve">210,22</w:t>
-            </w:r>
-          </w:p>
-        </w:tc>
-        <w:tc>
-          <w:tcPr/>
-          <w:p>
-            <w:pPr>
-              <w:pStyle w:val="Compact"/>
-            </w:pPr>
-            <w:r>
-              <w:rPr>
-                <w:rFonts w:ascii="Calibri" w:hAnsi="Calibri"/>
-                <w:sz w:val="20"/>
-              </w:rPr>
-              <w:t xml:space="preserve">6658,98</w:t>
-            </w:r>
-          </w:p>
-        </w:tc>
-        <w:tc>
-          <w:tcPr/>
-          <w:p>
-            <w:pPr>
-              <w:pStyle w:val="Compact"/>
-            </w:pPr>
-            <w:r>
-              <w:rPr>
-                <w:rFonts w:ascii="Calibri" w:hAnsi="Calibri"/>
-                <w:sz w:val="20"/>
-              </w:rPr>
-              <w:t xml:space="preserve">120</w:t>
+              <w:t xml:space="preserve">Crecimiento real del PIB (pp trimestral, 100·Δln)</w:t>
+            </w:r>
+          </w:p>
+        </w:tc>
+        <w:tc>
+          <w:tcPr/>
+          <w:p>
+            <w:pPr>
+              <w:pStyle w:val="Compact"/>
+            </w:pPr>
+            <w:r>
+              <w:rPr>
+                <w:rFonts w:ascii="Calibri" w:hAnsi="Calibri"/>
+                <w:sz w:val="20"/>
+              </w:rPr>
+              <w:t xml:space="preserve">0,48</w:t>
+            </w:r>
+          </w:p>
+        </w:tc>
+        <w:tc>
+          <w:tcPr/>
+          <w:p>
+            <w:pPr>
+              <w:pStyle w:val="Compact"/>
+            </w:pPr>
+            <w:r>
+              <w:rPr>
+                <w:rFonts w:ascii="Calibri" w:hAnsi="Calibri"/>
+                <w:sz w:val="20"/>
+              </w:rPr>
+              <w:t xml:space="preserve">7,29</w:t>
+            </w:r>
+          </w:p>
+        </w:tc>
+        <w:tc>
+          <w:tcPr/>
+          <w:p>
+            <w:pPr>
+              <w:pStyle w:val="Compact"/>
+            </w:pPr>
+            <w:r>
+              <w:rPr>
+                <w:rFonts w:ascii="Calibri" w:hAnsi="Calibri"/>
+                <w:sz w:val="20"/>
+              </w:rPr>
+              <w:t xml:space="preserve">−13,77</w:t>
+            </w:r>
+          </w:p>
+        </w:tc>
+        <w:tc>
+          <w:tcPr/>
+          <w:p>
+            <w:pPr>
+              <w:pStyle w:val="Compact"/>
+            </w:pPr>
+            <w:r>
+              <w:rPr>
+                <w:rFonts w:ascii="Calibri" w:hAnsi="Calibri"/>
+                <w:sz w:val="20"/>
+              </w:rPr>
+              <w:t xml:space="preserve">18,21</w:t>
+            </w:r>
+          </w:p>
+        </w:tc>
+        <w:tc>
+          <w:tcPr/>
+          <w:p>
+            <w:pPr>
+              <w:pStyle w:val="Compact"/>
+            </w:pPr>
+            <w:r>
+              <w:rPr>
+                <w:rFonts w:ascii="Calibri" w:hAnsi="Calibri"/>
+                <w:sz w:val="20"/>
+              </w:rPr>
+              <w:t xml:space="preserve">119</w:t>
             </w:r>
           </w:p>
         </w:tc>
@@ -9554,67 +10458,67 @@
                 <w:rFonts w:ascii="Calibri" w:hAnsi="Calibri"/>
                 <w:sz w:val="20"/>
               </w:rPr>
-              <w:t xml:space="preserve">TCRM (dic. 2001 = 1)</w:t>
-            </w:r>
-          </w:p>
-        </w:tc>
-        <w:tc>
-          <w:tcPr/>
-          <w:p>
-            <w:pPr>
-              <w:pStyle w:val="Compact"/>
-            </w:pPr>
-            <w:r>
-              <w:rPr>
-                <w:rFonts w:ascii="Calibri" w:hAnsi="Calibri"/>
-                <w:sz w:val="20"/>
-              </w:rPr>
-              <w:t xml:space="preserve">1,63</w:t>
-            </w:r>
-          </w:p>
-        </w:tc>
-        <w:tc>
-          <w:tcPr/>
-          <w:p>
-            <w:pPr>
-              <w:pStyle w:val="Compact"/>
-            </w:pPr>
-            <w:r>
-              <w:rPr>
-                <w:rFonts w:ascii="Calibri" w:hAnsi="Calibri"/>
-                <w:sz w:val="20"/>
-              </w:rPr>
-              <w:t xml:space="preserve">0,45</w:t>
-            </w:r>
-          </w:p>
-        </w:tc>
-        <w:tc>
-          <w:tcPr/>
-          <w:p>
-            <w:pPr>
-              <w:pStyle w:val="Compact"/>
-            </w:pPr>
-            <w:r>
-              <w:rPr>
-                <w:rFonts w:ascii="Calibri" w:hAnsi="Calibri"/>
-                <w:sz w:val="20"/>
-              </w:rPr>
-              <w:t xml:space="preserve">0,98</w:t>
-            </w:r>
-          </w:p>
-        </w:tc>
-        <w:tc>
-          <w:tcPr/>
-          <w:p>
-            <w:pPr>
-              <w:pStyle w:val="Compact"/>
-            </w:pPr>
-            <w:r>
-              <w:rPr>
-                <w:rFonts w:ascii="Calibri" w:hAnsi="Calibri"/>
-                <w:sz w:val="20"/>
-              </w:rPr>
-              <w:t xml:space="preserve">2,76</w:t>
+              <w:t xml:space="preserve">EMBI+ (pb)</w:t>
+            </w:r>
+          </w:p>
+        </w:tc>
+        <w:tc>
+          <w:tcPr/>
+          <w:p>
+            <w:pPr>
+              <w:pStyle w:val="Compact"/>
+            </w:pPr>
+            <w:r>
+              <w:rPr>
+                <w:rFonts w:ascii="Calibri" w:hAnsi="Calibri"/>
+                <w:sz w:val="20"/>
+              </w:rPr>
+              <w:t xml:space="preserve">1483,95</w:t>
+            </w:r>
+          </w:p>
+        </w:tc>
+        <w:tc>
+          <w:tcPr/>
+          <w:p>
+            <w:pPr>
+              <w:pStyle w:val="Compact"/>
+            </w:pPr>
+            <w:r>
+              <w:rPr>
+                <w:rFonts w:ascii="Calibri" w:hAnsi="Calibri"/>
+                <w:sz w:val="20"/>
+              </w:rPr>
+              <w:t xml:space="preserve">1573,84</w:t>
+            </w:r>
+          </w:p>
+        </w:tc>
+        <w:tc>
+          <w:tcPr/>
+          <w:p>
+            <w:pPr>
+              <w:pStyle w:val="Compact"/>
+            </w:pPr>
+            <w:r>
+              <w:rPr>
+                <w:rFonts w:ascii="Calibri" w:hAnsi="Calibri"/>
+                <w:sz w:val="20"/>
+              </w:rPr>
+              <w:t xml:space="preserve">210,22</w:t>
+            </w:r>
+          </w:p>
+        </w:tc>
+        <w:tc>
+          <w:tcPr/>
+          <w:p>
+            <w:pPr>
+              <w:pStyle w:val="Compact"/>
+            </w:pPr>
+            <w:r>
+              <w:rPr>
+                <w:rFonts w:ascii="Calibri" w:hAnsi="Calibri"/>
+                <w:sz w:val="20"/>
+              </w:rPr>
+              <w:t xml:space="preserve">6658,98</w:t>
             </w:r>
           </w:p>
         </w:tc>
@@ -9646,67 +10550,67 @@
                 <w:rFonts w:ascii="Calibri" w:hAnsi="Calibri"/>
                 <w:sz w:val="20"/>
               </w:rPr>
-              <w:t xml:space="preserve">Tasa de política de la Fed (%)</w:t>
-            </w:r>
-          </w:p>
-        </w:tc>
-        <w:tc>
-          <w:tcPr/>
-          <w:p>
-            <w:pPr>
-              <w:pStyle w:val="Compact"/>
-            </w:pPr>
-            <w:r>
-              <w:rPr>
-                <w:rFonts w:ascii="Calibri" w:hAnsi="Calibri"/>
-                <w:sz w:val="20"/>
-              </w:rPr>
-              <w:t xml:space="preserve">2,08</w:t>
-            </w:r>
-          </w:p>
-        </w:tc>
-        <w:tc>
-          <w:tcPr/>
-          <w:p>
-            <w:pPr>
-              <w:pStyle w:val="Compact"/>
-            </w:pPr>
-            <w:r>
-              <w:rPr>
-                <w:rFonts w:ascii="Calibri" w:hAnsi="Calibri"/>
-                <w:sz w:val="20"/>
-              </w:rPr>
-              <w:t xml:space="preserve">2,67</w:t>
-            </w:r>
-          </w:p>
-        </w:tc>
-        <w:tc>
-          <w:tcPr/>
-          <w:p>
-            <w:pPr>
-              <w:pStyle w:val="Compact"/>
-            </w:pPr>
-            <w:r>
-              <w:rPr>
-                <w:rFonts w:ascii="Calibri" w:hAnsi="Calibri"/>
-                <w:sz w:val="20"/>
-              </w:rPr>
-              <w:t xml:space="preserve">−2,92</w:t>
-            </w:r>
-          </w:p>
-        </w:tc>
-        <w:tc>
-          <w:tcPr/>
-          <w:p>
-            <w:pPr>
-              <w:pStyle w:val="Compact"/>
-            </w:pPr>
-            <w:r>
-              <w:rPr>
-                <w:rFonts w:ascii="Calibri" w:hAnsi="Calibri"/>
-                <w:sz w:val="20"/>
-              </w:rPr>
-              <w:t xml:space="preserve">6,52</w:t>
+              <w:t xml:space="preserve">TCRM (dic. 2001 = 1)</w:t>
+            </w:r>
+          </w:p>
+        </w:tc>
+        <w:tc>
+          <w:tcPr/>
+          <w:p>
+            <w:pPr>
+              <w:pStyle w:val="Compact"/>
+            </w:pPr>
+            <w:r>
+              <w:rPr>
+                <w:rFonts w:ascii="Calibri" w:hAnsi="Calibri"/>
+                <w:sz w:val="20"/>
+              </w:rPr>
+              <w:t xml:space="preserve">1,63</w:t>
+            </w:r>
+          </w:p>
+        </w:tc>
+        <w:tc>
+          <w:tcPr/>
+          <w:p>
+            <w:pPr>
+              <w:pStyle w:val="Compact"/>
+            </w:pPr>
+            <w:r>
+              <w:rPr>
+                <w:rFonts w:ascii="Calibri" w:hAnsi="Calibri"/>
+                <w:sz w:val="20"/>
+              </w:rPr>
+              <w:t xml:space="preserve">0,45</w:t>
+            </w:r>
+          </w:p>
+        </w:tc>
+        <w:tc>
+          <w:tcPr/>
+          <w:p>
+            <w:pPr>
+              <w:pStyle w:val="Compact"/>
+            </w:pPr>
+            <w:r>
+              <w:rPr>
+                <w:rFonts w:ascii="Calibri" w:hAnsi="Calibri"/>
+                <w:sz w:val="20"/>
+              </w:rPr>
+              <w:t xml:space="preserve">0,98</w:t>
+            </w:r>
+          </w:p>
+        </w:tc>
+        <w:tc>
+          <w:tcPr/>
+          <w:p>
+            <w:pPr>
+              <w:pStyle w:val="Compact"/>
+            </w:pPr>
+            <w:r>
+              <w:rPr>
+                <w:rFonts w:ascii="Calibri" w:hAnsi="Calibri"/>
+                <w:sz w:val="20"/>
+              </w:rPr>
+              <w:t xml:space="preserve">2,76</w:t>
             </w:r>
           </w:p>
         </w:tc>
@@ -9738,82 +10642,82 @@
                 <w:rFonts w:ascii="Calibri" w:hAnsi="Calibri"/>
                 <w:sz w:val="20"/>
               </w:rPr>
-              <w:t xml:space="preserve">Variación de la tasa de la Fed (pp)</w:t>
-            </w:r>
-          </w:p>
-        </w:tc>
-        <w:tc>
-          <w:tcPr/>
-          <w:p>
-            <w:pPr>
-              <w:pStyle w:val="Compact"/>
-            </w:pPr>
-            <w:r>
-              <w:rPr>
-                <w:rFonts w:ascii="Calibri" w:hAnsi="Calibri"/>
-                <w:sz w:val="20"/>
-              </w:rPr>
-              <w:t xml:space="preserve">−0,01</w:t>
-            </w:r>
-          </w:p>
-        </w:tc>
-        <w:tc>
-          <w:tcPr/>
-          <w:p>
-            <w:pPr>
-              <w:pStyle w:val="Compact"/>
-            </w:pPr>
-            <w:r>
-              <w:rPr>
-                <w:rFonts w:ascii="Calibri" w:hAnsi="Calibri"/>
-                <w:sz w:val="20"/>
-              </w:rPr>
-              <w:t xml:space="preserve">0,50</w:t>
-            </w:r>
-          </w:p>
-        </w:tc>
-        <w:tc>
-          <w:tcPr/>
-          <w:p>
-            <w:pPr>
-              <w:pStyle w:val="Compact"/>
-            </w:pPr>
-            <w:r>
-              <w:rPr>
-                <w:rFonts w:ascii="Calibri" w:hAnsi="Calibri"/>
-                <w:sz w:val="20"/>
-              </w:rPr>
-              <w:t xml:space="preserve">−1,43</w:t>
-            </w:r>
-          </w:p>
-        </w:tc>
-        <w:tc>
-          <w:tcPr/>
-          <w:p>
-            <w:pPr>
-              <w:pStyle w:val="Compact"/>
-            </w:pPr>
-            <w:r>
-              <w:rPr>
-                <w:rFonts w:ascii="Calibri" w:hAnsi="Calibri"/>
-                <w:sz w:val="20"/>
-              </w:rPr>
-              <w:t xml:space="preserve">1,69</w:t>
-            </w:r>
-          </w:p>
-        </w:tc>
-        <w:tc>
-          <w:tcPr/>
-          <w:p>
-            <w:pPr>
-              <w:pStyle w:val="Compact"/>
-            </w:pPr>
-            <w:r>
-              <w:rPr>
-                <w:rFonts w:ascii="Calibri" w:hAnsi="Calibri"/>
-                <w:sz w:val="20"/>
-              </w:rPr>
-              <w:t xml:space="preserve">119</w:t>
+              <w:t xml:space="preserve">Tasa de política de la Fed (%)</w:t>
+            </w:r>
+          </w:p>
+        </w:tc>
+        <w:tc>
+          <w:tcPr/>
+          <w:p>
+            <w:pPr>
+              <w:pStyle w:val="Compact"/>
+            </w:pPr>
+            <w:r>
+              <w:rPr>
+                <w:rFonts w:ascii="Calibri" w:hAnsi="Calibri"/>
+                <w:sz w:val="20"/>
+              </w:rPr>
+              <w:t xml:space="preserve">2,08</w:t>
+            </w:r>
+          </w:p>
+        </w:tc>
+        <w:tc>
+          <w:tcPr/>
+          <w:p>
+            <w:pPr>
+              <w:pStyle w:val="Compact"/>
+            </w:pPr>
+            <w:r>
+              <w:rPr>
+                <w:rFonts w:ascii="Calibri" w:hAnsi="Calibri"/>
+                <w:sz w:val="20"/>
+              </w:rPr>
+              <w:t xml:space="preserve">2,67</w:t>
+            </w:r>
+          </w:p>
+        </w:tc>
+        <w:tc>
+          <w:tcPr/>
+          <w:p>
+            <w:pPr>
+              <w:pStyle w:val="Compact"/>
+            </w:pPr>
+            <w:r>
+              <w:rPr>
+                <w:rFonts w:ascii="Calibri" w:hAnsi="Calibri"/>
+                <w:sz w:val="20"/>
+              </w:rPr>
+              <w:t xml:space="preserve">−2,92</w:t>
+            </w:r>
+          </w:p>
+        </w:tc>
+        <w:tc>
+          <w:tcPr/>
+          <w:p>
+            <w:pPr>
+              <w:pStyle w:val="Compact"/>
+            </w:pPr>
+            <w:r>
+              <w:rPr>
+                <w:rFonts w:ascii="Calibri" w:hAnsi="Calibri"/>
+                <w:sz w:val="20"/>
+              </w:rPr>
+              <w:t xml:space="preserve">6,52</w:t>
+            </w:r>
+          </w:p>
+        </w:tc>
+        <w:tc>
+          <w:tcPr/>
+          <w:p>
+            <w:pPr>
+              <w:pStyle w:val="Compact"/>
+            </w:pPr>
+            <w:r>
+              <w:rPr>
+                <w:rFonts w:ascii="Calibri" w:hAnsi="Calibri"/>
+                <w:sz w:val="20"/>
+              </w:rPr>
+              <w:t xml:space="preserve">120</w:t>
             </w:r>
           </w:p>
         </w:tc>
@@ -9830,82 +10734,82 @@
                 <w:rFonts w:ascii="Calibri" w:hAnsi="Calibri"/>
                 <w:sz w:val="20"/>
               </w:rPr>
-              <w:t xml:space="preserve">FEDFUNDS (%)</w:t>
-            </w:r>
-          </w:p>
-        </w:tc>
-        <w:tc>
-          <w:tcPr/>
-          <w:p>
-            <w:pPr>
-              <w:pStyle w:val="Compact"/>
-            </w:pPr>
-            <w:r>
-              <w:rPr>
-                <w:rFonts w:ascii="Calibri" w:hAnsi="Calibri"/>
-                <w:sz w:val="20"/>
-              </w:rPr>
-              <w:t xml:space="preserve">2,44</w:t>
-            </w:r>
-          </w:p>
-        </w:tc>
-        <w:tc>
-          <w:tcPr/>
-          <w:p>
-            <w:pPr>
-              <w:pStyle w:val="Compact"/>
-            </w:pPr>
-            <w:r>
-              <w:rPr>
-                <w:rFonts w:ascii="Calibri" w:hAnsi="Calibri"/>
-                <w:sz w:val="20"/>
-              </w:rPr>
-              <w:t xml:space="preserve">2,20</w:t>
-            </w:r>
-          </w:p>
-        </w:tc>
-        <w:tc>
-          <w:tcPr/>
-          <w:p>
-            <w:pPr>
-              <w:pStyle w:val="Compact"/>
-            </w:pPr>
-            <w:r>
-              <w:rPr>
-                <w:rFonts w:ascii="Calibri" w:hAnsi="Calibri"/>
-                <w:sz w:val="20"/>
-              </w:rPr>
-              <w:t xml:space="preserve">0,06</w:t>
-            </w:r>
-          </w:p>
-        </w:tc>
-        <w:tc>
-          <w:tcPr/>
-          <w:p>
-            <w:pPr>
-              <w:pStyle w:val="Compact"/>
-            </w:pPr>
-            <w:r>
-              <w:rPr>
-                <w:rFonts w:ascii="Calibri" w:hAnsi="Calibri"/>
-                <w:sz w:val="20"/>
-              </w:rPr>
-              <w:t xml:space="preserve">6,52</w:t>
-            </w:r>
-          </w:p>
-        </w:tc>
-        <w:tc>
-          <w:tcPr/>
-          <w:p>
-            <w:pPr>
-              <w:pStyle w:val="Compact"/>
-            </w:pPr>
-            <w:r>
-              <w:rPr>
-                <w:rFonts w:ascii="Calibri" w:hAnsi="Calibri"/>
-                <w:sz w:val="20"/>
-              </w:rPr>
-              <w:t xml:space="preserve">120</w:t>
+              <w:t xml:space="preserve">Variación de la tasa de la Fed (pp)</w:t>
+            </w:r>
+          </w:p>
+        </w:tc>
+        <w:tc>
+          <w:tcPr/>
+          <w:p>
+            <w:pPr>
+              <w:pStyle w:val="Compact"/>
+            </w:pPr>
+            <w:r>
+              <w:rPr>
+                <w:rFonts w:ascii="Calibri" w:hAnsi="Calibri"/>
+                <w:sz w:val="20"/>
+              </w:rPr>
+              <w:t xml:space="preserve">−0,01</w:t>
+            </w:r>
+          </w:p>
+        </w:tc>
+        <w:tc>
+          <w:tcPr/>
+          <w:p>
+            <w:pPr>
+              <w:pStyle w:val="Compact"/>
+            </w:pPr>
+            <w:r>
+              <w:rPr>
+                <w:rFonts w:ascii="Calibri" w:hAnsi="Calibri"/>
+                <w:sz w:val="20"/>
+              </w:rPr>
+              <w:t xml:space="preserve">0,50</w:t>
+            </w:r>
+          </w:p>
+        </w:tc>
+        <w:tc>
+          <w:tcPr/>
+          <w:p>
+            <w:pPr>
+              <w:pStyle w:val="Compact"/>
+            </w:pPr>
+            <w:r>
+              <w:rPr>
+                <w:rFonts w:ascii="Calibri" w:hAnsi="Calibri"/>
+                <w:sz w:val="20"/>
+              </w:rPr>
+              <w:t xml:space="preserve">−1,43</w:t>
+            </w:r>
+          </w:p>
+        </w:tc>
+        <w:tc>
+          <w:tcPr/>
+          <w:p>
+            <w:pPr>
+              <w:pStyle w:val="Compact"/>
+            </w:pPr>
+            <w:r>
+              <w:rPr>
+                <w:rFonts w:ascii="Calibri" w:hAnsi="Calibri"/>
+                <w:sz w:val="20"/>
+              </w:rPr>
+              <w:t xml:space="preserve">1,69</w:t>
+            </w:r>
+          </w:p>
+        </w:tc>
+        <w:tc>
+          <w:tcPr/>
+          <w:p>
+            <w:pPr>
+              <w:pStyle w:val="Compact"/>
+            </w:pPr>
+            <w:r>
+              <w:rPr>
+                <w:rFonts w:ascii="Calibri" w:hAnsi="Calibri"/>
+                <w:sz w:val="20"/>
+              </w:rPr>
+              <w:t xml:space="preserve">119</w:t>
             </w:r>
           </w:p>
         </w:tc>
@@ -10008,7 +10912,7 @@
         <w:pStyle w:val="BodyText"/>
       </w:pPr>
       <w:r>
-        <w:t xml:space="preserve">Fuente: cálculo propio sobre los CSV citados en 5.1. La desviación estándar es muestral (ddof = 1). El crecimiento del PIB tiene un desvío alto porque el tramo 1996-2003 contiene variaciones trimestrales de la crisis de 2001-2002, y no por ruido de medición. El máximo de la deuda neta ocurre en 2002T3 y el mínimo en 2013T3. El máximo del EMBI+ ocurre en 2002T3 y el mínimo en 2007T1.</w:t>
+        <w:t xml:space="preserve">Fuente: cálculo propio sobre los CSV citados en 5.1. La desviación estándar es muestral (ddof = 1). Los depósitos del Tesoro en el BCRA tienen media de 0,64 % del PIB y desvío de 0,77, y no forman parte de las estadísticas del sistema. El resultado primario trimestral tiene un desvío mayor que el de la suma de cuatro trimestres por su estacionalidad (el mínimo, −12,16, ocurre en 2020T2 y el máximo, 7,02, en 2004T2). El crecimiento del PIB tiene un desvío alto porque la serie conserva la estacionalidad de INDEC y porque el tramo 1996-2003 contiene variaciones trimestrales de la crisis de 2001-2002 (mínimo en 2002T1, máximo en 2010T2). El máximo de la deuda neta ocurre en 2002T3 y el mínimo en 2013T3. El máximo del EMBI+ ocurre en 2002T3 y el mínimo en 2007T1.</w:t>
       </w:r>
     </w:p>
     <w:bookmarkEnd w:id="82"/>
@@ -10040,7 +10944,7 @@
         <w:t xml:space="preserve"> </w:t>
       </w:r>
       <w:r>
-        <w:t xml:space="preserve">Cota superior de la neta del FMI desde 2007T3 (secciones 5.8 y 5.9).</w:t>
+        <w:t xml:space="preserve">Cota superior de la neta del FMI desde 2007T3, con una brecha de 8,2 puntos en 2023 y 9,6 en 2024 (secciones 5.8 y 5.9).</w:t>
       </w:r>
     </w:p>
     <w:p>
@@ -10056,13 +10960,13 @@
           <w:b/>
           <w:bCs/>
         </w:rPr>
-        <w:t xml:space="preserve">Resultado primario 2004-2025.</w:t>
-      </w:r>
-      <w:r>
-        <w:t xml:space="preserve"> </w:t>
-      </w:r>
-      <w:r>
-        <w:t xml:space="preserve">Serie de un decimal que no se reconstruyó desde archivos. Su contraste con el FMI es solo de orden de magnitud.</w:t>
+        <w:t xml:space="preserve">Resultado primario.</w:t>
+      </w:r>
+      <w:r>
+        <w:t xml:space="preserve"> </w:t>
+      </w:r>
+      <w:r>
+        <w:t xml:space="preserve">Incluye todas las rentas de la propiedad, entre ellas las utilidades del BCRA que la API no permite separar. Perímetro del sector público nacional, no del gobierno federal del FMI, y quiebres de metodología en 2006/2007 y 2014/2015 sin período de solapamiento.</w:t>
       </w:r>
     </w:p>
     <w:p>
@@ -10078,13 +10982,13 @@
           <w:b/>
           <w:bCs/>
         </w:rPr>
-        <w:t xml:space="preserve">Empalme 1996-2003</w:t>
-      </w:r>
-      <w:r>
-        <w:t xml:space="preserve"> </w:t>
-      </w:r>
-      <w:r>
-        <w:t xml:space="preserve">de resultado primario, PIB real y PIB nominal. Incertidumbre de nivel por el coeficiente de enlace.</w:t>
+        <w:t xml:space="preserve">Valuación nominal de la tenencia del BCRA.</w:t>
+      </w:r>
+      <w:r>
+        <w:t xml:space="preserve"> </w:t>
+      </w:r>
+      <w:r>
+        <w:t xml:space="preserve">Hay dato nominal en 80 de 120 trimestres; 24 están interpolados y 39 reconstruidos con fechas de emisión o hacia atrás. Los 40 trimestres anteriores a 2006 conservan el valor de libros porque las Letras no existían.</w:t>
       </w:r>
     </w:p>
     <w:p>
@@ -10100,22 +11004,44 @@
           <w:b/>
           <w:bCs/>
         </w:rPr>
-        <w:t xml:space="preserve">Seis trimestres de deuda bruta interpolados</w:t>
-      </w:r>
-      <w:r>
-        <w:t xml:space="preserve"> </w:t>
-      </w:r>
-      <w:r>
-        <w:t xml:space="preserve">(1996-1997) y</w:t>
-      </w:r>
-      <w:r>
-        <w:t xml:space="preserve"> </w:t>
-      </w:r>
+        <w:t xml:space="preserve">Empalme 1996-2003</w:t>
+      </w:r>
+      <w:r>
+        <w:t xml:space="preserve"> </w:t>
+      </w:r>
+      <w:r>
+        <w:t xml:space="preserve">del PIB real (base 1993 a base 2004, coeficiente k = 1,751) y del PIB nominal (coeficiente 1,0837). Incertidumbre de nivel por el coeficiente de enlace, sin efecto sobre las tasas de crecimiento del PIB real.</w:t>
+      </w:r>
+    </w:p>
+    <w:p>
+      <w:pPr>
+        <w:pStyle w:val="Compact"/>
+        <w:numPr>
+          <w:ilvl w:val="0"/>
+          <w:numId w:val="1016"/>
+        </w:numPr>
+      </w:pPr>
       <w:r>
         <w:rPr>
           <w:b/>
           <w:bCs/>
         </w:rPr>
+        <w:t xml:space="preserve">Seis trimestres de deuda bruta interpolados</w:t>
+      </w:r>
+      <w:r>
+        <w:t xml:space="preserve"> </w:t>
+      </w:r>
+      <w:r>
+        <w:t xml:space="preserve">(1996-1997) y</w:t>
+      </w:r>
+      <w:r>
+        <w:t xml:space="preserve"> </w:t>
+      </w:r>
+      <w:r>
+        <w:rPr>
+          <w:b/>
+          <w:bCs/>
+        </w:rPr>
         <w:t xml:space="preserve">cuatro de TCRM retropolados</w:t>
       </w:r>
       <w:r>
@@ -10161,28 +11087,6 @@
       </w:r>
       <w:r>
         <w:t xml:space="preserve">en los pasivos del BCRA.</w:t>
-      </w:r>
-    </w:p>
-    <w:p>
-      <w:pPr>
-        <w:pStyle w:val="Compact"/>
-        <w:numPr>
-          <w:ilvl w:val="0"/>
-          <w:numId w:val="1016"/>
-        </w:numPr>
-      </w:pPr>
-      <w:r>
-        <w:rPr>
-          <w:b/>
-          <w:bCs/>
-        </w:rPr>
-        <w:t xml:space="preserve">Valuación contable</w:t>
-      </w:r>
-      <w:r>
-        <w:t xml:space="preserve"> </w:t>
-      </w:r>
-      <w:r>
-        <w:t xml:space="preserve">de la deuda en poder del BCRA.</w:t>
       </w:r>
     </w:p>
     <w:p>

</xml_diff>

<commit_message>
tesis: la definición operativa del FMI decide H1b y H1a (ii); la métrica anual queda como complemento
Decisión D16, opción (b). Veredictos: H1a no respaldada (se cumple la
condición de varianza, no la de suficiencia), H1b no respaldada, H2
parcialmente respaldada. Se agrega a la Tabla 6.6 una columna con la
probabilidad de 2031 según la definición del FMI. Se regeneran los
capítulos LaTeX y los Word del grupo; el PDF queda por compilar.

Co-Authored-By: Claude Opus 5.5 <noreply@anthropic.com>
Claude-Session: https://claude.ai/code/session_018bgUgSbAMcEtYJMckDB2k6
</commit_message>
<xml_diff>
--- a/tesis_oficial_borradores/para_el_grupo/Tesis_borrador.docx
+++ b/tesis_oficial_borradores/para_el_grupo/Tesis_borrador.docx
@@ -70,7 +70,7 @@
         <w:t xml:space="preserve"> </w:t>
       </w:r>
       <w:r>
-        <w:t xml:space="preserve">Se estima un modelo de vectores autorregresivos estructural con variables exógenas (SVARX) con datos trimestrales de 1996-2025 sobre la deuda federal bruta, el perímetro del análisis de sostenibilidad del Fondo Monetario Internacional (FMI), con la tasa de la Reserva Federal (FED) y la volatilidad financiera global como exógenas. La deuda se simula alrededor del escenario base del FMI de 2026, desde su punto de partida, y la no estabilización se mide con una métrica anual y con la definición operativa del FMI. La deuda consolidada con el Banco Central es una extensión.</w:t>
+        <w:t xml:space="preserve">Se estima un modelo de vectores autorregresivos estructural con variables exógenas (SVARX) con datos trimestrales de 1996-2025 sobre la deuda federal bruta, el perímetro del análisis de sostenibilidad del Fondo Monetario Internacional (FMI), con la tasa de la Reserva Federal (FED) y la volatilidad financiera global como exógenas. La deuda se simula alrededor del escenario base del FMI de 2026, desde su punto de partida, y la no estabilización se mide con la definición operativa del FMI y, como complemento, con una métrica anual que incluye la valuación de la deuda en moneda extranjera de cada año. La deuda consolidada con el Banco Central es una extensión.</w:t>
       </w:r>
     </w:p>
     <w:p>
@@ -88,7 +88,7 @@
         <w:t xml:space="preserve"> </w:t>
       </w:r>
       <w:r>
-        <w:t xml:space="preserve">Con la métrica anual, la probabilidad de no estabilización es de 27,7% en 2031 (intervalo de 90%: 20,6% a 34,7%) y de 29,0% en 2035 (25,0% a 36,1%), frente a cerca de 1% y menos de 3% según el FMI, y supera esas cifras en las 21 especificaciones. Con la definición operativa del FMI es de 3,1% (0,0% a 6,3%) y de 5,1% (0,0% a 10,2%), y no se distingue de las cifras del organismo. Los</w:t>
+        <w:t xml:space="preserve">Con la definición operativa del FMI, la probabilidad de no estabilización es de 3,1% en 2031 (intervalo de 90%: 0,0% a 6,3%) y de 5,1% en 2035 (0,0% a 10,2%), frente a cerca de 1% y menos de 3% según el FMI: las estimaciones centrales son mayores, pero los intervalos incluyen las cifras del organismo, y la hipótesis de que la probabilidad es mayor que la del FMI no queda respaldada. Con la métrica anual, que suma el riesgo cambiario de cada año, la probabilidad sube a 27,7% en 2031 (20,6% a 34,7%) y a 29,0% en 2035 (25,0% a 36,1%). Los</w:t>
       </w:r>
       <w:r>
         <w:t xml:space="preserve"> </w:t>
@@ -104,7 +104,7 @@
         <w:t xml:space="preserve"> </w:t>
       </w:r>
       <w:r>
-        <w:t xml:space="preserve">no fiscales aportan a la varianza de la deuda de 2035 96,8 puntos más que el fiscal (77,9 sin las binarias presidenciales). Repetir la senda de la tasa de la FED de 2022-2025 eleva la probabilidad de 2035 en 18,4 puntos (17,1 con la definición del FMI); el efecto sobre la deuda esperada incluye el cero, y la hipótesis sobre la FED queda parcialmente respaldada: el 77% del aumento de la deuda proviene del costo directo de la deuda en dólares. Con la deuda consolidada, la probabilidad es de 31,1% en 2031 con la métrica anual.</w:t>
+        <w:t xml:space="preserve">no fiscales aportan a la varianza de la deuda de 2035 96,8 puntos más que el fiscal (77,9 sin las binarias presidenciales). Repetir la senda de la tasa de la FED de 2022-2025 eleva la probabilidad de 2035 en 18,4 puntos (17,1 con la definición del FMI); el efecto sobre la deuda esperada incluye el cero, y la hipótesis sobre la FED queda parcialmente respaldada: el 77% del aumento de la deuda proviene del costo directo de la deuda en dólares. Con la deuda consolidada, la probabilidad en 2031 es de 11,0% con la definición del FMI y de 31,1% con la métrica anual.</w:t>
       </w:r>
     </w:p>
     <w:p>
@@ -122,23 +122,7 @@
         <w:t xml:space="preserve"> </w:t>
       </w:r>
       <w:r>
-        <w:t xml:space="preserve">Que la probabilidad de no estabilización supere a la del FMI depende de la métrica: la supera con la anual, que incluye la valuación de la deuda en moneda extranjera de cada año, y no se distingue de ella con la definición operativa del organismo, que promedia los</w:t>
-      </w:r>
-      <w:r>
-        <w:t xml:space="preserve"> </w:t>
-      </w:r>
-      <w:r>
-        <w:rPr>
-          <w:iCs/>
-          <w:i/>
-        </w:rPr>
-        <w:t xml:space="preserve">shocks</w:t>
-      </w:r>
-      <w:r>
-        <w:t xml:space="preserve"> </w:t>
-      </w:r>
-      <w:r>
-        <w:t xml:space="preserve">de la trayectoria. Con cualquiera de las dos, la mayor parte de la incertidumbre proviene de</w:t>
+        <w:t xml:space="preserve">Con la métrica del FMI, la dinámica histórica estimada da una probabilidad de no estabilización del mismo orden que la del organismo, de modo que la tesis no encuentra que el FMI subestime ese riesgo. La diferencia aparece cuando se incorpora la valuación de la deuda en moneda extranjera de cada año, que la métrica del FMI excluye por construcción. Con cualquiera de las dos medidas, la mayor parte de la incertidumbre proviene de</w:t>
       </w:r>
       <w:r>
         <w:t xml:space="preserve"> </w:t>
@@ -513,7 +497,7 @@
         <w:pStyle w:val="BodyText"/>
       </w:pPr>
       <w:r>
-        <w:t xml:space="preserve">H1b. La probabilidad de que la deuda pública no se estabilice, medida en 2031 (el último año del abanico de mediano plazo del FMI) y en 2035 (el final del horizonte de proyección y de su abanico de diez años), es mayor que la que el FMI reporta en su análisis más reciente: alrededor de 1% a mediano plazo y menos de 3% a diez años (FMI, 2026). Para que la comparación sea válida, se hace sobre el perímetro que usa el FMI, la deuda federal bruta, con el mismo punto de partida y el mismo escenario base. La no estabilización se mide de dos maneras: con una métrica anual, que compara cada año el resultado primario previsto con el que estabilizaría la deuda ese año, y con la definición operativa del FMI, que promedia los</w:t>
+        <w:t xml:space="preserve">H1b. La probabilidad de que la deuda pública no se estabilice, medida en 2031 (el último año del abanico de mediano plazo del FMI) y en 2035 (el final del horizonte de proyección y de su abanico de diez años), es mayor que la que el FMI reporta en su análisis más reciente: alrededor de 1% a mediano plazo y menos de 3% a diez años (FMI, 2026). Para que la comparación sea válida, se hace sobre el perímetro que usa el FMI, la deuda federal bruta, con el mismo punto de partida y el mismo escenario base. La no estabilización se mide con la definición operativa del FMI, que promedia los</w:t>
       </w:r>
       <w:r>
         <w:t xml:space="preserve"> </w:t>
@@ -529,7 +513,7 @@
         <w:t xml:space="preserve"> </w:t>
       </w:r>
       <w:r>
-        <w:t xml:space="preserve">a lo largo de la trayectoria (sección 4.6).</w:t>
+        <w:t xml:space="preserve">a lo largo de la trayectoria, porque de ella surgen las cifras de comparación. Como complemento se informa una métrica anual, que compara cada año el resultado primario previsto con el que estabilizaría la deuda ese año e incluye la valuación de la deuda en moneda extranjera (sección 4.6).</w:t>
       </w:r>
     </w:p>
     <w:p>
@@ -609,7 +593,7 @@
         <w:t xml:space="preserve"> </w:t>
       </w:r>
       <w:r>
-        <w:t xml:space="preserve">y en la probabilidad de no estabilización, medida con una métrica anual y con la definición operativa del FMI. El mismo ejercicio se repite con la deuda consolidada con el BCRA, estimada desde 2002.</w:t>
+        <w:t xml:space="preserve">y en la probabilidad de no estabilización, medida con la definición operativa del FMI y, como complemento, con una métrica anual. El mismo ejercicio se repite con la deuda consolidada con el BCRA, estimada desde 2002.</w:t>
       </w:r>
     </w:p>
     <w:bookmarkEnd w:id="31"/>
@@ -4322,7 +4306,7 @@
         <w:t xml:space="preserve"> </w:t>
       </w:r>
       <w:r>
-        <w:t xml:space="preserve">La no estabilización se mide de dos maneras, que la tesis informa con el mismo peso. La primera, la métrica anual, aplica la definición del FMI (2021, párr. 53) año por año: la deuda no se estabiliza en el año T si el resultado primario del escenario base es menor que el que la estabilizaría ese año en la trayectoria simulada,</w:t>
+        <w:t xml:space="preserve">La no estabilización se mide de dos maneras. La medida principal, con la que se contrastan H1b y la condición (ii) de H1a, es la definición operativa del FMI, porque las cifras con que se compara H1b surgen de ella y la hipótesis exige comparar magnitudes equivalentes. La medida complementaria es una métrica anual, que la tesis agrega porque capta un riesgo que la definición del FMI deja afuera por construcción: la valuación de la deuda en moneda extranjera año por año. Se presenta primero la métrica anual, porque la definición del FMI se obtiene a partir de ella. La métrica anual aplica la definición del FMI (2021, párr. 53) año por año: la deuda no se estabiliza en el año T si el resultado primario del escenario base es menor que el que la estabilizaría ese año en la trayectoria simulada,</w:t>
       </w:r>
     </w:p>
     <w:p>
@@ -4346,7 +4330,7 @@
         <w:pStyle w:val="BodyText"/>
       </w:pPr>
       <w:r>
-        <w:t xml:space="preserve">La segunda es una reconstrucción de la definición operativa del FMI, la que el organismo usa para las cifras con que se compara H1b; como el FMI no publica el cálculo, la tesis la reconstruye a partir de su guía. El resultado primario que estabiliza la deuda se calcula sin variación del tipo de cambio real ni ajuste stock-flujo, con las variables promediadas a lo largo de la trayectoria (FMI, 2022, recuadro 3). La tesis usa los impulsores del escenario en el año T más el desvío promedio de la trayectoria desde 2026,</w:t>
+        <w:t xml:space="preserve">La medida principal es una reconstrucción de la definición operativa del FMI, la que el organismo usa para las cifras con que se compara H1b; como el FMI no publica el cálculo, la tesis la reconstruye a partir de su guía. El resultado primario que estabiliza la deuda se calcula sin variación del tipo de cambio real ni ajuste stock-flujo, con las variables promediadas a lo largo de la trayectoria (FMI, 2022, recuadro 3). La tesis usa los impulsores del escenario en el año T más el desvío promedio de la trayectoria desde 2026,</w:t>
       </w:r>
     </w:p>
     <w:p>
@@ -4735,7 +4719,7 @@
                 <w:rFonts w:ascii="Calibri" w:hAnsi="Calibri"/>
                 <w:sz w:val="20"/>
               </w:rPr>
-              <w:t xml:space="preserve">(i) La contribución de los bloques no fiscales supera a la del fiscal, con un intervalo de 90% de la diferencia que excluye el cero. (ii) Con el resultado primario de todos los años desplazado en la misma magnitud hasta que el de 2031 alcanza su máximo anual de 1996-2025, la probabilidad de no estabilización en 2031 sigue superando la cifra del FMI (1%), con cada métrica. H1a se acepta si se cumplen las dos condiciones.</w:t>
+              <w:t xml:space="preserve">(i) La contribución de los bloques no fiscales supera a la del fiscal, con un intervalo de 90% de la diferencia que excluye el cero. (ii) Con el resultado primario de todos los años desplazado en la misma magnitud hasta que el de 2031 alcanza su máximo anual de 1996-2025, la probabilidad de no estabilización en 2031 sigue superando la cifra del FMI (1%), con cada métrica. H1a se acepta si se cumplen las dos condiciones. La condición (ii) se evalúa con la definición operativa del FMI; la métrica anual se informa como complemento.</w:t>
             </w:r>
           </w:p>
         </w:tc>
@@ -4769,23 +4753,23 @@
                 <w:rFonts w:ascii="Calibri" w:hAnsi="Calibri"/>
                 <w:sz w:val="20"/>
               </w:rPr>
-              <w:t xml:space="preserve">Probabilidad de no estabilización con el escenario base del FMI, en 2031 y en 2035, con la métrica anual y con la definición operativa del FMI</w:t>
-            </w:r>
-          </w:p>
-        </w:tc>
-        <w:tc>
-          <w:tcPr/>
-          <w:p>
-            <w:pPr>
-              <w:pStyle w:val="Compact"/>
-              <w:jc w:val="left"/>
-            </w:pPr>
-            <w:r>
-              <w:rPr>
-                <w:rFonts w:ascii="Calibri" w:hAnsi="Calibri"/>
-                <w:sz w:val="20"/>
-              </w:rPr>
-              <w:t xml:space="preserve">El límite inferior del intervalo de 90% supera la cifra del FMI para el mismo horizonte (contraste unilateral al 5%): 1% a mediano plazo y menos de 3% a diez años (FMI, 2026). Se evalúa con cada métrica.</w:t>
+              <w:t xml:space="preserve">Probabilidad de no estabilización con el escenario base del FMI, en 2031 y en 2035, con la definición operativa del FMI (la métrica anual se informa como complemento)</w:t>
+            </w:r>
+          </w:p>
+        </w:tc>
+        <w:tc>
+          <w:tcPr/>
+          <w:p>
+            <w:pPr>
+              <w:pStyle w:val="Compact"/>
+              <w:jc w:val="left"/>
+            </w:pPr>
+            <w:r>
+              <w:rPr>
+                <w:rFonts w:ascii="Calibri" w:hAnsi="Calibri"/>
+                <w:sz w:val="20"/>
+              </w:rPr>
+              <w:t xml:space="preserve">El límite inferior del intervalo de 90% supera la cifra del FMI para el mismo horizonte (contraste unilateral al 5%): 1% a mediano plazo y menos de 3% a diez años (FMI, 2026).</w:t>
             </w:r>
           </w:p>
         </w:tc>
@@ -4854,7 +4838,7 @@
         <w:pStyle w:val="BodyText"/>
       </w:pPr>
       <w:r>
-        <w:t xml:space="preserve">Como las cuatro participaciones de la condición (i) suman 100, esa condición equivale a que el bloque fiscal explique menos de la mitad de la varianza; la que contrasta que el superávit no baste es la condición (ii). Las dos métricas de la sección 4.6 pueden llevar a veredictos distintos en H1a (ii) y en H1b, de modo que esos veredictos se informan con cada una.</w:t>
+        <w:t xml:space="preserve">Como las cuatro participaciones de la condición (i) suman 100, esa condición equivale a que el bloque fiscal explique menos de la mitad de la varianza; la que contrasta que el superávit no baste es la condición (ii). El veredicto de H1a (ii) y de H1b se establece con la definición operativa del FMI. Como la métrica anual puede llevar a un resultado distinto, también se informa, pero no decide el contraste.</w:t>
       </w:r>
     </w:p>
     <w:p>
@@ -8786,7 +8770,7 @@
         <w:t xml:space="preserve"> </w:t>
       </w:r>
       <w:r>
-        <w:t xml:space="preserve">La segunda condición de H1a (Tabla 4.4) se evalúa desplazando en la misma magnitud el resultado primario de todos los años del escenario base (Figura 6.4). El máximo anual de 1996-2025 es 3,29% del PIB, en 2004, con la definición de la tesis (sin rentas de la propiedad); con rentas de la propiedad es 3,58%, el mismo año. Con un desplazamiento uniforme que lleva el resultado primario de 2031 a ese máximo, la probabilidad de no estabilización en 2031 con la métrica anual es 23,0% (el de 2026 queda en 2,39%, porque el escenario base del FMI parte de 1,40% en 2026 y de 2,30% en 2031); con el máximo de la variante con rentas es 21,6%. Para llevarla al 1% que estima el FMI para Argentina hay que sumar 7,25 puntos al resultado primario del escenario en todos los años: un superávit de 8,65% del PIB en 2026 y de 9,55% en 2031, casi el triple del máximo observado. Con la métrica anual se cumple, entonces, la segunda condición de H1a (sección 4.7): aun con el resultado primario de 2031 en el máximo histórico, la probabilidad queda más de veinte veces por encima de la cifra del FMI, de modo que el superávit por sí solo no basta. Con la definición operativa del FMI la condición no se cumple: ya sin desplazamiento, el intervalo de la probabilidad de 2031, 3,1% [0,0; 6,3], incluye la cifra del FMI, y con el resultado primario de 2031 en el máximo histórico la estimación central baja a 0,9%; alcanza un desplazamiento de 1,00 punto. H1a queda respaldada con la métrica anual; con la definición operativa se sostiene la condición (i), que no depende de la métrica, pero no la (ii).</w:t>
+        <w:t xml:space="preserve">La segunda condición de H1a (Tabla 4.4) se evalúa desplazando en la misma magnitud el resultado primario de todos los años del escenario base (Figura 6.4). El máximo anual de 1996-2025 es 3,29% del PIB, en 2004, con la definición de la tesis (sin rentas de la propiedad); con rentas de la propiedad es 3,58%, el mismo año. Con un desplazamiento uniforme que lleva el resultado primario de 2031 a ese máximo, la probabilidad de no estabilización en 2031 con la métrica anual es 23,0% (el de 2026 queda en 2,39%, porque el escenario base del FMI parte de 1,40% en 2026 y de 2,30% en 2031); con el máximo de la variante con rentas es 21,6%. Para llevarla al 1% que estima el FMI para Argentina hay que sumar 7,25 puntos al resultado primario del escenario en todos los años: un superávit de 8,65% del PIB en 2026 y de 9,55% en 2031, casi el triple del máximo observado. Con la definición operativa del FMI, que es la medida del contraste (sección 4.6), la segunda condición de H1a no se cumple: ya sin desplazamiento, el intervalo de la probabilidad de 2031, 3,1% [0,0; 6,3], incluye la cifra del FMI, y con el resultado primario de 2031 en el máximo histórico la estimación central baja a 0,9%; alcanza un desplazamiento de 1,00 punto. Con la métrica anual, en cambio, aun con el resultado primario de 2031 en el máximo histórico la probabilidad queda más de veinte veces por encima de la cifra del FMI. H1a no queda respaldada: se cumple la condición (i), que no depende de la métrica, pero no la (ii). La lectura es que, medido como lo mide el FMI, un superávit cercano al máximo histórico alcanza para llevar la probabilidad a la cifra del organismo; lo que no controla es el riesgo cambiario de cada año, que solo capta la métrica anual.</w:t>
       </w:r>
     </w:p>
     <w:p>
@@ -8883,7 +8867,7 @@
         <w:pStyle w:val="FirstParagraph"/>
       </w:pPr>
       <w:r>
-        <w:t xml:space="preserve">El FMI (2026) estima una probabilidad de no estabilización de 1% en su abanico de mediano plazo (cuadro 7) y menor que 3% en su abanico de diez años, que termina en 2035. Con la deuda federal bruta, el mismo punto de partida y el mismo escenario, cada horizonte se contrasta contra la cifra del FMI correspondiente con las dos métricas de la sección 4.6 (Tabla 6.4).</w:t>
+        <w:t xml:space="preserve">El FMI (2026) estima una probabilidad de no estabilización de 1% en su abanico de mediano plazo (cuadro 7) y menor que 3% en su abanico de diez años, que termina en 2035. Con la deuda federal bruta, el mismo punto de partida y el mismo escenario, cada horizonte se contrasta contra la cifra del FMI correspondiente con la definición operativa del organismo, y se informa al lado la métrica anual (sección 4.6; Tabla 6.4).</w:t>
       </w:r>
     </w:p>
     <w:p>
@@ -9051,39 +9035,39 @@
                 <w:rFonts w:ascii="Calibri" w:hAnsi="Calibri"/>
                 <w:sz w:val="20"/>
               </w:rPr>
-              <w:t xml:space="preserve">Anual</w:t>
-            </w:r>
-          </w:p>
-        </w:tc>
-        <w:tc>
-          <w:tcPr/>
-          <w:p>
-            <w:pPr>
-              <w:pStyle w:val="Compact"/>
-              <w:jc w:val="left"/>
-            </w:pPr>
-            <w:r>
-              <w:rPr>
-                <w:rFonts w:ascii="Calibri" w:hAnsi="Calibri"/>
-                <w:sz w:val="20"/>
-              </w:rPr>
-              <w:t xml:space="preserve">27,7%</w:t>
-            </w:r>
-          </w:p>
-        </w:tc>
-        <w:tc>
-          <w:tcPr/>
-          <w:p>
-            <w:pPr>
-              <w:pStyle w:val="Compact"/>
-              <w:jc w:val="left"/>
-            </w:pPr>
-            <w:r>
-              <w:rPr>
-                <w:rFonts w:ascii="Calibri" w:hAnsi="Calibri"/>
-                <w:sz w:val="20"/>
-              </w:rPr>
-              <w:t xml:space="preserve">[20,6; 34,7]</w:t>
+              <w:t xml:space="preserve">Definición operativa del FMI (contraste)</w:t>
+            </w:r>
+          </w:p>
+        </w:tc>
+        <w:tc>
+          <w:tcPr/>
+          <w:p>
+            <w:pPr>
+              <w:pStyle w:val="Compact"/>
+              <w:jc w:val="left"/>
+            </w:pPr>
+            <w:r>
+              <w:rPr>
+                <w:rFonts w:ascii="Calibri" w:hAnsi="Calibri"/>
+                <w:sz w:val="20"/>
+              </w:rPr>
+              <w:t xml:space="preserve">3,1%</w:t>
+            </w:r>
+          </w:p>
+        </w:tc>
+        <w:tc>
+          <w:tcPr/>
+          <w:p>
+            <w:pPr>
+              <w:pStyle w:val="Compact"/>
+              <w:jc w:val="left"/>
+            </w:pPr>
+            <w:r>
+              <w:rPr>
+                <w:rFonts w:ascii="Calibri" w:hAnsi="Calibri"/>
+                <w:sz w:val="20"/>
+              </w:rPr>
+              <w:t xml:space="preserve">[0,0; 6,3]</w:t>
             </w:r>
           </w:p>
         </w:tc>
@@ -9115,7 +9099,7 @@
                 <w:rFonts w:ascii="Calibri" w:hAnsi="Calibri"/>
                 <w:sz w:val="20"/>
               </w:rPr>
-              <w:t xml:space="preserve">Se cumple</w:t>
+              <w:t xml:space="preserve">No se cumple</w:t>
             </w:r>
           </w:p>
         </w:tc>
@@ -9149,39 +9133,39 @@
                 <w:rFonts w:ascii="Calibri" w:hAnsi="Calibri"/>
                 <w:sz w:val="20"/>
               </w:rPr>
-              <w:t xml:space="preserve">Definición operativa del FMI</w:t>
-            </w:r>
-          </w:p>
-        </w:tc>
-        <w:tc>
-          <w:tcPr/>
-          <w:p>
-            <w:pPr>
-              <w:pStyle w:val="Compact"/>
-              <w:jc w:val="left"/>
-            </w:pPr>
-            <w:r>
-              <w:rPr>
-                <w:rFonts w:ascii="Calibri" w:hAnsi="Calibri"/>
-                <w:sz w:val="20"/>
-              </w:rPr>
-              <w:t xml:space="preserve">3,1%</w:t>
-            </w:r>
-          </w:p>
-        </w:tc>
-        <w:tc>
-          <w:tcPr/>
-          <w:p>
-            <w:pPr>
-              <w:pStyle w:val="Compact"/>
-              <w:jc w:val="left"/>
-            </w:pPr>
-            <w:r>
-              <w:rPr>
-                <w:rFonts w:ascii="Calibri" w:hAnsi="Calibri"/>
-                <w:sz w:val="20"/>
-              </w:rPr>
-              <w:t xml:space="preserve">[0,0; 6,3]</w:t>
+              <w:t xml:space="preserve">Anual (complemento)</w:t>
+            </w:r>
+          </w:p>
+        </w:tc>
+        <w:tc>
+          <w:tcPr/>
+          <w:p>
+            <w:pPr>
+              <w:pStyle w:val="Compact"/>
+              <w:jc w:val="left"/>
+            </w:pPr>
+            <w:r>
+              <w:rPr>
+                <w:rFonts w:ascii="Calibri" w:hAnsi="Calibri"/>
+                <w:sz w:val="20"/>
+              </w:rPr>
+              <w:t xml:space="preserve">27,7%</w:t>
+            </w:r>
+          </w:p>
+        </w:tc>
+        <w:tc>
+          <w:tcPr/>
+          <w:p>
+            <w:pPr>
+              <w:pStyle w:val="Compact"/>
+              <w:jc w:val="left"/>
+            </w:pPr>
+            <w:r>
+              <w:rPr>
+                <w:rFonts w:ascii="Calibri" w:hAnsi="Calibri"/>
+                <w:sz w:val="20"/>
+              </w:rPr>
+              <w:t xml:space="preserve">[20,6; 34,7]</w:t>
             </w:r>
           </w:p>
         </w:tc>
@@ -9213,7 +9197,7 @@
                 <w:rFonts w:ascii="Calibri" w:hAnsi="Calibri"/>
                 <w:sz w:val="20"/>
               </w:rPr>
-              <w:t xml:space="preserve">No se cumple</w:t>
+              <w:t xml:space="preserve">Lo supera</w:t>
             </w:r>
           </w:p>
         </w:tc>
@@ -9247,39 +9231,39 @@
                 <w:rFonts w:ascii="Calibri" w:hAnsi="Calibri"/>
                 <w:sz w:val="20"/>
               </w:rPr>
-              <w:t xml:space="preserve">Anual</w:t>
-            </w:r>
-          </w:p>
-        </w:tc>
-        <w:tc>
-          <w:tcPr/>
-          <w:p>
-            <w:pPr>
-              <w:pStyle w:val="Compact"/>
-              <w:jc w:val="left"/>
-            </w:pPr>
-            <w:r>
-              <w:rPr>
-                <w:rFonts w:ascii="Calibri" w:hAnsi="Calibri"/>
-                <w:sz w:val="20"/>
-              </w:rPr>
-              <w:t xml:space="preserve">29,0%</w:t>
-            </w:r>
-          </w:p>
-        </w:tc>
-        <w:tc>
-          <w:tcPr/>
-          <w:p>
-            <w:pPr>
-              <w:pStyle w:val="Compact"/>
-              <w:jc w:val="left"/>
-            </w:pPr>
-            <w:r>
-              <w:rPr>
-                <w:rFonts w:ascii="Calibri" w:hAnsi="Calibri"/>
-                <w:sz w:val="20"/>
-              </w:rPr>
-              <w:t xml:space="preserve">[25,0; 36,1]</w:t>
+              <w:t xml:space="preserve">Definición operativa del FMI (contraste)</w:t>
+            </w:r>
+          </w:p>
+        </w:tc>
+        <w:tc>
+          <w:tcPr/>
+          <w:p>
+            <w:pPr>
+              <w:pStyle w:val="Compact"/>
+              <w:jc w:val="left"/>
+            </w:pPr>
+            <w:r>
+              <w:rPr>
+                <w:rFonts w:ascii="Calibri" w:hAnsi="Calibri"/>
+                <w:sz w:val="20"/>
+              </w:rPr>
+              <w:t xml:space="preserve">5,1%</w:t>
+            </w:r>
+          </w:p>
+        </w:tc>
+        <w:tc>
+          <w:tcPr/>
+          <w:p>
+            <w:pPr>
+              <w:pStyle w:val="Compact"/>
+              <w:jc w:val="left"/>
+            </w:pPr>
+            <w:r>
+              <w:rPr>
+                <w:rFonts w:ascii="Calibri" w:hAnsi="Calibri"/>
+                <w:sz w:val="20"/>
+              </w:rPr>
+              <w:t xml:space="preserve">[0,0; 10,2]</w:t>
             </w:r>
           </w:p>
         </w:tc>
@@ -9311,7 +9295,7 @@
                 <w:rFonts w:ascii="Calibri" w:hAnsi="Calibri"/>
                 <w:sz w:val="20"/>
               </w:rPr>
-              <w:t xml:space="preserve">Se cumple</w:t>
+              <w:t xml:space="preserve">No se cumple</w:t>
             </w:r>
           </w:p>
         </w:tc>
@@ -9345,39 +9329,39 @@
                 <w:rFonts w:ascii="Calibri" w:hAnsi="Calibri"/>
                 <w:sz w:val="20"/>
               </w:rPr>
-              <w:t xml:space="preserve">Definición operativa del FMI</w:t>
-            </w:r>
-          </w:p>
-        </w:tc>
-        <w:tc>
-          <w:tcPr/>
-          <w:p>
-            <w:pPr>
-              <w:pStyle w:val="Compact"/>
-              <w:jc w:val="left"/>
-            </w:pPr>
-            <w:r>
-              <w:rPr>
-                <w:rFonts w:ascii="Calibri" w:hAnsi="Calibri"/>
-                <w:sz w:val="20"/>
-              </w:rPr>
-              <w:t xml:space="preserve">5,1%</w:t>
-            </w:r>
-          </w:p>
-        </w:tc>
-        <w:tc>
-          <w:tcPr/>
-          <w:p>
-            <w:pPr>
-              <w:pStyle w:val="Compact"/>
-              <w:jc w:val="left"/>
-            </w:pPr>
-            <w:r>
-              <w:rPr>
-                <w:rFonts w:ascii="Calibri" w:hAnsi="Calibri"/>
-                <w:sz w:val="20"/>
-              </w:rPr>
-              <w:t xml:space="preserve">[0,0; 10,2]</w:t>
+              <w:t xml:space="preserve">Anual (complemento)</w:t>
+            </w:r>
+          </w:p>
+        </w:tc>
+        <w:tc>
+          <w:tcPr/>
+          <w:p>
+            <w:pPr>
+              <w:pStyle w:val="Compact"/>
+              <w:jc w:val="left"/>
+            </w:pPr>
+            <w:r>
+              <w:rPr>
+                <w:rFonts w:ascii="Calibri" w:hAnsi="Calibri"/>
+                <w:sz w:val="20"/>
+              </w:rPr>
+              <w:t xml:space="preserve">29,0%</w:t>
+            </w:r>
+          </w:p>
+        </w:tc>
+        <w:tc>
+          <w:tcPr/>
+          <w:p>
+            <w:pPr>
+              <w:pStyle w:val="Compact"/>
+              <w:jc w:val="left"/>
+            </w:pPr>
+            <w:r>
+              <w:rPr>
+                <w:rFonts w:ascii="Calibri" w:hAnsi="Calibri"/>
+                <w:sz w:val="20"/>
+              </w:rPr>
+              <w:t xml:space="preserve">[25,0; 36,1]</w:t>
             </w:r>
           </w:p>
         </w:tc>
@@ -9409,7 +9393,7 @@
                 <w:rFonts w:ascii="Calibri" w:hAnsi="Calibri"/>
                 <w:sz w:val="20"/>
               </w:rPr>
-              <w:t xml:space="preserve">No se cumple</w:t>
+              <w:t xml:space="preserve">Lo supera</w:t>
             </w:r>
           </w:p>
         </w:tc>
@@ -9428,15 +9412,7 @@
         <w:pStyle w:val="BodyText"/>
       </w:pPr>
       <w:r>
-        <w:t xml:space="preserve">Con la métrica anual, en los dos horizontes el intervalo queda entero muy por encima de la cifra del FMI, y la conclusión se mantiene con la corrección de Bonferroni (límites inferiores de 19,0% y 24,1%). Las medidas alternativas van en la misma dirección: con el resultado primario simulado en lugar del previsto, la probabilidad en 2031 es 29,7% [23,5; 37,3], y la probabilidad de que la deuda de 2031 supere a la de 2029 es 20,0% [17,3; 26,7]. En las 21 especificaciones el límite inferior supera las cifras del FMI; el menor, 16,2% en 2031, corresponde a la variante de tres rezagos, y en 2035 es 18,0% (la variante sin ajuste stock-flujo y la del escenario de 2025).</w:t>
-      </w:r>
-    </w:p>
-    <w:p>
-      <w:pPr>
-        <w:pStyle w:val="BodyText"/>
-      </w:pPr>
-      <w:r>
-        <w:t xml:space="preserve">Con la definición operativa del FMI el resultado es otro. La estimación central triplica la cifra del FMI en 2031 (3,1% contra 1%) y la supera en 2035 (5,1% contra menos de 3%), pero los intervalos incluyen esas cifras, de modo que no se distinguen de ellas. El límite inferior supera la cifra del FMI, en los dos horizontes, solo en 2 de las 21 especificaciones: la deuda consolidada (11,0% [2,7; 20,2] en 2031) y el canal de tasas en pesos (9,0% [2,7; 17,0]). Con la lectura literal del recuadro 3, que promedia también el escenario, la probabilidad es 0,0% en 2031 y 0,9% en 2035. En el SVARX, la diferencia entre las dos métricas es la volatilidad de un solo año: la anual se activa con que la deuda suba un año por una depreciación real o un crecimiento bajo; la definición operativa promedia los</w:t>
+        <w:t xml:space="preserve">Con la definición operativa del FMI, la estimación central triplica la cifra del FMI en 2031 (3,1% contra 1%) y la supera en 2035 (5,1% contra menos de 3%), pero los intervalos incluyen esas cifras, de modo que no se distinguen de ellas. El límite inferior supera la cifra del FMI, en los dos horizontes, solo en 2 de las 21 especificaciones: la deuda consolidada (11,0% [2,7; 20,2] en 2031) y el canal de tasas en pesos (9,0% [2,7; 17,0]). Con la lectura literal del recuadro 3, que promedia también el escenario, la probabilidad es 0,0% en 2031 y 0,9% en 2035. En el SVARX, la diferencia entre las dos métricas es la volatilidad de un solo año: la anual se activa con que la deuda suba un año por una depreciación real o un crecimiento bajo; la definición operativa promedia los</w:t>
       </w:r>
       <w:r>
         <w:t xml:space="preserve"> </w:t>
@@ -9460,7 +9436,15 @@
         <w:pStyle w:val="BodyText"/>
       </w:pPr>
       <w:r>
-        <w:t xml:space="preserve">H1b queda respaldada con la métrica anual y no respaldada con la definición operativa del FMI. Con la métrica anual, el 1% y el menos de 3% son cifras de referencia calculadas con otra definición: el veredicto compara la probabilidad de un evento más amplio con la del FMI, y por eso no prueba que el organismo subestime el riesgo. La tesis informa los dos resultados; los argumentos a favor de cada métrica se discuten en la sección 7.1.</w:t>
+        <w:t xml:space="preserve">Con la métrica anual, el resultado es otro: en los dos horizontes el intervalo queda entero muy por encima de la cifra del FMI, y la conclusión se mantiene con la corrección de Bonferroni (límites inferiores de 19,0% y 24,1%). Las medidas alternativas van en la misma dirección: con el resultado primario simulado en lugar del previsto, la probabilidad en 2031 es 29,7% [23,5; 37,3], y la probabilidad de que la deuda de 2031 supere a la de 2029 es 20,0% [17,3; 26,7]. En las 21 especificaciones el límite inferior supera las cifras del FMI; el menor, 16,2% en 2031, corresponde a la variante de tres rezagos, y en 2035 es 18,0% (la variante sin ajuste stock-flujo y la del escenario de 2025).</w:t>
+      </w:r>
+    </w:p>
+    <w:p>
+      <w:pPr>
+        <w:pStyle w:val="BodyText"/>
+      </w:pPr>
+      <w:r>
+        <w:t xml:space="preserve">H1b no queda respaldada. Con la medida del contraste, la probabilidad de no estabilización no se distingue de la que informa el FMI. Con la métrica anual la supera con holgura, pero el 1% y el menos de 3% son cifras calculadas con otra definición, de modo que esa comparación no prueba que el organismo subestime el riesgo: muestra cuánto pesa la valuación anual de la deuda en moneda extranjera, que la definición del FMI excluye (sección 7.1).</w:t>
       </w:r>
     </w:p>
     <w:bookmarkEnd w:id="104"/>
@@ -9787,7 +9771,7 @@
         <w:pStyle w:val="FirstParagraph"/>
       </w:pPr>
       <w:r>
-        <w:t xml:space="preserve">La Tabla 6.6 resume las especificaciones alternativas más relevantes. Las probabilidades de la tabla usan la métrica anual. La tabla completa, con las 21 especificaciones del SVARX, la probabilidad de 2031 con la definición operativa del FMI, las dos filas a la manera del FMI y la cifra del FMI, está en el Apéndice, sección A.10.</w:t>
+        <w:t xml:space="preserve">La Tabla 6.6 resume las especificaciones alternativas más relevantes. La primera columna usa la definición operativa del FMI, que es la del contraste; las demás probabilidades, la métrica anual. La tabla completa, con las 21 especificaciones del SVARX, las dos filas a la manera del FMI y la cifra del FMI, está en el Apéndice, sección A.10.</w:t>
       </w:r>
     </w:p>
     <w:p>
@@ -9818,13 +9802,14 @@
         </w:tblBorders>
       </w:tblPr>
       <w:tblGrid>
-        <w:gridCol w:w="1131"/>
-        <w:gridCol w:w="1131"/>
-        <w:gridCol w:w="1131"/>
-        <w:gridCol w:w="1131"/>
-        <w:gridCol w:w="1131"/>
-        <w:gridCol w:w="1131"/>
-        <w:gridCol w:w="1131"/>
+        <w:gridCol w:w="990"/>
+        <w:gridCol w:w="990"/>
+        <w:gridCol w:w="990"/>
+        <w:gridCol w:w="990"/>
+        <w:gridCol w:w="990"/>
+        <w:gridCol w:w="990"/>
+        <w:gridCol w:w="990"/>
+        <w:gridCol w:w="990"/>
       </w:tblGrid>
       <w:tr>
         <w:trPr>
@@ -9858,23 +9843,39 @@
                 <w:rFonts w:ascii="Calibri" w:hAnsi="Calibri"/>
                 <w:sz w:val="20"/>
               </w:rPr>
-              <w:t xml:space="preserve">No estabilización 2031</w:t>
-            </w:r>
-          </w:p>
-        </w:tc>
-        <w:tc>
-          <w:tcPr/>
-          <w:p>
-            <w:pPr>
-              <w:pStyle w:val="Compact"/>
-              <w:jc w:val="left"/>
-            </w:pPr>
-            <w:r>
-              <w:rPr>
-                <w:rFonts w:ascii="Calibri" w:hAnsi="Calibri"/>
-                <w:sz w:val="20"/>
-              </w:rPr>
-              <w:t xml:space="preserve">No estabilización 2035</w:t>
+              <w:t xml:space="preserve">No estabilización 2031, definición del FMI</w:t>
+            </w:r>
+          </w:p>
+        </w:tc>
+        <w:tc>
+          <w:tcPr/>
+          <w:p>
+            <w:pPr>
+              <w:pStyle w:val="Compact"/>
+              <w:jc w:val="left"/>
+            </w:pPr>
+            <w:r>
+              <w:rPr>
+                <w:rFonts w:ascii="Calibri" w:hAnsi="Calibri"/>
+                <w:sz w:val="20"/>
+              </w:rPr>
+              <w:t xml:space="preserve">No estabilización 2031, anual</w:t>
+            </w:r>
+          </w:p>
+        </w:tc>
+        <w:tc>
+          <w:tcPr/>
+          <w:p>
+            <w:pPr>
+              <w:pStyle w:val="Compact"/>
+              <w:jc w:val="left"/>
+            </w:pPr>
+            <w:r>
+              <w:rPr>
+                <w:rFonts w:ascii="Calibri" w:hAnsi="Calibri"/>
+                <w:sz w:val="20"/>
+              </w:rPr>
+              <w:t xml:space="preserve">No estabilización 2035, anual</w:t>
             </w:r>
           </w:p>
         </w:tc>
@@ -9972,6 +9973,22 @@
                 <w:rFonts w:ascii="Calibri" w:hAnsi="Calibri"/>
                 <w:sz w:val="20"/>
               </w:rPr>
+              <w:t xml:space="preserve">3,1% [0,0; 6,3]</w:t>
+            </w:r>
+          </w:p>
+        </w:tc>
+        <w:tc>
+          <w:tcPr/>
+          <w:p>
+            <w:pPr>
+              <w:pStyle w:val="Compact"/>
+              <w:jc w:val="left"/>
+            </w:pPr>
+            <w:r>
+              <w:rPr>
+                <w:rFonts w:ascii="Calibri" w:hAnsi="Calibri"/>
+                <w:sz w:val="20"/>
+              </w:rPr>
               <w:t xml:space="preserve">27,7% [20,6; 34,7]</w:t>
             </w:r>
           </w:p>
@@ -10086,6 +10103,22 @@
                 <w:rFonts w:ascii="Calibri" w:hAnsi="Calibri"/>
                 <w:sz w:val="20"/>
               </w:rPr>
+              <w:t xml:space="preserve">6,2% [0,2; 11,9]</w:t>
+            </w:r>
+          </w:p>
+        </w:tc>
+        <w:tc>
+          <w:tcPr/>
+          <w:p>
+            <w:pPr>
+              <w:pStyle w:val="Compact"/>
+              <w:jc w:val="left"/>
+            </w:pPr>
+            <w:r>
+              <w:rPr>
+                <w:rFonts w:ascii="Calibri" w:hAnsi="Calibri"/>
+                <w:sz w:val="20"/>
+              </w:rPr>
               <w:t xml:space="preserve">31,8% [25,2; 36,3]</w:t>
             </w:r>
           </w:p>
@@ -10200,6 +10233,22 @@
                 <w:rFonts w:ascii="Calibri" w:hAnsi="Calibri"/>
                 <w:sz w:val="20"/>
               </w:rPr>
+              <w:t xml:space="preserve">11,0% [2,7; 20,2]</w:t>
+            </w:r>
+          </w:p>
+        </w:tc>
+        <w:tc>
+          <w:tcPr/>
+          <w:p>
+            <w:pPr>
+              <w:pStyle w:val="Compact"/>
+              <w:jc w:val="left"/>
+            </w:pPr>
+            <w:r>
+              <w:rPr>
+                <w:rFonts w:ascii="Calibri" w:hAnsi="Calibri"/>
+                <w:sz w:val="20"/>
+              </w:rPr>
               <w:t xml:space="preserve">31,1% [27,6; 41,5]</w:t>
             </w:r>
           </w:p>
@@ -10314,6 +10363,22 @@
                 <w:rFonts w:ascii="Calibri" w:hAnsi="Calibri"/>
                 <w:sz w:val="20"/>
               </w:rPr>
+              <w:t xml:space="preserve">2,9% [0,0; 5,8]</w:t>
+            </w:r>
+          </w:p>
+        </w:tc>
+        <w:tc>
+          <w:tcPr/>
+          <w:p>
+            <w:pPr>
+              <w:pStyle w:val="Compact"/>
+              <w:jc w:val="left"/>
+            </w:pPr>
+            <w:r>
+              <w:rPr>
+                <w:rFonts w:ascii="Calibri" w:hAnsi="Calibri"/>
+                <w:sz w:val="20"/>
+              </w:rPr>
               <w:t xml:space="preserve">28,5% [22,3; 36,0]</w:t>
             </w:r>
           </w:p>
@@ -10428,6 +10493,22 @@
                 <w:rFonts w:ascii="Calibri" w:hAnsi="Calibri"/>
                 <w:sz w:val="20"/>
               </w:rPr>
+              <w:t xml:space="preserve">1,3% [0,0; 2,7]</w:t>
+            </w:r>
+          </w:p>
+        </w:tc>
+        <w:tc>
+          <w:tcPr/>
+          <w:p>
+            <w:pPr>
+              <w:pStyle w:val="Compact"/>
+              <w:jc w:val="left"/>
+            </w:pPr>
+            <w:r>
+              <w:rPr>
+                <w:rFonts w:ascii="Calibri" w:hAnsi="Calibri"/>
+                <w:sz w:val="20"/>
+              </w:rPr>
               <w:t xml:space="preserve">27,2% [22,0; 34,1]</w:t>
             </w:r>
           </w:p>
@@ -10542,6 +10623,22 @@
                 <w:rFonts w:ascii="Calibri" w:hAnsi="Calibri"/>
                 <w:sz w:val="20"/>
               </w:rPr>
+              <w:t xml:space="preserve">2,5% [0,0; 5,1]</w:t>
+            </w:r>
+          </w:p>
+        </w:tc>
+        <w:tc>
+          <w:tcPr/>
+          <w:p>
+            <w:pPr>
+              <w:pStyle w:val="Compact"/>
+              <w:jc w:val="left"/>
+            </w:pPr>
+            <w:r>
+              <w:rPr>
+                <w:rFonts w:ascii="Calibri" w:hAnsi="Calibri"/>
+                <w:sz w:val="20"/>
+              </w:rPr>
               <w:t xml:space="preserve">25,9% [16,2; 32,5]</w:t>
             </w:r>
           </w:p>
@@ -10656,6 +10753,22 @@
                 <w:rFonts w:ascii="Calibri" w:hAnsi="Calibri"/>
                 <w:sz w:val="20"/>
               </w:rPr>
+              <w:t xml:space="preserve">3,6% [0,0; 7,2]</w:t>
+            </w:r>
+          </w:p>
+        </w:tc>
+        <w:tc>
+          <w:tcPr/>
+          <w:p>
+            <w:pPr>
+              <w:pStyle w:val="Compact"/>
+              <w:jc w:val="left"/>
+            </w:pPr>
+            <w:r>
+              <w:rPr>
+                <w:rFonts w:ascii="Calibri" w:hAnsi="Calibri"/>
+                <w:sz w:val="20"/>
+              </w:rPr>
               <w:t xml:space="preserve">29,5% [22,5; 36,7]</w:t>
             </w:r>
           </w:p>
@@ -10770,6 +10883,22 @@
                 <w:rFonts w:ascii="Calibri" w:hAnsi="Calibri"/>
                 <w:sz w:val="20"/>
               </w:rPr>
+              <w:t xml:space="preserve">6,2% [0,0; 12,5]</w:t>
+            </w:r>
+          </w:p>
+        </w:tc>
+        <w:tc>
+          <w:tcPr/>
+          <w:p>
+            <w:pPr>
+              <w:pStyle w:val="Compact"/>
+              <w:jc w:val="left"/>
+            </w:pPr>
+            <w:r>
+              <w:rPr>
+                <w:rFonts w:ascii="Calibri" w:hAnsi="Calibri"/>
+                <w:sz w:val="20"/>
+              </w:rPr>
               <w:t xml:space="preserve">31,1% [26,8; 39,3]</w:t>
             </w:r>
           </w:p>
@@ -10884,6 +11013,22 @@
                 <w:rFonts w:ascii="Calibri" w:hAnsi="Calibri"/>
                 <w:sz w:val="20"/>
               </w:rPr>
+              <w:t xml:space="preserve">6,0% [0,0; 11,5]</w:t>
+            </w:r>
+          </w:p>
+        </w:tc>
+        <w:tc>
+          <w:tcPr/>
+          <w:p>
+            <w:pPr>
+              <w:pStyle w:val="Compact"/>
+              <w:jc w:val="left"/>
+            </w:pPr>
+            <w:r>
+              <w:rPr>
+                <w:rFonts w:ascii="Calibri" w:hAnsi="Calibri"/>
+                <w:sz w:val="20"/>
+              </w:rPr>
               <w:t xml:space="preserve">29,1% [20,8; 35,0]</w:t>
             </w:r>
           </w:p>
@@ -11014,6 +11159,22 @@
                 <w:rFonts w:ascii="Calibri" w:hAnsi="Calibri"/>
                 <w:sz w:val="20"/>
               </w:rPr>
+              <w:t xml:space="preserve">29,1%</w:t>
+            </w:r>
+          </w:p>
+        </w:tc>
+        <w:tc>
+          <w:tcPr/>
+          <w:p>
+            <w:pPr>
+              <w:pStyle w:val="Compact"/>
+              <w:jc w:val="left"/>
+            </w:pPr>
+            <w:r>
+              <w:rPr>
+                <w:rFonts w:ascii="Calibri" w:hAnsi="Calibri"/>
+                <w:sz w:val="20"/>
+              </w:rPr>
               <w:t xml:space="preserve">24,1%</w:t>
             </w:r>
           </w:p>
@@ -11144,6 +11305,22 @@
                 <w:rFonts w:ascii="Calibri" w:hAnsi="Calibri"/>
                 <w:sz w:val="20"/>
               </w:rPr>
+              <w:t xml:space="preserve">1%</w:t>
+            </w:r>
+          </w:p>
+        </w:tc>
+        <w:tc>
+          <w:tcPr/>
+          <w:p>
+            <w:pPr>
+              <w:pStyle w:val="Compact"/>
+              <w:jc w:val="left"/>
+            </w:pPr>
+            <w:r>
+              <w:rPr>
+                <w:rFonts w:ascii="Calibri" w:hAnsi="Calibri"/>
+                <w:sz w:val="20"/>
+              </w:rPr>
               <w:t xml:space="preserve">menos de 3%</w:t>
             </w:r>
           </w:p>
@@ -11252,7 +11429,7 @@
         <w:t xml:space="preserve"> </w:t>
       </w:r>
       <w:r>
-        <w:t xml:space="preserve">Con la métrica anual, H1b se cumple en todas las especificaciones, con límites inferiores de entre 16,2% (tres rezagos) y 27,7% (un rezago) en 2031 y de entre 18,0% y 32,3% en 2035, contra el 1% y el menos del 3% del FMI; con la definición operativa del FMI se cumple solo en 2 de las 21, la deuda consolidada y el canal de tasas en pesos. La condición (i) de H1a también se sostiene: la diferencia entre los</w:t>
+        <w:t xml:space="preserve">Con la definición operativa del FMI, el criterio de H1b se cumple solo en 2 de las 21 especificaciones, la deuda consolidada y el canal de tasas en pesos, de modo que el veredicto no depende de la especificación. Con la métrica anual, el límite inferior supera las cifras del FMI en todas, con valores de entre 16,2% (tres rezagos) y 27,7% (un rezago) en 2031 y de entre 18,0% y 32,3% en 2035. La condición (i) de H1a también se sostiene: la diferencia entre los</w:t>
       </w:r>
       <w:r>
         <w:t xml:space="preserve"> </w:t>
@@ -11484,7 +11661,7 @@
         <w:pStyle w:val="FirstParagraph"/>
       </w:pPr>
       <w:r>
-        <w:t xml:space="preserve">El FMI (2026) concluye que la deuda federal bruta argentina es sostenible pero no con alta probabilidad, y estima en 1% la probabilidad de que no se estabilice en el mediano plazo. Esta tesis mide la misma deuda desde el mismo punto de partida, con el mismo escenario y horizonte, y su conclusión depende de cómo se mida la no estabilización. Con la definición operativa del FMI, la probabilidad del SVARX en 2031 es 3,1% [0,0; 6,3]: del mismo orden que la del organismo y estadísticamente indistinguible de ella. Con la métrica anual es 27,7%.</w:t>
+        <w:t xml:space="preserve">El FMI (2026) concluye que la deuda federal bruta argentina es sostenible pero no con alta probabilidad, y estima en 1% la probabilidad de que no se estabilice en el mediano plazo. Esta tesis mide la misma deuda desde el mismo punto de partida, con el mismo escenario y horizonte. Con la definición operativa del FMI, que es la medida del contraste, la probabilidad del SVARX en 2031 es 3,1% [0,0; 6,3]: del mismo orden que la del organismo y estadísticamente indistinguible de ella. La tesis no encuentra, entonces, que el FMI subestime el riesgo de no estabilización tal como el organismo lo mide. Con la métrica anual, la probabilidad es 27,7%.</w:t>
       </w:r>
     </w:p>
     <w:p>
@@ -11496,13 +11673,13 @@
           <w:bCs/>
           <w:b/>
         </w:rPr>
-        <w:t xml:space="preserve">Qué métrica usar.</w:t>
-      </w:r>
-      <w:r>
-        <w:t xml:space="preserve"> </w:t>
-      </w:r>
-      <w:r>
-        <w:t xml:space="preserve">Las dos tienen argumentos. La definición operativa es la que el FMI usa para su cifra, de modo que, en la reconstrucción de la tesis, da la comparación más cercana, y mide un deterioro persistente de las condiciones de la deuda. La métrica anual conserva la valuación de la deuda en moneda extranjera, que en Argentina pesa más que en la mayoría de los países a los que se aplica el marco (57,8% de la deuda federal bruta está en moneda extranjera), pero se activa con que la deuda suba un solo año. La tesis informa las dos con el mismo peso, y los veredictos de H1a y H1b se leen con esa salvedad (Capítulo 8).</w:t>
+        <w:t xml:space="preserve">Por qué la definición del FMI decide el contraste y qué agrega la métrica anual.</w:t>
+      </w:r>
+      <w:r>
+        <w:t xml:space="preserve"> </w:t>
+      </w:r>
+      <w:r>
+        <w:t xml:space="preserve">H1b compara la probabilidad de la tesis con las cifras del FMI, y esas cifras surgen de su definición operativa; contrastarlas con otra medida compararía eventos distintos. Por eso la definición operativa decide H1b y la condición (ii) de H1a. Mide un deterioro persistente de las condiciones de la deuda a lo largo de la trayectoria y deja afuera, por construcción, la variación del tipo de cambio real. La métrica anual conserva esa valuación, que en Argentina pesa más que en la mayoría de los países a los que se aplica el marco (57,8% de la deuda federal bruta está en moneda extranjera), y se activa con que la deuda suba un solo año. La distancia entre las dos, de 3,1% a 27,7% en 2031, mide cuánto del riesgo de no estabilización proviene de la valuación anual de la deuda en moneda extranjera: es el aporte de la métrica anual, no una prueba de que la cifra del FMI esté mal calculada.</w:t>
       </w:r>
     </w:p>
     <w:p>
@@ -12498,7 +12675,7 @@
         <w:pStyle w:val="BodyText"/>
       </w:pPr>
       <w:r>
-        <w:t xml:space="preserve">El análisis de suficiencia lo ilustra desde otro ángulo. Un desplazamiento uniforme del superávit que lleve el de 2031 al mejor año de la ventana, 3,29% del PIB en 2004, deja sin estabilizar la deuda de 2031 en casi una de cada cuatro trayectorias con la métrica anual (23,0%), y llevar la probabilidad a la cifra del FMI exigiría un superávit cercano al 9% del PIB todos los años, casi el triple del máximo y sin precedentes en la historia argentina. Con la definición operativa del FMI, en cambio, ese mismo superávit baja la probabilidad a 0,9%, debajo de la cifra del organismo: con esa métrica, la conclusión de que el superávit no basta no se sostiene. El superávit es necesario, y el escenario del FMI se apoya en él, pero no controla las fuentes de riesgo que dominan la varianza.</w:t>
+        <w:t xml:space="preserve">El análisis de suficiencia lo ilustra desde otro ángulo. Un desplazamiento uniforme del superávit que lleve el de 2031 al mejor año de la ventana, 3,29% del PIB en 2004, deja sin estabilizar la deuda de 2031 en casi una de cada cuatro trayectorias con la métrica anual (23,0%), y llevar la probabilidad a la cifra del FMI exigiría un superávit cercano al 9% del PIB todos los años, casi el triple del máximo y sin precedentes en la historia argentina. Con la definición operativa del FMI, que es la del contraste, ese mismo superávit baja la probabilidad a 0,9%, debajo de la cifra del organismo, y alcanza un desplazamiento de un punto: con la métrica del FMI, la afirmación de que el superávit no basta no se sostiene, y por eso H1a no queda respaldada. Las dos lecturas son compatibles. El superávit alcanza para estabilizar la deuda frente a un deterioro persistente de la tasa y del crecimiento, que es lo que mide el FMI, pero no la protege de la valuación anual de la deuda en moneda extranjera, que domina la varianza y que la política fiscal no controla.</w:t>
       </w:r>
     </w:p>
     <w:bookmarkEnd w:id="119"/>
@@ -13043,7 +13220,7 @@
         <w:pStyle w:val="FirstParagraph"/>
       </w:pPr>
       <w:r>
-        <w:t xml:space="preserve">Esta tesis se preguntó en qué medida el crecimiento, el tipo de cambio real, el riesgo país y el resultado primario condicionan la sostenibilidad de la deuda pública argentina en 2026-2035, y cuál es la probabilidad de que no se estabilice bajo el escenario base. Para responderla se estimó un SVARX con datos trimestrales de 1996-2025 sobre la deuda federal bruta, que es el perímetro del análisis de sostenibilidad del FMI, y se lo usó para simular la deuda alrededor del escenario base más reciente del FMI (2026), desde su mismo punto de partida, y la no estabilización se midió con una métrica anual y con la definición operativa del FMI. Las variables endógenas son el resultado primario, el crecimiento, el riesgo país, medido por el diferencial del índice EMBI de J.P. Morgan para Argentina (EMBI), y el tipo de cambio real multilateral (TCRM). Los</w:t>
+        <w:t xml:space="preserve">Esta tesis se preguntó en qué medida el crecimiento, el tipo de cambio real, el riesgo país y el resultado primario condicionan la sostenibilidad de la deuda pública argentina en 2026-2035, y cuál es la probabilidad de que no se estabilice bajo el escenario base. Para responderla se estimó un SVARX con datos trimestrales de 1996-2025 sobre la deuda federal bruta, que es el perímetro del análisis de sostenibilidad del FMI, y se lo usó para simular la deuda alrededor del escenario base más reciente del FMI (2026), desde su mismo punto de partida, y la no estabilización se midió con la definición operativa del FMI, que decide el contraste, y con una métrica anual como complemento. Las variables endógenas son el resultado primario, el crecimiento, el riesgo país, medido por el diferencial del índice EMBI de J.P. Morgan para Argentina (EMBI), y el tipo de cambio real multilateral (TCRM). Los</w:t>
       </w:r>
       <w:r>
         <w:t xml:space="preserve"> </w:t>
@@ -13109,7 +13286,7 @@
         <w:t xml:space="preserve"> </w:t>
       </w:r>
       <w:r>
-        <w:t xml:space="preserve">fiscal en 96,8 puntos, con un intervalo de 90% de 90,8 a 99,8. El bloque externo (FED y VIX) aporta 59,4% de la varianza y el cambiario y de riesgo, 28,3%, frente a 1,6% del fiscal. La primera condición de H1a se cumple en las 20 especificaciones en que se informa; el menor límite inferior, 67,3 puntos, corresponde a la variante sin binarias presidenciales, en la que la diferencia es de 77,9 puntos: la cifra fiscal es tan baja en la especificación principal en parte porque esas binarias absorben variación del resultado primario, de modo que lo robusto es el orden de magnitud y no el valor puntual. La política fiscal respondió a la deuda en el período: el coeficiente de impacto de la deuda rezagada sobre el resultado primario trimestral es 0,0466, con un intervalo de 0,0231 a 0,0835, y el de largo plazo, 0,079 (0,062 a 0,147). La segunda condición de H1a, la suficiencia del superávit, se cumple con la métrica anual: con un desplazamiento uniforme del resultado primario que lleve el de 2031 a su máximo anual de 1996-2025 (3,29% del PIB, en 2004; el de 2026 quedaría en 2,39%), la probabilidad de no estabilización en 2031 sería de 23,0% (21,6% con el máximo de la serie con rentas, 3,58%), muy por encima del 1% del FMI, y llevarla a esa cifra requeriría sumar 7,25 puntos al resultado primario del escenario en todos los años (8,65% del PIB en 2026 y 9,55% en 2031). Con la definición operativa del FMI no se cumple: con el resultado primario de 2031 en su máximo histórico, la probabilidad baja a 0,9%. H1a queda respaldada con la métrica anual; con la definición operativa se sostiene solo la parte que no depende de la métrica, el predominio de los</w:t>
+        <w:t xml:space="preserve">fiscal en 96,8 puntos, con un intervalo de 90% de 90,8 a 99,8. El bloque externo (FED y VIX) aporta 59,4% de la varianza y el cambiario y de riesgo, 28,3%, frente a 1,6% del fiscal. La primera condición de H1a se cumple en las 20 especificaciones en que se informa; el menor límite inferior, 67,3 puntos, corresponde a la variante sin binarias presidenciales, en la que la diferencia es de 77,9 puntos: la cifra fiscal es tan baja en la especificación principal en parte porque esas binarias absorben variación del resultado primario, de modo que lo robusto es el orden de magnitud y no el valor puntual. La política fiscal respondió a la deuda en el período: el coeficiente de impacto de la deuda rezagada sobre el resultado primario trimestral es 0,0466, con un intervalo de 0,0231 a 0,0835, y el de largo plazo, 0,079 (0,062 a 0,147). La segunda condición de H1a, la suficiencia del superávit, se evalúa con la definición operativa del FMI y no se cumple: con el resultado primario de 2031 en su máximo histórico, la probabilidad de no estabilización en 2031 baja a 0,9%, debajo del 1% del FMI, y alcanza un desplazamiento de un punto. Con la métrica anual el resultado es otro: con un desplazamiento uniforme del resultado primario que lleve el de 2031 a su máximo anual de 1996-2025 (3,29% del PIB, en 2004; el de 2026 quedaría en 2,39%), la probabilidad de no estabilización en 2031 sería de 23,0% (21,6% con el máximo de la serie con rentas, 3,58%), muy por encima del 1% del FMI, y llevarla a esa cifra requeriría sumar 7,25 puntos al resultado primario del escenario en todos los años (8,65% del PIB en 2026 y 9,55% en 2031). H1a no queda respaldada: se sostiene el predominio de los</w:t>
       </w:r>
       <w:r>
         <w:t xml:space="preserve"> </w:t>
@@ -13125,7 +13302,7 @@
         <w:t xml:space="preserve"> </w:t>
       </w:r>
       <w:r>
-        <w:t xml:space="preserve">no fiscales en la incertidumbre.</w:t>
+        <w:t xml:space="preserve">no fiscales en la incertidumbre, que no depende de la métrica, pero no que el superávit por sí solo no baste para estabilizar la deuda tal como la mide el FMI.</w:t>
       </w:r>
     </w:p>
     <w:p>
@@ -13143,7 +13320,7 @@
         <w:t xml:space="preserve"> </w:t>
       </w:r>
       <w:r>
-        <w:t xml:space="preserve">Con la métrica anual, la probabilidad de que la deuda federal bruta no se estabilice es de 27,7% en 2031 (intervalo de 90%: 20,6% a 34,7%) y de 29,0% en 2035 (25,0% a 36,1%), frente a alrededor de 1% y menos de 3% en el análisis del FMI con el mismo perímetro, punto de partida y escenario. Los límites inferiores superan las cifras del FMI con la corrección de Bonferroni (19,0% y 24,1%) y en las 21 especificaciones; el menor, 16,2%, corresponde a la variante de tres rezagos. Con la definición operativa del FMI, la probabilidad es de 3,1% en 2031 (0,0% a 6,3%) y de 5,1% en 2035 (0,0% a 10,2%): las estimaciones centrales superan las cifras del FMI, pero los intervalos las incluyen, y el límite inferior las supera solo en 2 de las 21 especificaciones. H1b queda respaldada con la métrica anual y no respaldada con la definición operativa del FMI. En el SVARX, la diferencia entre las dos proviene de que la anual recoge la volatilidad de un solo año, incluida la valuación de la deuda en moneda extranjera, y la operativa la promedia. Con la métrica anual, además, las cifras del FMI son una referencia calculada con otra definición, de modo que ese veredicto no prueba que el organismo subestime el riesgo. Con el procedimiento de</w:t>
+        <w:t xml:space="preserve">Con la definición operativa del FMI, la probabilidad de que la deuda federal bruta no se estabilice es de 3,1% en 2031 (intervalo de 90%: 0,0% a 6,3%) y de 5,1% en 2035 (0,0% a 10,2%), frente a alrededor de 1% y menos de 3% en el análisis del FMI con el mismo perímetro, punto de partida y escenario. Las estimaciones centrales son mayores que las del organismo, pero los intervalos las incluyen, y el límite inferior las supera solo en 2 de las 21 especificaciones (la deuda consolidada y el canal de tasas en pesos). H1b no queda respaldada: con la métrica del FMI, la dinámica histórica estimada da una probabilidad del mismo orden que la del organismo. La comparación es, además, asimétrica, porque la cifra del FMI no tiene intervalo (sección 7.1). Con la métrica anual, que incluye la valuación de la deuda en moneda extranjera de cada año, la probabilidad sube a 27,7% en 2031 (20,6% a 34,7%) y a 29,0% en 2035 (25,0% a 36,1%), con límites inferiores por encima de las cifras del FMI en las 21 especificaciones y con la corrección de Bonferroni (19,0% y 24,1%). Esa distancia no prueba que el FMI subestime el riesgo, porque sus cifras se calculan con otra definición; mide cuánto del riesgo de no estabilización proviene de la valuación anual de la deuda en moneda extranjera, que la definición del FMI excluye por construcción. Con el procedimiento de</w:t>
       </w:r>
       <w:r>
         <w:t xml:space="preserve"> </w:t>
@@ -13159,7 +13336,7 @@
         <w:t xml:space="preserve"> </w:t>
       </w:r>
       <w:r>
-        <w:t xml:space="preserve">del FMI aplicado a los impulsores anuales de la historia argentina, la probabilidad de 2031 es de 24,1% con la métrica anual y de 29,1% con la definición operativa, de modo que con la historia argentina tampoco se reproduce el 1%. La tesis no atribuye la diferencia con el organismo a una causa que no puede verificar, porque el FMI no publica su distribución de</w:t>
+        <w:t xml:space="preserve">del FMI aplicado a los impulsores anuales de la historia argentina, la probabilidad de 2031 es de 29,1% con la definición operativa y de 24,1% con la métrica anual: con la historia argentina, el procedimiento del propio organismo no reproduce el 1%, y la tesis no atribuye esa diferencia a una causa que no puede verificar, porque el FMI no publica su distribución de</w:t>
       </w:r>
       <w:r>
         <w:t xml:space="preserve"> </w:t>
@@ -13172,7 +13349,7 @@
         <w:t xml:space="preserve">shocks</w:t>
       </w:r>
       <w:r>
-        <w:t xml:space="preserve">, y la comparación es asimétrica, porque su cifra no tiene intervalo (sección 7.1). Con la métrica anual, el resultado no depende de los empalmes del EMBI y del TCRM en 1996-1998 (Capítulo 5): con datos desde 1999, la probabilidad de 2031 es de 29,5%.</w:t>
+        <w:t xml:space="preserve">.</w:t>
       </w:r>
     </w:p>
     <w:p>
@@ -13237,7 +13414,7 @@
         <w:t xml:space="preserve"> </w:t>
       </w:r>
       <w:r>
-        <w:t xml:space="preserve">Con la deuda consolidada con el BCRA, que parte de 52,1% del PIB y se estima desde 2002, la probabilidad de no estabilización es de 31,1% en 2031 (27,6% a 41,5%) y de 35,0% en 2035 (32,3% a 49,8%). La senda de la FED eleva la probabilidad de 2035 en 19,2 puntos (3,2 a 33,8). No se informan el reparto de la varianza ni la media de la deuda consolidada, porque trayectorias explosivas dominan esas medidas en 368 de las 1.000 réplicas, más de un tercio; por eso la extensión es exploratoria y solo respalda el orden de magnitud de la probabilidad de no estabilización, que supera la del FMI con las dos métricas (con la definición operativa, 11,0% en 2031, de 2,7% a 20,2%).</w:t>
+        <w:t xml:space="preserve">Con la deuda consolidada con el BCRA, que parte de 52,1% del PIB y se estima desde 2002, la probabilidad de no estabilización es de 31,1% en 2031 (27,6% a 41,5%) y de 35,0% en 2035 (32,3% a 49,8%). La senda de la FED eleva la probabilidad de 2035 en 19,2 puntos (3,2 a 33,8). No se informan el reparto de la varianza ni la media de la deuda consolidada, porque trayectorias explosivas dominan esas medidas en 368 de las 1.000 réplicas, más de un tercio; por eso la extensión es exploratoria y solo respalda el orden de magnitud de la probabilidad de no estabilización, que supera la del FMI con las dos métricas (con la definición operativa, 11,0% en 2031, de 2,7% a 20,2%), aunque con los intervalos poco confiables de esa extensión.</w:t>
       </w:r>
     </w:p>
     <w:p>
@@ -13255,7 +13432,7 @@
         <w:t xml:space="preserve"> </w:t>
       </w:r>
       <w:r>
-        <w:t xml:space="preserve">Si la deuda federal bruta argentina tiene más riesgo de no estabilizarse que el que informa el FMI depende de cómo se mida ese riesgo. Con la definición operativa del organismo, que promedia los</w:t>
+        <w:t xml:space="preserve">Medido como lo mide el FMI, el riesgo de que la deuda federal bruta argentina no se estabilice es del mismo orden que el que informa el organismo: la tesis no encuentra que el FMI lo subestime. El riesgo que queda fuera de esa medida es el de la valuación anual de la deuda en moneda extranjera: cuando se lo incorpora, la probabilidad de no estabilización sube a 27,7% en 2031, y la de que la deuda de 2031 supere a la de 2029 es de 20,0%. Lo que no depende de la métrica es de dónde viene la incertidumbre: la mayor parte proviene de</w:t>
       </w:r>
       <w:r>
         <w:t xml:space="preserve"> </w:t>
@@ -13271,23 +13448,7 @@
         <w:t xml:space="preserve"> </w:t>
       </w:r>
       <w:r>
-        <w:t xml:space="preserve">de la trayectoria, la dinámica histórica estimada da una probabilidad del mismo orden que la del FMI. Con la métrica anual, que incluye la valuación de la deuda en moneda extranjera año por año, la probabilidad es mucho mayor, y la de que la deuda de 2031 supere a la de 2029 es de 20,0%. Cuál de las dos es la referencia adecuada es una decisión de criterio, que la tesis deja explícita (sección 7.1). Lo que no depende de la métrica es de dónde viene la incertidumbre: la mayor parte proviene de</w:t>
-      </w:r>
-      <w:r>
-        <w:t xml:space="preserve"> </w:t>
-      </w:r>
-      <w:r>
-        <w:rPr>
-          <w:iCs/>
-          <w:i/>
-        </w:rPr>
-        <w:t xml:space="preserve">shocks</w:t>
-      </w:r>
-      <w:r>
-        <w:t xml:space="preserve"> </w:t>
-      </w:r>
-      <w:r>
-        <w:t xml:space="preserve">externos, cambiarios y de riesgo, que la política fiscal no controla, y la senda de la FED de 2022-2025 eleva la probabilidad de no estabilización con las dos métricas. Con la métrica anual, un superávit de 2031 en el máximo de 1996-2025 reduce la probabilidad, pero la deja lejos de la cifra del FMI; con la definición operativa, alcanza para llegar a ella. La tesis no simula cambios en la composición por moneda ni en los plazos de la deuda, de modo que no permite evaluar esas alternativas.</w:t>
+        <w:t xml:space="preserve">externos, cambiarios y de riesgo, que la política fiscal no controla, y la senda de la FED de 2022-2025 eleva la probabilidad de no estabilización con las dos métricas. Un superávit de 2031 en el máximo de 1996-2025 alcanza para llevar la probabilidad a la cifra del FMI con su propia métrica, pero no protege a la deuda de la valuación anual: con la métrica anual, la probabilidad queda lejos de esa cifra. La tesis no simula cambios en la composición por moneda ni en los plazos de la deuda, de modo que no permite evaluar esas alternativas.</w:t>
       </w:r>
     </w:p>
     <w:p>

</xml_diff>